<commit_message>
Added OP1 and user comments
</commit_message>
<xml_diff>
--- a/CPFR_VDS_CPH_Docs/TPM/CPFR_CPH_Roadmap_v0.1.docx
+++ b/CPFR_VDS_CPH_Docs/TPM/CPFR_CPH_Roadmap_v0.1.docx
@@ -188,7 +188,6 @@
         <w:pStyle w:val="Heading1"/>
       </w:pPr>
       <w:r>
-        <w:lastRenderedPageBreak/>
         <w:t>1. Executive Context</w:t>
       </w:r>
     </w:p>
@@ -196,21 +195,50 @@
       <w:pPr>
         <w:spacing w:after="160"/>
       </w:pPr>
-      <w:proofErr w:type="spellStart"/>
-      <w:r>
-        <w:rPr>
-          <w:rFonts w:ascii="Arial" w:hAnsi="Arial"/>
-          <w:sz w:val="22"/>
-        </w:rPr>
-        <w:t>Chewy’s</w:t>
-      </w:r>
-      <w:proofErr w:type="spellEnd"/>
-      <w:r>
-        <w:rPr>
-          <w:rFonts w:ascii="Arial" w:hAnsi="Arial"/>
-          <w:sz w:val="22"/>
-        </w:rPr>
-        <w:t xml:space="preserve"> CPFR program distributes weekly inventory and forecast data to 2,300+ vendors, serving as foundational infrastructure for the majority of ISM vendor-facing work. This roadmap charts the path from a nearly complete data platform investment to vendor-accessible capability within Chewy Partner Hub (CPH).</w:t>
+      <w:commentRangeStart w:id="0"/>
+      <w:r>
+        <w:rPr>
+          <w:rFonts w:ascii="Arial" w:hAnsi="Arial"/>
+          <w:sz w:val="22"/>
+        </w:rPr>
+        <w:t xml:space="preserve">Chewy’s CPFR program distributes weekly inventory and forecast data to </w:t>
+      </w:r>
+      <w:r>
+        <w:rPr>
+          <w:rFonts w:ascii="Arial" w:hAnsi="Arial"/>
+          <w:sz w:val="22"/>
+        </w:rPr>
+        <w:t>3</w:t>
+      </w:r>
+      <w:r>
+        <w:rPr>
+          <w:rFonts w:ascii="Arial" w:hAnsi="Arial"/>
+          <w:sz w:val="22"/>
+        </w:rPr>
+        <w:t>,</w:t>
+      </w:r>
+      <w:r>
+        <w:rPr>
+          <w:rFonts w:ascii="Arial" w:hAnsi="Arial"/>
+          <w:sz w:val="22"/>
+        </w:rPr>
+        <w:t>2</w:t>
+      </w:r>
+      <w:r>
+        <w:rPr>
+          <w:rFonts w:ascii="Arial" w:hAnsi="Arial"/>
+          <w:sz w:val="22"/>
+        </w:rPr>
+        <w:t>00+ vendors, serving as foundational infrastructure for the majority of ISM vendor-facing work. This roadmap charts the path from a nearly complete data platform investment to vendor-accessible capability within Chewy Partner Hub (CPH).</w:t>
+      </w:r>
+      <w:commentRangeEnd w:id="0"/>
+      <w:r>
+        <w:rPr>
+          <w:rStyle w:val="CommentReference"/>
+          <w:sz w:val="20"/>
+          <w:szCs w:val="22"/>
+        </w:rPr>
+        <w:commentReference w:id="0"/>
       </w:r>
     </w:p>
     <w:p>
@@ -218,7 +246,20 @@
         <w:pStyle w:val="Heading2"/>
       </w:pPr>
       <w:r>
-        <w:t>1.1 Where We Stand</w:t>
+        <w:t xml:space="preserve">1.1 </w:t>
+      </w:r>
+      <w:commentRangeStart w:id="1"/>
+      <w:r>
+        <w:t>Where We Stand</w:t>
+      </w:r>
+      <w:commentRangeEnd w:id="1"/>
+      <w:r>
+        <w:rPr>
+          <w:rStyle w:val="CommentReference"/>
+          <w:sz w:val="26"/>
+          <w:szCs w:val="26"/>
+        </w:rPr>
+        <w:commentReference w:id="1"/>
       </w:r>
     </w:p>
     <w:p>
@@ -239,7 +280,7 @@
           <w:rFonts w:ascii="Arial" w:hAnsi="Arial"/>
           <w:sz w:val="22"/>
         </w:rPr>
-        <w:t>The CPFR data platform—a Snowflake-based semantic layer with vendor isolation, daily refresh, immutable snapshots, and data lineage—is on track for 3/31/2026 delivery at network grain. This covers 98.4% of vendors (Tiers 2 &amp; 3, representing 2,229 of 2,274 vendors). Only 45 Tier 1 vendors require the SKU/FC-level granularity that constitutes a known follow-on deliverable.</w:t>
+        <w:t>The CPFR data platform—a Snowflake-based semantic layer with vendor isolation, daily refresh, immutable snapshots, and data lineage—is on track for 3/31/2026 delivery at network grain. This covers 98.4% of vendors (Tiers 2 &amp; 3). Only 45 Tier 1 vendors require the SKU/FC-level granularity that constitutes a known follow-on deliverable.</w:t>
       </w:r>
     </w:p>
     <w:p>
@@ -314,7 +355,7 @@
     </w:p>
     <w:tbl>
       <w:tblPr>
-        <w:tblW w:w="9360" w:type="dxa"/>
+        <w:tblW w:w="10741" w:type="dxa"/>
         <w:tblBorders>
           <w:top w:val="single" w:sz="4" w:space="0" w:color="auto"/>
           <w:left w:val="single" w:sz="4" w:space="0" w:color="auto"/>
@@ -330,19 +371,16 @@
         <w:tblLook w:val="0000" w:firstRow="0" w:lastRow="0" w:firstColumn="0" w:lastColumn="0" w:noHBand="0" w:noVBand="0"/>
       </w:tblPr>
       <w:tblGrid>
-        <w:gridCol w:w="4000"/>
-        <w:gridCol w:w="5360"/>
+        <w:gridCol w:w="4590"/>
+        <w:gridCol w:w="6151"/>
       </w:tblGrid>
       <w:tr>
-        <w:tblPrEx>
-          <w:tblCellMar>
-            <w:top w:w="0" w:type="dxa"/>
-            <w:bottom w:w="0" w:type="dxa"/>
-          </w:tblCellMar>
-        </w:tblPrEx>
-        <w:tc>
-          <w:tcPr>
-            <w:tcW w:w="4000" w:type="dxa"/>
+        <w:trPr>
+          <w:trHeight w:val="215"/>
+        </w:trPr>
+        <w:tc>
+          <w:tcPr>
+            <w:tcW w:w="4590" w:type="dxa"/>
             <w:tcBorders>
               <w:top w:val="single" w:sz="1" w:space="0" w:color="CCCCCC"/>
               <w:left w:val="single" w:sz="1" w:space="0" w:color="CCCCCC"/>
@@ -372,7 +410,7 @@
         </w:tc>
         <w:tc>
           <w:tcPr>
-            <w:tcW w:w="5360" w:type="dxa"/>
+            <w:tcW w:w="6151" w:type="dxa"/>
             <w:tcBorders>
               <w:top w:val="single" w:sz="1" w:space="0" w:color="CCCCCC"/>
               <w:left w:val="single" w:sz="1" w:space="0" w:color="CCCCCC"/>
@@ -402,15 +440,12 @@
         </w:tc>
       </w:tr>
       <w:tr>
-        <w:tblPrEx>
-          <w:tblCellMar>
-            <w:top w:w="0" w:type="dxa"/>
-            <w:bottom w:w="0" w:type="dxa"/>
-          </w:tblCellMar>
-        </w:tblPrEx>
-        <w:tc>
-          <w:tcPr>
-            <w:tcW w:w="4000" w:type="dxa"/>
+        <w:trPr>
+          <w:trHeight w:val="458"/>
+        </w:trPr>
+        <w:tc>
+          <w:tcPr>
+            <w:tcW w:w="4590" w:type="dxa"/>
             <w:tcBorders>
               <w:top w:val="single" w:sz="1" w:space="0" w:color="CCCCCC"/>
               <w:left w:val="single" w:sz="1" w:space="0" w:color="CCCCCC"/>
@@ -436,7 +471,7 @@
         </w:tc>
         <w:tc>
           <w:tcPr>
-            <w:tcW w:w="5360" w:type="dxa"/>
+            <w:tcW w:w="6151" w:type="dxa"/>
             <w:tcBorders>
               <w:top w:val="single" w:sz="1" w:space="0" w:color="CCCCCC"/>
               <w:left w:val="single" w:sz="1" w:space="0" w:color="CCCCCC"/>
@@ -462,15 +497,12 @@
         </w:tc>
       </w:tr>
       <w:tr>
-        <w:tblPrEx>
-          <w:tblCellMar>
-            <w:top w:w="0" w:type="dxa"/>
-            <w:bottom w:w="0" w:type="dxa"/>
-          </w:tblCellMar>
-        </w:tblPrEx>
-        <w:tc>
-          <w:tcPr>
-            <w:tcW w:w="4000" w:type="dxa"/>
+        <w:trPr>
+          <w:trHeight w:val="458"/>
+        </w:trPr>
+        <w:tc>
+          <w:tcPr>
+            <w:tcW w:w="4590" w:type="dxa"/>
             <w:tcBorders>
               <w:top w:val="single" w:sz="1" w:space="0" w:color="CCCCCC"/>
               <w:left w:val="single" w:sz="1" w:space="0" w:color="CCCCCC"/>
@@ -496,41 +528,48 @@
         </w:tc>
         <w:tc>
           <w:tcPr>
-            <w:tcW w:w="5360" w:type="dxa"/>
-            <w:tcBorders>
-              <w:top w:val="single" w:sz="1" w:space="0" w:color="CCCCCC"/>
-              <w:left w:val="single" w:sz="1" w:space="0" w:color="CCCCCC"/>
-              <w:bottom w:val="single" w:sz="1" w:space="0" w:color="CCCCCC"/>
-              <w:right w:val="single" w:sz="1" w:space="0" w:color="CCCCCC"/>
-            </w:tcBorders>
-            <w:tcMar>
-              <w:top w:w="80" w:type="dxa"/>
-              <w:left w:w="120" w:type="dxa"/>
-              <w:bottom w:w="80" w:type="dxa"/>
-              <w:right w:w="120" w:type="dxa"/>
-            </w:tcMar>
-          </w:tcPr>
-          <w:p>
+            <w:tcW w:w="6151" w:type="dxa"/>
+            <w:tcBorders>
+              <w:top w:val="single" w:sz="1" w:space="0" w:color="CCCCCC"/>
+              <w:left w:val="single" w:sz="1" w:space="0" w:color="CCCCCC"/>
+              <w:bottom w:val="single" w:sz="1" w:space="0" w:color="CCCCCC"/>
+              <w:right w:val="single" w:sz="1" w:space="0" w:color="CCCCCC"/>
+            </w:tcBorders>
+            <w:tcMar>
+              <w:top w:w="80" w:type="dxa"/>
+              <w:left w:w="120" w:type="dxa"/>
+              <w:bottom w:w="80" w:type="dxa"/>
+              <w:right w:w="120" w:type="dxa"/>
+            </w:tcMar>
+          </w:tcPr>
+          <w:p>
+            <w:commentRangeStart w:id="2"/>
             <w:r>
               <w:rPr>
                 <w:rFonts w:ascii="Arial" w:hAnsi="Arial"/>
                 <w:szCs w:val="20"/>
               </w:rPr>
               <w:t>$21M entitlement opportunity; $10.8M annual chargeback data; 1,500 Oracle CRM tickets/year reduction</w:t>
+            </w:r>
+            <w:commentRangeEnd w:id="2"/>
+            <w:r>
+              <w:rPr>
+                <w:rStyle w:val="CommentReference"/>
+                <w:sz w:val="20"/>
+                <w:szCs w:val="22"/>
+              </w:rPr>
+              <w:commentReference w:id="2"/>
             </w:r>
           </w:p>
         </w:tc>
       </w:tr>
       <w:tr>
-        <w:tblPrEx>
-          <w:tblCellMar>
-            <w:top w:w="0" w:type="dxa"/>
-            <w:bottom w:w="0" w:type="dxa"/>
-          </w:tblCellMar>
-        </w:tblPrEx>
-        <w:tc>
-          <w:tcPr>
-            <w:tcW w:w="4000" w:type="dxa"/>
+        <w:trPr>
+          <w:trHeight w:val="917"/>
+        </w:trPr>
+        <w:tc>
+          <w:tcPr>
+            <w:tcW w:w="4590" w:type="dxa"/>
             <w:tcBorders>
               <w:top w:val="single" w:sz="1" w:space="0" w:color="CCCCCC"/>
               <w:left w:val="single" w:sz="1" w:space="0" w:color="CCCCCC"/>
@@ -556,41 +595,65 @@
         </w:tc>
         <w:tc>
           <w:tcPr>
-            <w:tcW w:w="5360" w:type="dxa"/>
-            <w:tcBorders>
-              <w:top w:val="single" w:sz="1" w:space="0" w:color="CCCCCC"/>
-              <w:left w:val="single" w:sz="1" w:space="0" w:color="CCCCCC"/>
-              <w:bottom w:val="single" w:sz="1" w:space="0" w:color="CCCCCC"/>
-              <w:right w:val="single" w:sz="1" w:space="0" w:color="CCCCCC"/>
-            </w:tcBorders>
-            <w:tcMar>
-              <w:top w:w="80" w:type="dxa"/>
-              <w:left w:w="120" w:type="dxa"/>
-              <w:bottom w:w="80" w:type="dxa"/>
-              <w:right w:w="120" w:type="dxa"/>
-            </w:tcMar>
-          </w:tcPr>
-          <w:p>
-            <w:r>
-              <w:rPr>
-                <w:rFonts w:ascii="Arial" w:hAnsi="Arial"/>
-                <w:szCs w:val="20"/>
-              </w:rPr>
-              <w:t>$5M documented single-event cost avoidance; ~$15M estimated annual exposure from recurring threshold issues; active data leakage vulnerability in manual distribution</w:t>
+            <w:tcW w:w="6151" w:type="dxa"/>
+            <w:tcBorders>
+              <w:top w:val="single" w:sz="1" w:space="0" w:color="CCCCCC"/>
+              <w:left w:val="single" w:sz="1" w:space="0" w:color="CCCCCC"/>
+              <w:bottom w:val="single" w:sz="1" w:space="0" w:color="CCCCCC"/>
+              <w:right w:val="single" w:sz="1" w:space="0" w:color="CCCCCC"/>
+            </w:tcBorders>
+            <w:tcMar>
+              <w:top w:w="80" w:type="dxa"/>
+              <w:left w:w="120" w:type="dxa"/>
+              <w:bottom w:w="80" w:type="dxa"/>
+              <w:right w:w="120" w:type="dxa"/>
+            </w:tcMar>
+          </w:tcPr>
+          <w:p>
+            <w:commentRangeStart w:id="3"/>
+            <w:commentRangeStart w:id="4"/>
+            <w:r>
+              <w:rPr>
+                <w:rFonts w:ascii="Arial" w:hAnsi="Arial"/>
+              </w:rPr>
+              <w:t>$5M documented single-event cost avoidance</w:t>
+            </w:r>
+            <w:commentRangeEnd w:id="3"/>
+            <w:r>
+              <w:rPr>
+                <w:rStyle w:val="CommentReference"/>
+                <w:rFonts w:ascii="Arial" w:hAnsi="Arial"/>
+                <w:sz w:val="20"/>
+                <w:szCs w:val="22"/>
+              </w:rPr>
+              <w:commentReference w:id="3"/>
+            </w:r>
+            <w:commentRangeEnd w:id="4"/>
+            <w:r>
+              <w:rPr>
+                <w:rStyle w:val="CommentReference"/>
+                <w:rFonts w:ascii="Arial" w:hAnsi="Arial"/>
+                <w:sz w:val="20"/>
+                <w:szCs w:val="22"/>
+              </w:rPr>
+              <w:commentReference w:id="4"/>
+            </w:r>
+            <w:r>
+              <w:rPr>
+                <w:rFonts w:ascii="Arial" w:hAnsi="Arial"/>
+              </w:rPr>
+              <w:t>; ~$15M estimated annual exposure from recurring threshold issues; active data leakage vulnerability in manual distribution</w:t>
             </w:r>
           </w:p>
         </w:tc>
       </w:tr>
       <w:tr>
-        <w:tblPrEx>
-          <w:tblCellMar>
-            <w:top w:w="0" w:type="dxa"/>
-            <w:bottom w:w="0" w:type="dxa"/>
-          </w:tblCellMar>
-        </w:tblPrEx>
-        <w:tc>
-          <w:tcPr>
-            <w:tcW w:w="4000" w:type="dxa"/>
+        <w:trPr>
+          <w:trHeight w:val="444"/>
+        </w:trPr>
+        <w:tc>
+          <w:tcPr>
+            <w:tcW w:w="4590" w:type="dxa"/>
             <w:tcBorders>
               <w:top w:val="single" w:sz="1" w:space="0" w:color="CCCCCC"/>
               <w:left w:val="single" w:sz="1" w:space="0" w:color="CCCCCC"/>
@@ -616,7 +679,7 @@
         </w:tc>
         <w:tc>
           <w:tcPr>
-            <w:tcW w:w="5360" w:type="dxa"/>
+            <w:tcW w:w="6151" w:type="dxa"/>
             <w:tcBorders>
               <w:top w:val="single" w:sz="1" w:space="0" w:color="CCCCCC"/>
               <w:left w:val="single" w:sz="1" w:space="0" w:color="CCCCCC"/>
@@ -642,15 +705,12 @@
         </w:tc>
       </w:tr>
       <w:tr>
-        <w:tblPrEx>
-          <w:tblCellMar>
-            <w:top w:w="0" w:type="dxa"/>
-            <w:bottom w:w="0" w:type="dxa"/>
-          </w:tblCellMar>
-        </w:tblPrEx>
-        <w:tc>
-          <w:tcPr>
-            <w:tcW w:w="4000" w:type="dxa"/>
+        <w:trPr>
+          <w:trHeight w:val="688"/>
+        </w:trPr>
+        <w:tc>
+          <w:tcPr>
+            <w:tcW w:w="4590" w:type="dxa"/>
             <w:tcBorders>
               <w:top w:val="single" w:sz="1" w:space="0" w:color="CCCCCC"/>
               <w:left w:val="single" w:sz="1" w:space="0" w:color="CCCCCC"/>
@@ -676,7 +736,7 @@
         </w:tc>
         <w:tc>
           <w:tcPr>
-            <w:tcW w:w="5360" w:type="dxa"/>
+            <w:tcW w:w="6151" w:type="dxa"/>
             <w:tcBorders>
               <w:top w:val="single" w:sz="1" w:space="0" w:color="CCCCCC"/>
               <w:left w:val="single" w:sz="1" w:space="0" w:color="CCCCCC"/>
@@ -712,7 +772,6 @@
         <w:pStyle w:val="Heading1"/>
       </w:pPr>
       <w:r>
-        <w:lastRenderedPageBreak/>
         <w:t>2. Roadmap Architecture</w:t>
       </w:r>
     </w:p>
@@ -732,8 +791,18 @@
       <w:pPr>
         <w:pStyle w:val="Heading2"/>
       </w:pPr>
+      <w:commentRangeStart w:id="5"/>
       <w:r>
         <w:t>Phase 0: Foundation &amp; Readiness (March–May 2026)</w:t>
+      </w:r>
+      <w:commentRangeEnd w:id="5"/>
+      <w:r>
+        <w:rPr>
+          <w:rStyle w:val="CommentReference"/>
+          <w:sz w:val="26"/>
+          <w:szCs w:val="26"/>
+        </w:rPr>
+        <w:commentReference w:id="5"/>
       </w:r>
     </w:p>
     <w:p>
@@ -785,7 +854,7 @@
     </w:p>
     <w:tbl>
       <w:tblPr>
-        <w:tblW w:w="9360" w:type="dxa"/>
+        <w:tblW w:w="10826" w:type="dxa"/>
         <w:tblBorders>
           <w:top w:val="single" w:sz="4" w:space="0" w:color="auto"/>
           <w:left w:val="single" w:sz="4" w:space="0" w:color="auto"/>
@@ -801,20 +870,17 @@
         <w:tblLook w:val="0000" w:firstRow="0" w:lastRow="0" w:firstColumn="0" w:lastColumn="0" w:noHBand="0" w:noVBand="0"/>
       </w:tblPr>
       <w:tblGrid>
-        <w:gridCol w:w="3200"/>
-        <w:gridCol w:w="3400"/>
-        <w:gridCol w:w="2760"/>
+        <w:gridCol w:w="3701"/>
+        <w:gridCol w:w="3933"/>
+        <w:gridCol w:w="3192"/>
       </w:tblGrid>
       <w:tr>
-        <w:tblPrEx>
-          <w:tblCellMar>
-            <w:top w:w="0" w:type="dxa"/>
-            <w:bottom w:w="0" w:type="dxa"/>
-          </w:tblCellMar>
-        </w:tblPrEx>
-        <w:tc>
-          <w:tcPr>
-            <w:tcW w:w="3200" w:type="dxa"/>
+        <w:trPr>
+          <w:trHeight w:val="219"/>
+        </w:trPr>
+        <w:tc>
+          <w:tcPr>
+            <w:tcW w:w="3701" w:type="dxa"/>
             <w:tcBorders>
               <w:top w:val="single" w:sz="1" w:space="0" w:color="CCCCCC"/>
               <w:left w:val="single" w:sz="1" w:space="0" w:color="CCCCCC"/>
@@ -844,7 +910,7 @@
         </w:tc>
         <w:tc>
           <w:tcPr>
-            <w:tcW w:w="3400" w:type="dxa"/>
+            <w:tcW w:w="3933" w:type="dxa"/>
             <w:tcBorders>
               <w:top w:val="single" w:sz="1" w:space="0" w:color="CCCCCC"/>
               <w:left w:val="single" w:sz="1" w:space="0" w:color="CCCCCC"/>
@@ -874,7 +940,7 @@
         </w:tc>
         <w:tc>
           <w:tcPr>
-            <w:tcW w:w="2760" w:type="dxa"/>
+            <w:tcW w:w="3192" w:type="dxa"/>
             <w:tcBorders>
               <w:top w:val="single" w:sz="1" w:space="0" w:color="CCCCCC"/>
               <w:left w:val="single" w:sz="1" w:space="0" w:color="CCCCCC"/>
@@ -904,15 +970,12 @@
         </w:tc>
       </w:tr>
       <w:tr>
-        <w:tblPrEx>
-          <w:tblCellMar>
-            <w:top w:w="0" w:type="dxa"/>
-            <w:bottom w:w="0" w:type="dxa"/>
-          </w:tblCellMar>
-        </w:tblPrEx>
-        <w:tc>
-          <w:tcPr>
-            <w:tcW w:w="3200" w:type="dxa"/>
+        <w:trPr>
+          <w:trHeight w:val="466"/>
+        </w:trPr>
+        <w:tc>
+          <w:tcPr>
+            <w:tcW w:w="3701" w:type="dxa"/>
             <w:tcBorders>
               <w:top w:val="single" w:sz="1" w:space="0" w:color="CCCCCC"/>
               <w:left w:val="single" w:sz="1" w:space="0" w:color="CCCCCC"/>
@@ -938,7 +1001,7 @@
         </w:tc>
         <w:tc>
           <w:tcPr>
-            <w:tcW w:w="3400" w:type="dxa"/>
+            <w:tcW w:w="3933" w:type="dxa"/>
             <w:tcBorders>
               <w:top w:val="single" w:sz="1" w:space="0" w:color="CCCCCC"/>
               <w:left w:val="single" w:sz="1" w:space="0" w:color="CCCCCC"/>
@@ -964,7 +1027,7 @@
         </w:tc>
         <w:tc>
           <w:tcPr>
-            <w:tcW w:w="2760" w:type="dxa"/>
+            <w:tcW w:w="3192" w:type="dxa"/>
             <w:tcBorders>
               <w:top w:val="single" w:sz="1" w:space="0" w:color="CCCCCC"/>
               <w:left w:val="single" w:sz="1" w:space="0" w:color="CCCCCC"/>
@@ -990,15 +1053,12 @@
         </w:tc>
       </w:tr>
       <w:tr>
-        <w:tblPrEx>
-          <w:tblCellMar>
-            <w:top w:w="0" w:type="dxa"/>
-            <w:bottom w:w="0" w:type="dxa"/>
-          </w:tblCellMar>
-        </w:tblPrEx>
-        <w:tc>
-          <w:tcPr>
-            <w:tcW w:w="3200" w:type="dxa"/>
+        <w:trPr>
+          <w:trHeight w:val="466"/>
+        </w:trPr>
+        <w:tc>
+          <w:tcPr>
+            <w:tcW w:w="3701" w:type="dxa"/>
             <w:tcBorders>
               <w:top w:val="single" w:sz="1" w:space="0" w:color="CCCCCC"/>
               <w:left w:val="single" w:sz="1" w:space="0" w:color="CCCCCC"/>
@@ -1024,7 +1084,7 @@
         </w:tc>
         <w:tc>
           <w:tcPr>
-            <w:tcW w:w="3400" w:type="dxa"/>
+            <w:tcW w:w="3933" w:type="dxa"/>
             <w:tcBorders>
               <w:top w:val="single" w:sz="1" w:space="0" w:color="CCCCCC"/>
               <w:left w:val="single" w:sz="1" w:space="0" w:color="CCCCCC"/>
@@ -1050,7 +1110,7 @@
         </w:tc>
         <w:tc>
           <w:tcPr>
-            <w:tcW w:w="2760" w:type="dxa"/>
+            <w:tcW w:w="3192" w:type="dxa"/>
             <w:tcBorders>
               <w:top w:val="single" w:sz="1" w:space="0" w:color="CCCCCC"/>
               <w:left w:val="single" w:sz="1" w:space="0" w:color="CCCCCC"/>
@@ -1076,15 +1136,12 @@
         </w:tc>
       </w:tr>
       <w:tr>
-        <w:tblPrEx>
-          <w:tblCellMar>
-            <w:top w:w="0" w:type="dxa"/>
-            <w:bottom w:w="0" w:type="dxa"/>
-          </w:tblCellMar>
-        </w:tblPrEx>
-        <w:tc>
-          <w:tcPr>
-            <w:tcW w:w="3200" w:type="dxa"/>
+        <w:trPr>
+          <w:trHeight w:val="452"/>
+        </w:trPr>
+        <w:tc>
+          <w:tcPr>
+            <w:tcW w:w="3701" w:type="dxa"/>
             <w:tcBorders>
               <w:top w:val="single" w:sz="1" w:space="0" w:color="CCCCCC"/>
               <w:left w:val="single" w:sz="1" w:space="0" w:color="CCCCCC"/>
@@ -1110,7 +1167,7 @@
         </w:tc>
         <w:tc>
           <w:tcPr>
-            <w:tcW w:w="3400" w:type="dxa"/>
+            <w:tcW w:w="3933" w:type="dxa"/>
             <w:tcBorders>
               <w:top w:val="single" w:sz="1" w:space="0" w:color="CCCCCC"/>
               <w:left w:val="single" w:sz="1" w:space="0" w:color="CCCCCC"/>
@@ -1136,7 +1193,7 @@
         </w:tc>
         <w:tc>
           <w:tcPr>
-            <w:tcW w:w="2760" w:type="dxa"/>
+            <w:tcW w:w="3192" w:type="dxa"/>
             <w:tcBorders>
               <w:top w:val="single" w:sz="1" w:space="0" w:color="CCCCCC"/>
               <w:left w:val="single" w:sz="1" w:space="0" w:color="CCCCCC"/>
@@ -1162,29 +1219,27 @@
         </w:tc>
       </w:tr>
       <w:tr>
-        <w:tblPrEx>
-          <w:tblCellMar>
-            <w:top w:w="0" w:type="dxa"/>
-            <w:bottom w:w="0" w:type="dxa"/>
-          </w:tblCellMar>
-        </w:tblPrEx>
-        <w:tc>
-          <w:tcPr>
-            <w:tcW w:w="3200" w:type="dxa"/>
-            <w:tcBorders>
-              <w:top w:val="single" w:sz="1" w:space="0" w:color="CCCCCC"/>
-              <w:left w:val="single" w:sz="1" w:space="0" w:color="CCCCCC"/>
-              <w:bottom w:val="single" w:sz="1" w:space="0" w:color="CCCCCC"/>
-              <w:right w:val="single" w:sz="1" w:space="0" w:color="CCCCCC"/>
-            </w:tcBorders>
-            <w:tcMar>
-              <w:top w:w="80" w:type="dxa"/>
-              <w:left w:w="120" w:type="dxa"/>
-              <w:bottom w:w="80" w:type="dxa"/>
-              <w:right w:w="120" w:type="dxa"/>
-            </w:tcMar>
-          </w:tcPr>
-          <w:p>
+        <w:trPr>
+          <w:trHeight w:val="466"/>
+        </w:trPr>
+        <w:tc>
+          <w:tcPr>
+            <w:tcW w:w="3701" w:type="dxa"/>
+            <w:tcBorders>
+              <w:top w:val="single" w:sz="1" w:space="0" w:color="CCCCCC"/>
+              <w:left w:val="single" w:sz="1" w:space="0" w:color="CCCCCC"/>
+              <w:bottom w:val="single" w:sz="1" w:space="0" w:color="CCCCCC"/>
+              <w:right w:val="single" w:sz="1" w:space="0" w:color="CCCCCC"/>
+            </w:tcBorders>
+            <w:tcMar>
+              <w:top w:w="80" w:type="dxa"/>
+              <w:left w:w="120" w:type="dxa"/>
+              <w:bottom w:w="80" w:type="dxa"/>
+              <w:right w:w="120" w:type="dxa"/>
+            </w:tcMar>
+          </w:tcPr>
+          <w:p>
+            <w:commentRangeStart w:id="6"/>
             <w:r>
               <w:rPr>
                 <w:rFonts w:ascii="Arial" w:hAnsi="Arial"/>
@@ -1196,7 +1251,7 @@
         </w:tc>
         <w:tc>
           <w:tcPr>
-            <w:tcW w:w="3400" w:type="dxa"/>
+            <w:tcW w:w="3933" w:type="dxa"/>
             <w:tcBorders>
               <w:top w:val="single" w:sz="1" w:space="0" w:color="CCCCCC"/>
               <w:left w:val="single" w:sz="1" w:space="0" w:color="CCCCCC"/>
@@ -1222,7 +1277,7 @@
         </w:tc>
         <w:tc>
           <w:tcPr>
-            <w:tcW w:w="2760" w:type="dxa"/>
+            <w:tcW w:w="3192" w:type="dxa"/>
             <w:tcBorders>
               <w:top w:val="single" w:sz="1" w:space="0" w:color="CCCCCC"/>
               <w:left w:val="single" w:sz="1" w:space="0" w:color="CCCCCC"/>
@@ -1243,20 +1298,26 @@
                 <w:szCs w:val="20"/>
               </w:rPr>
               <w:t>Nathan Miles</w:t>
+            </w:r>
+            <w:commentRangeEnd w:id="6"/>
+            <w:r>
+              <w:rPr>
+                <w:rStyle w:val="CommentReference"/>
+                <w:sz w:val="20"/>
+                <w:szCs w:val="22"/>
+              </w:rPr>
+              <w:commentReference w:id="6"/>
             </w:r>
           </w:p>
         </w:tc>
       </w:tr>
       <w:tr>
-        <w:tblPrEx>
-          <w:tblCellMar>
-            <w:top w:w="0" w:type="dxa"/>
-            <w:bottom w:w="0" w:type="dxa"/>
-          </w:tblCellMar>
-        </w:tblPrEx>
-        <w:tc>
-          <w:tcPr>
-            <w:tcW w:w="3200" w:type="dxa"/>
+        <w:trPr>
+          <w:trHeight w:val="700"/>
+        </w:trPr>
+        <w:tc>
+          <w:tcPr>
+            <w:tcW w:w="3701" w:type="dxa"/>
             <w:tcBorders>
               <w:top w:val="single" w:sz="1" w:space="0" w:color="CCCCCC"/>
               <w:left w:val="single" w:sz="1" w:space="0" w:color="CCCCCC"/>
@@ -1282,7 +1343,7 @@
         </w:tc>
         <w:tc>
           <w:tcPr>
-            <w:tcW w:w="3400" w:type="dxa"/>
+            <w:tcW w:w="3933" w:type="dxa"/>
             <w:tcBorders>
               <w:top w:val="single" w:sz="1" w:space="0" w:color="CCCCCC"/>
               <w:left w:val="single" w:sz="1" w:space="0" w:color="CCCCCC"/>
@@ -1308,7 +1369,7 @@
         </w:tc>
         <w:tc>
           <w:tcPr>
-            <w:tcW w:w="2760" w:type="dxa"/>
+            <w:tcW w:w="3192" w:type="dxa"/>
             <w:tcBorders>
               <w:top w:val="single" w:sz="1" w:space="0" w:color="CCCCCC"/>
               <w:left w:val="single" w:sz="1" w:space="0" w:color="CCCCCC"/>
@@ -1334,29 +1395,27 @@
         </w:tc>
       </w:tr>
       <w:tr>
-        <w:tblPrEx>
-          <w:tblCellMar>
-            <w:top w:w="0" w:type="dxa"/>
-            <w:bottom w:w="0" w:type="dxa"/>
-          </w:tblCellMar>
-        </w:tblPrEx>
-        <w:tc>
-          <w:tcPr>
-            <w:tcW w:w="3200" w:type="dxa"/>
-            <w:tcBorders>
-              <w:top w:val="single" w:sz="1" w:space="0" w:color="CCCCCC"/>
-              <w:left w:val="single" w:sz="1" w:space="0" w:color="CCCCCC"/>
-              <w:bottom w:val="single" w:sz="1" w:space="0" w:color="CCCCCC"/>
-              <w:right w:val="single" w:sz="1" w:space="0" w:color="CCCCCC"/>
-            </w:tcBorders>
-            <w:tcMar>
-              <w:top w:w="80" w:type="dxa"/>
-              <w:left w:w="120" w:type="dxa"/>
-              <w:bottom w:w="80" w:type="dxa"/>
-              <w:right w:w="120" w:type="dxa"/>
-            </w:tcMar>
-          </w:tcPr>
-          <w:p>
+        <w:trPr>
+          <w:trHeight w:val="685"/>
+        </w:trPr>
+        <w:tc>
+          <w:tcPr>
+            <w:tcW w:w="3701" w:type="dxa"/>
+            <w:tcBorders>
+              <w:top w:val="single" w:sz="1" w:space="0" w:color="CCCCCC"/>
+              <w:left w:val="single" w:sz="1" w:space="0" w:color="CCCCCC"/>
+              <w:bottom w:val="single" w:sz="1" w:space="0" w:color="CCCCCC"/>
+              <w:right w:val="single" w:sz="1" w:space="0" w:color="CCCCCC"/>
+            </w:tcBorders>
+            <w:tcMar>
+              <w:top w:w="80" w:type="dxa"/>
+              <w:left w:w="120" w:type="dxa"/>
+              <w:bottom w:w="80" w:type="dxa"/>
+              <w:right w:w="120" w:type="dxa"/>
+            </w:tcMar>
+          </w:tcPr>
+          <w:p>
+            <w:commentRangeStart w:id="7"/>
             <w:r>
               <w:rPr>
                 <w:rFonts w:ascii="Arial" w:hAnsi="Arial"/>
@@ -1368,7 +1427,7 @@
         </w:tc>
         <w:tc>
           <w:tcPr>
-            <w:tcW w:w="3400" w:type="dxa"/>
+            <w:tcW w:w="3933" w:type="dxa"/>
             <w:tcBorders>
               <w:top w:val="single" w:sz="1" w:space="0" w:color="CCCCCC"/>
               <w:left w:val="single" w:sz="1" w:space="0" w:color="CCCCCC"/>
@@ -1394,7 +1453,7 @@
         </w:tc>
         <w:tc>
           <w:tcPr>
-            <w:tcW w:w="2760" w:type="dxa"/>
+            <w:tcW w:w="3192" w:type="dxa"/>
             <w:tcBorders>
               <w:top w:val="single" w:sz="1" w:space="0" w:color="CCCCCC"/>
               <w:left w:val="single" w:sz="1" w:space="0" w:color="CCCCCC"/>
@@ -1415,34 +1474,41 @@
                 <w:szCs w:val="20"/>
               </w:rPr>
               <w:t>Nathan Miles + CPH contact</w:t>
+            </w:r>
+            <w:commentRangeEnd w:id="7"/>
+            <w:r>
+              <w:rPr>
+                <w:rStyle w:val="CommentReference"/>
+                <w:sz w:val="20"/>
+                <w:szCs w:val="22"/>
+              </w:rPr>
+              <w:commentReference w:id="7"/>
             </w:r>
           </w:p>
         </w:tc>
       </w:tr>
       <w:tr>
-        <w:tblPrEx>
-          <w:tblCellMar>
-            <w:top w:w="0" w:type="dxa"/>
-            <w:bottom w:w="0" w:type="dxa"/>
-          </w:tblCellMar>
-        </w:tblPrEx>
-        <w:tc>
-          <w:tcPr>
-            <w:tcW w:w="3200" w:type="dxa"/>
-            <w:tcBorders>
-              <w:top w:val="single" w:sz="1" w:space="0" w:color="CCCCCC"/>
-              <w:left w:val="single" w:sz="1" w:space="0" w:color="CCCCCC"/>
-              <w:bottom w:val="single" w:sz="1" w:space="0" w:color="CCCCCC"/>
-              <w:right w:val="single" w:sz="1" w:space="0" w:color="CCCCCC"/>
-            </w:tcBorders>
-            <w:tcMar>
-              <w:top w:w="80" w:type="dxa"/>
-              <w:left w:w="120" w:type="dxa"/>
-              <w:bottom w:w="80" w:type="dxa"/>
-              <w:right w:w="120" w:type="dxa"/>
-            </w:tcMar>
-          </w:tcPr>
-          <w:p>
+        <w:trPr>
+          <w:trHeight w:val="700"/>
+        </w:trPr>
+        <w:tc>
+          <w:tcPr>
+            <w:tcW w:w="3701" w:type="dxa"/>
+            <w:tcBorders>
+              <w:top w:val="single" w:sz="1" w:space="0" w:color="CCCCCC"/>
+              <w:left w:val="single" w:sz="1" w:space="0" w:color="CCCCCC"/>
+              <w:bottom w:val="single" w:sz="1" w:space="0" w:color="CCCCCC"/>
+              <w:right w:val="single" w:sz="1" w:space="0" w:color="CCCCCC"/>
+            </w:tcBorders>
+            <w:tcMar>
+              <w:top w:w="80" w:type="dxa"/>
+              <w:left w:w="120" w:type="dxa"/>
+              <w:bottom w:w="80" w:type="dxa"/>
+              <w:right w:w="120" w:type="dxa"/>
+            </w:tcMar>
+          </w:tcPr>
+          <w:p>
+            <w:commentRangeStart w:id="8"/>
             <w:r>
               <w:rPr>
                 <w:rFonts w:ascii="Arial" w:hAnsi="Arial"/>
@@ -1454,7 +1520,7 @@
         </w:tc>
         <w:tc>
           <w:tcPr>
-            <w:tcW w:w="3400" w:type="dxa"/>
+            <w:tcW w:w="3933" w:type="dxa"/>
             <w:tcBorders>
               <w:top w:val="single" w:sz="1" w:space="0" w:color="CCCCCC"/>
               <w:left w:val="single" w:sz="1" w:space="0" w:color="CCCCCC"/>
@@ -1480,7 +1546,7 @@
         </w:tc>
         <w:tc>
           <w:tcPr>
-            <w:tcW w:w="2760" w:type="dxa"/>
+            <w:tcW w:w="3192" w:type="dxa"/>
             <w:tcBorders>
               <w:top w:val="single" w:sz="1" w:space="0" w:color="CCCCCC"/>
               <w:left w:val="single" w:sz="1" w:space="0" w:color="CCCCCC"/>
@@ -1501,20 +1567,26 @@
                 <w:szCs w:val="20"/>
               </w:rPr>
               <w:t>Nathan Miles + CPH contact + Erdem coaching</w:t>
+            </w:r>
+            <w:commentRangeEnd w:id="8"/>
+            <w:r>
+              <w:rPr>
+                <w:rStyle w:val="CommentReference"/>
+                <w:sz w:val="20"/>
+                <w:szCs w:val="22"/>
+              </w:rPr>
+              <w:commentReference w:id="8"/>
             </w:r>
           </w:p>
         </w:tc>
       </w:tr>
       <w:tr>
-        <w:tblPrEx>
-          <w:tblCellMar>
-            <w:top w:w="0" w:type="dxa"/>
-            <w:bottom w:w="0" w:type="dxa"/>
-          </w:tblCellMar>
-        </w:tblPrEx>
-        <w:tc>
-          <w:tcPr>
-            <w:tcW w:w="3200" w:type="dxa"/>
+        <w:trPr>
+          <w:trHeight w:val="466"/>
+        </w:trPr>
+        <w:tc>
+          <w:tcPr>
+            <w:tcW w:w="3701" w:type="dxa"/>
             <w:tcBorders>
               <w:top w:val="single" w:sz="1" w:space="0" w:color="CCCCCC"/>
               <w:left w:val="single" w:sz="1" w:space="0" w:color="CCCCCC"/>
@@ -1540,7 +1612,7 @@
         </w:tc>
         <w:tc>
           <w:tcPr>
-            <w:tcW w:w="3400" w:type="dxa"/>
+            <w:tcW w:w="3933" w:type="dxa"/>
             <w:tcBorders>
               <w:top w:val="single" w:sz="1" w:space="0" w:color="CCCCCC"/>
               <w:left w:val="single" w:sz="1" w:space="0" w:color="CCCCCC"/>
@@ -1566,7 +1638,7 @@
         </w:tc>
         <w:tc>
           <w:tcPr>
-            <w:tcW w:w="2760" w:type="dxa"/>
+            <w:tcW w:w="3192" w:type="dxa"/>
             <w:tcBorders>
               <w:top w:val="single" w:sz="1" w:space="0" w:color="CCCCCC"/>
               <w:left w:val="single" w:sz="1" w:space="0" w:color="CCCCCC"/>
@@ -1617,6 +1689,17 @@
         </w:rPr>
         <w:t>Cannot enter Phase 1 without (a) a confirmed CPH engineering contact, (b) an agreed MVP scope document, and (c) platform delivery confirmed. If the CPH contact is not identified by 4/18, this escalates to Dave Livesay for intervention.</w:t>
       </w:r>
+      <w:r>
+        <w:br w:type="page"/>
+      </w:r>
+    </w:p>
+    <w:p>
+      <w:pPr>
+        <w:pStyle w:val="Heading2"/>
+      </w:pPr>
+      <w:r>
+        <w:t>Phase 1: CPFR Module MVP Build (May–August 2026)</w:t>
+      </w:r>
     </w:p>
     <w:p>
       <w:pPr>
@@ -1629,44 +1712,14 @@
           <w:bCs/>
           <w:sz w:val="22"/>
         </w:rPr>
-        <w:t xml:space="preserve">Persona note: </w:t>
-      </w:r>
-      <w:r>
-        <w:rPr>
-          <w:rFonts w:ascii="Arial" w:hAnsi="Arial"/>
-          <w:sz w:val="22"/>
-        </w:rPr>
-        <w:t xml:space="preserve">This phase is entirely on Nathan’s shoulders on allocation. </w:t>
-      </w:r>
-      <w:proofErr w:type="spellStart"/>
-      <w:r>
-        <w:rPr>
-          <w:rFonts w:ascii="Arial" w:hAnsi="Arial"/>
-          <w:sz w:val="22"/>
-        </w:rPr>
-        <w:t>Phanindher’s</w:t>
-      </w:r>
-      <w:proofErr w:type="spellEnd"/>
-      <w:r>
-        <w:rPr>
-          <w:rFonts w:ascii="Arial" w:hAnsi="Arial"/>
-          <w:sz w:val="22"/>
-        </w:rPr>
-        <w:t xml:space="preserve"> role is air cover and escalation relay. Dave’s role is to be briefed on the gate criteria so he knows exactly when and why he may need to act. Richard’s concern is addressed by the MVP scope document explicitly incorporating unified vendor experience as a first-order design constraint.</w:t>
-      </w:r>
-    </w:p>
-    <w:p>
-      <w:r>
-        <w:br w:type="page"/>
-      </w:r>
-    </w:p>
-    <w:p>
-      <w:pPr>
-        <w:pStyle w:val="Heading2"/>
-      </w:pPr>
-      <w:r>
-        <w:lastRenderedPageBreak/>
-        <w:t>Phase 1: CPFR Module MVP Build (May–August 2026)</w:t>
+        <w:t xml:space="preserve">Funding model: </w:t>
+      </w:r>
+      <w:r>
+        <w:rPr>
+          <w:rFonts w:ascii="Arial" w:hAnsi="Arial"/>
+          <w:sz w:val="22"/>
+        </w:rPr>
+        <w:t>Allocation transitioning to OP1 2027 submission.</w:t>
       </w:r>
     </w:p>
     <w:p>
@@ -1680,15 +1733,20 @@
           <w:bCs/>
           <w:sz w:val="22"/>
         </w:rPr>
-        <w:t xml:space="preserve">Funding model: </w:t>
-      </w:r>
-      <w:r>
-        <w:rPr>
-          <w:rFonts w:ascii="Arial" w:hAnsi="Arial"/>
-          <w:sz w:val="22"/>
-        </w:rPr>
-        <w:t>Allocation transitioning to OP1 2027 submission.</w:t>
-      </w:r>
+        <w:t xml:space="preserve">Objective: </w:t>
+      </w:r>
+      <w:r>
+        <w:rPr>
+          <w:rFonts w:ascii="Arial" w:hAnsi="Arial"/>
+          <w:sz w:val="22"/>
+        </w:rPr>
+        <w:t>Deliver a minimum viable CPFR presence in CPH that provides vendors with tangible value beyond email reports, while building the evidence base for OP1 2027.</w:t>
+      </w:r>
+    </w:p>
+    <w:p>
+      <w:pPr>
+        <w:spacing w:after="80"/>
+      </w:pPr>
     </w:p>
     <w:p>
       <w:pPr>
@@ -1701,32 +1759,6 @@
           <w:bCs/>
           <w:sz w:val="22"/>
         </w:rPr>
-        <w:t xml:space="preserve">Objective: </w:t>
-      </w:r>
-      <w:r>
-        <w:rPr>
-          <w:rFonts w:ascii="Arial" w:hAnsi="Arial"/>
-          <w:sz w:val="22"/>
-        </w:rPr>
-        <w:t>Deliver a minimum viable CPFR presence in CPH that provides vendors with tangible value beyond email reports, while building the evidence base for OP1 2027.</w:t>
-      </w:r>
-    </w:p>
-    <w:p>
-      <w:pPr>
-        <w:spacing w:after="80"/>
-      </w:pPr>
-    </w:p>
-    <w:p>
-      <w:pPr>
-        <w:spacing w:after="160"/>
-      </w:pPr>
-      <w:r>
-        <w:rPr>
-          <w:rFonts w:ascii="Arial" w:hAnsi="Arial"/>
-          <w:b/>
-          <w:bCs/>
-          <w:sz w:val="22"/>
-        </w:rPr>
         <w:t xml:space="preserve">MVP Definition (Scorecard-First Approach): </w:t>
       </w:r>
       <w:r>
@@ -1734,23 +1766,7 @@
           <w:rFonts w:ascii="Arial" w:hAnsi="Arial"/>
           <w:sz w:val="22"/>
         </w:rPr>
-        <w:t xml:space="preserve">Based on the 3/05 team alignment, the MVP leads with a vendor scorecard landing page—a visual executive summary with daily-refreshed metrics, tier-appropriate KPIs, and heat-map visualizations. This is paired with a basic report viewer (tier-based data access equivalent to current email content but on-demand) and self-service contact management (the structural fix for the data leakage vulnerability identified in the Kent → </w:t>
-      </w:r>
-      <w:proofErr w:type="spellStart"/>
-      <w:r>
-        <w:rPr>
-          <w:rFonts w:ascii="Arial" w:hAnsi="Arial"/>
-          <w:sz w:val="22"/>
-        </w:rPr>
-        <w:t>Kelcies</w:t>
-      </w:r>
-      <w:proofErr w:type="spellEnd"/>
-      <w:r>
-        <w:rPr>
-          <w:rFonts w:ascii="Arial" w:hAnsi="Arial"/>
-          <w:sz w:val="22"/>
-        </w:rPr>
-        <w:t xml:space="preserve"> incident).</w:t>
+        <w:t>Based on the 3/05 team alignment, the MVP leads with a vendor scorecard landing page—a visual executive summary with daily-refreshed metrics, tier-appropriate KPIs, and heat-map visualizations. This is paired with a basic report viewer (tier-based data access equivalent to current email content but on-demand) and self-service contact management (the structural fix for the data leakage vulnerability identified in the Kent → Kelcies incident).</w:t>
       </w:r>
     </w:p>
     <w:p>
@@ -1760,7 +1776,7 @@
     </w:p>
     <w:tbl>
       <w:tblPr>
-        <w:tblW w:w="9360" w:type="dxa"/>
+        <w:tblW w:w="10726" w:type="dxa"/>
         <w:tblBorders>
           <w:top w:val="single" w:sz="4" w:space="0" w:color="auto"/>
           <w:left w:val="single" w:sz="4" w:space="0" w:color="auto"/>
@@ -1776,20 +1792,17 @@
         <w:tblLook w:val="0000" w:firstRow="0" w:lastRow="0" w:firstColumn="0" w:lastColumn="0" w:noHBand="0" w:noVBand="0"/>
       </w:tblPr>
       <w:tblGrid>
-        <w:gridCol w:w="3200"/>
-        <w:gridCol w:w="3400"/>
-        <w:gridCol w:w="2760"/>
+        <w:gridCol w:w="3667"/>
+        <w:gridCol w:w="3896"/>
+        <w:gridCol w:w="3163"/>
       </w:tblGrid>
       <w:tr>
-        <w:tblPrEx>
-          <w:tblCellMar>
-            <w:top w:w="0" w:type="dxa"/>
-            <w:bottom w:w="0" w:type="dxa"/>
-          </w:tblCellMar>
-        </w:tblPrEx>
-        <w:tc>
-          <w:tcPr>
-            <w:tcW w:w="3200" w:type="dxa"/>
+        <w:trPr>
+          <w:trHeight w:val="214"/>
+        </w:trPr>
+        <w:tc>
+          <w:tcPr>
+            <w:tcW w:w="3667" w:type="dxa"/>
             <w:tcBorders>
               <w:top w:val="single" w:sz="1" w:space="0" w:color="CCCCCC"/>
               <w:left w:val="single" w:sz="1" w:space="0" w:color="CCCCCC"/>
@@ -1819,7 +1832,7 @@
         </w:tc>
         <w:tc>
           <w:tcPr>
-            <w:tcW w:w="3400" w:type="dxa"/>
+            <w:tcW w:w="3896" w:type="dxa"/>
             <w:tcBorders>
               <w:top w:val="single" w:sz="1" w:space="0" w:color="CCCCCC"/>
               <w:left w:val="single" w:sz="1" w:space="0" w:color="CCCCCC"/>
@@ -1849,7 +1862,7 @@
         </w:tc>
         <w:tc>
           <w:tcPr>
-            <w:tcW w:w="2760" w:type="dxa"/>
+            <w:tcW w:w="3163" w:type="dxa"/>
             <w:tcBorders>
               <w:top w:val="single" w:sz="1" w:space="0" w:color="CCCCCC"/>
               <w:left w:val="single" w:sz="1" w:space="0" w:color="CCCCCC"/>
@@ -1879,15 +1892,12 @@
         </w:tc>
       </w:tr>
       <w:tr>
-        <w:tblPrEx>
-          <w:tblCellMar>
-            <w:top w:w="0" w:type="dxa"/>
-            <w:bottom w:w="0" w:type="dxa"/>
-          </w:tblCellMar>
-        </w:tblPrEx>
-        <w:tc>
-          <w:tcPr>
-            <w:tcW w:w="3200" w:type="dxa"/>
+        <w:trPr>
+          <w:trHeight w:val="687"/>
+        </w:trPr>
+        <w:tc>
+          <w:tcPr>
+            <w:tcW w:w="3667" w:type="dxa"/>
             <w:tcBorders>
               <w:top w:val="single" w:sz="1" w:space="0" w:color="CCCCCC"/>
               <w:left w:val="single" w:sz="1" w:space="0" w:color="CCCCCC"/>
@@ -1913,7 +1923,7 @@
         </w:tc>
         <w:tc>
           <w:tcPr>
-            <w:tcW w:w="3400" w:type="dxa"/>
+            <w:tcW w:w="3896" w:type="dxa"/>
             <w:tcBorders>
               <w:top w:val="single" w:sz="1" w:space="0" w:color="CCCCCC"/>
               <w:left w:val="single" w:sz="1" w:space="0" w:color="CCCCCC"/>
@@ -1939,7 +1949,7 @@
         </w:tc>
         <w:tc>
           <w:tcPr>
-            <w:tcW w:w="2760" w:type="dxa"/>
+            <w:tcW w:w="3163" w:type="dxa"/>
             <w:tcBorders>
               <w:top w:val="single" w:sz="1" w:space="0" w:color="CCCCCC"/>
               <w:left w:val="single" w:sz="1" w:space="0" w:color="CCCCCC"/>
@@ -1965,15 +1975,12 @@
         </w:tc>
       </w:tr>
       <w:tr>
-        <w:tblPrEx>
-          <w:tblCellMar>
-            <w:top w:w="0" w:type="dxa"/>
-            <w:bottom w:w="0" w:type="dxa"/>
-          </w:tblCellMar>
-        </w:tblPrEx>
-        <w:tc>
-          <w:tcPr>
-            <w:tcW w:w="3200" w:type="dxa"/>
+        <w:trPr>
+          <w:trHeight w:val="687"/>
+        </w:trPr>
+        <w:tc>
+          <w:tcPr>
+            <w:tcW w:w="3667" w:type="dxa"/>
             <w:tcBorders>
               <w:top w:val="single" w:sz="1" w:space="0" w:color="CCCCCC"/>
               <w:left w:val="single" w:sz="1" w:space="0" w:color="CCCCCC"/>
@@ -1999,7 +2006,7 @@
         </w:tc>
         <w:tc>
           <w:tcPr>
-            <w:tcW w:w="3400" w:type="dxa"/>
+            <w:tcW w:w="3896" w:type="dxa"/>
             <w:tcBorders>
               <w:top w:val="single" w:sz="1" w:space="0" w:color="CCCCCC"/>
               <w:left w:val="single" w:sz="1" w:space="0" w:color="CCCCCC"/>
@@ -2025,41 +2032,48 @@
         </w:tc>
         <w:tc>
           <w:tcPr>
-            <w:tcW w:w="2760" w:type="dxa"/>
-            <w:tcBorders>
-              <w:top w:val="single" w:sz="1" w:space="0" w:color="CCCCCC"/>
-              <w:left w:val="single" w:sz="1" w:space="0" w:color="CCCCCC"/>
-              <w:bottom w:val="single" w:sz="1" w:space="0" w:color="CCCCCC"/>
-              <w:right w:val="single" w:sz="1" w:space="0" w:color="CCCCCC"/>
-            </w:tcBorders>
-            <w:tcMar>
-              <w:top w:w="80" w:type="dxa"/>
-              <w:left w:w="120" w:type="dxa"/>
-              <w:bottom w:w="80" w:type="dxa"/>
-              <w:right w:w="120" w:type="dxa"/>
-            </w:tcMar>
-          </w:tcPr>
-          <w:p>
+            <w:tcW w:w="3163" w:type="dxa"/>
+            <w:tcBorders>
+              <w:top w:val="single" w:sz="1" w:space="0" w:color="CCCCCC"/>
+              <w:left w:val="single" w:sz="1" w:space="0" w:color="CCCCCC"/>
+              <w:bottom w:val="single" w:sz="1" w:space="0" w:color="CCCCCC"/>
+              <w:right w:val="single" w:sz="1" w:space="0" w:color="CCCCCC"/>
+            </w:tcBorders>
+            <w:tcMar>
+              <w:top w:w="80" w:type="dxa"/>
+              <w:left w:w="120" w:type="dxa"/>
+              <w:bottom w:w="80" w:type="dxa"/>
+              <w:right w:w="120" w:type="dxa"/>
+            </w:tcMar>
+          </w:tcPr>
+          <w:p>
+            <w:commentRangeStart w:id="9"/>
             <w:r>
               <w:rPr>
                 <w:rFonts w:ascii="Arial" w:hAnsi="Arial"/>
                 <w:szCs w:val="20"/>
               </w:rPr>
               <w:t>CPH engineering + Stefan</w:t>
+            </w:r>
+            <w:commentRangeEnd w:id="9"/>
+            <w:r>
+              <w:rPr>
+                <w:rStyle w:val="CommentReference"/>
+                <w:sz w:val="20"/>
+                <w:szCs w:val="22"/>
+              </w:rPr>
+              <w:commentReference w:id="9"/>
             </w:r>
           </w:p>
         </w:tc>
       </w:tr>
       <w:tr>
-        <w:tblPrEx>
-          <w:tblCellMar>
-            <w:top w:w="0" w:type="dxa"/>
-            <w:bottom w:w="0" w:type="dxa"/>
-          </w:tblCellMar>
-        </w:tblPrEx>
-        <w:tc>
-          <w:tcPr>
-            <w:tcW w:w="3200" w:type="dxa"/>
+        <w:trPr>
+          <w:trHeight w:val="458"/>
+        </w:trPr>
+        <w:tc>
+          <w:tcPr>
+            <w:tcW w:w="3667" w:type="dxa"/>
             <w:tcBorders>
               <w:top w:val="single" w:sz="1" w:space="0" w:color="CCCCCC"/>
               <w:left w:val="single" w:sz="1" w:space="0" w:color="CCCCCC"/>
@@ -2085,7 +2099,7 @@
         </w:tc>
         <w:tc>
           <w:tcPr>
-            <w:tcW w:w="3400" w:type="dxa"/>
+            <w:tcW w:w="3896" w:type="dxa"/>
             <w:tcBorders>
               <w:top w:val="single" w:sz="1" w:space="0" w:color="CCCCCC"/>
               <w:left w:val="single" w:sz="1" w:space="0" w:color="CCCCCC"/>
@@ -2111,7 +2125,7 @@
         </w:tc>
         <w:tc>
           <w:tcPr>
-            <w:tcW w:w="2760" w:type="dxa"/>
+            <w:tcW w:w="3163" w:type="dxa"/>
             <w:tcBorders>
               <w:top w:val="single" w:sz="1" w:space="0" w:color="CCCCCC"/>
               <w:left w:val="single" w:sz="1" w:space="0" w:color="CCCCCC"/>
@@ -2137,15 +2151,12 @@
         </w:tc>
       </w:tr>
       <w:tr>
-        <w:tblPrEx>
-          <w:tblCellMar>
-            <w:top w:w="0" w:type="dxa"/>
-            <w:bottom w:w="0" w:type="dxa"/>
-          </w:tblCellMar>
-        </w:tblPrEx>
-        <w:tc>
-          <w:tcPr>
-            <w:tcW w:w="3200" w:type="dxa"/>
+        <w:trPr>
+          <w:trHeight w:val="443"/>
+        </w:trPr>
+        <w:tc>
+          <w:tcPr>
+            <w:tcW w:w="3667" w:type="dxa"/>
             <w:tcBorders>
               <w:top w:val="single" w:sz="1" w:space="0" w:color="CCCCCC"/>
               <w:left w:val="single" w:sz="1" w:space="0" w:color="CCCCCC"/>
@@ -2171,7 +2182,7 @@
         </w:tc>
         <w:tc>
           <w:tcPr>
-            <w:tcW w:w="3400" w:type="dxa"/>
+            <w:tcW w:w="3896" w:type="dxa"/>
             <w:tcBorders>
               <w:top w:val="single" w:sz="1" w:space="0" w:color="CCCCCC"/>
               <w:left w:val="single" w:sz="1" w:space="0" w:color="CCCCCC"/>
@@ -2197,7 +2208,7 @@
         </w:tc>
         <w:tc>
           <w:tcPr>
-            <w:tcW w:w="2760" w:type="dxa"/>
+            <w:tcW w:w="3163" w:type="dxa"/>
             <w:tcBorders>
               <w:top w:val="single" w:sz="1" w:space="0" w:color="CCCCCC"/>
               <w:left w:val="single" w:sz="1" w:space="0" w:color="CCCCCC"/>
@@ -2223,15 +2234,12 @@
         </w:tc>
       </w:tr>
       <w:tr>
-        <w:tblPrEx>
-          <w:tblCellMar>
-            <w:top w:w="0" w:type="dxa"/>
-            <w:bottom w:w="0" w:type="dxa"/>
-          </w:tblCellMar>
-        </w:tblPrEx>
-        <w:tc>
-          <w:tcPr>
-            <w:tcW w:w="3200" w:type="dxa"/>
+        <w:trPr>
+          <w:trHeight w:val="687"/>
+        </w:trPr>
+        <w:tc>
+          <w:tcPr>
+            <w:tcW w:w="3667" w:type="dxa"/>
             <w:tcBorders>
               <w:top w:val="single" w:sz="1" w:space="0" w:color="CCCCCC"/>
               <w:left w:val="single" w:sz="1" w:space="0" w:color="CCCCCC"/>
@@ -2257,7 +2265,7 @@
         </w:tc>
         <w:tc>
           <w:tcPr>
-            <w:tcW w:w="3400" w:type="dxa"/>
+            <w:tcW w:w="3896" w:type="dxa"/>
             <w:tcBorders>
               <w:top w:val="single" w:sz="1" w:space="0" w:color="CCCCCC"/>
               <w:left w:val="single" w:sz="1" w:space="0" w:color="CCCCCC"/>
@@ -2283,7 +2291,7 @@
         </w:tc>
         <w:tc>
           <w:tcPr>
-            <w:tcW w:w="2760" w:type="dxa"/>
+            <w:tcW w:w="3163" w:type="dxa"/>
             <w:tcBorders>
               <w:top w:val="single" w:sz="1" w:space="0" w:color="CCCCCC"/>
               <w:left w:val="single" w:sz="1" w:space="0" w:color="CCCCCC"/>
@@ -2309,15 +2317,12 @@
         </w:tc>
       </w:tr>
       <w:tr>
-        <w:tblPrEx>
-          <w:tblCellMar>
-            <w:top w:w="0" w:type="dxa"/>
-            <w:bottom w:w="0" w:type="dxa"/>
-          </w:tblCellMar>
-        </w:tblPrEx>
-        <w:tc>
-          <w:tcPr>
-            <w:tcW w:w="3200" w:type="dxa"/>
+        <w:trPr>
+          <w:trHeight w:val="458"/>
+        </w:trPr>
+        <w:tc>
+          <w:tcPr>
+            <w:tcW w:w="3667" w:type="dxa"/>
             <w:tcBorders>
               <w:top w:val="single" w:sz="1" w:space="0" w:color="CCCCCC"/>
               <w:left w:val="single" w:sz="1" w:space="0" w:color="CCCCCC"/>
@@ -2343,7 +2348,7 @@
         </w:tc>
         <w:tc>
           <w:tcPr>
-            <w:tcW w:w="3400" w:type="dxa"/>
+            <w:tcW w:w="3896" w:type="dxa"/>
             <w:tcBorders>
               <w:top w:val="single" w:sz="1" w:space="0" w:color="CCCCCC"/>
               <w:left w:val="single" w:sz="1" w:space="0" w:color="CCCCCC"/>
@@ -2369,50 +2374,38 @@
         </w:tc>
         <w:tc>
           <w:tcPr>
-            <w:tcW w:w="2760" w:type="dxa"/>
-            <w:tcBorders>
-              <w:top w:val="single" w:sz="1" w:space="0" w:color="CCCCCC"/>
-              <w:left w:val="single" w:sz="1" w:space="0" w:color="CCCCCC"/>
-              <w:bottom w:val="single" w:sz="1" w:space="0" w:color="CCCCCC"/>
-              <w:right w:val="single" w:sz="1" w:space="0" w:color="CCCCCC"/>
-            </w:tcBorders>
-            <w:tcMar>
-              <w:top w:w="80" w:type="dxa"/>
-              <w:left w:w="120" w:type="dxa"/>
-              <w:bottom w:w="80" w:type="dxa"/>
-              <w:right w:w="120" w:type="dxa"/>
-            </w:tcMar>
-          </w:tcPr>
-          <w:p>
-            <w:proofErr w:type="spellStart"/>
-            <w:r>
-              <w:rPr>
-                <w:rFonts w:ascii="Arial" w:hAnsi="Arial"/>
-                <w:szCs w:val="20"/>
-              </w:rPr>
-              <w:t>Replen</w:t>
-            </w:r>
-            <w:proofErr w:type="spellEnd"/>
-            <w:r>
-              <w:rPr>
-                <w:rFonts w:ascii="Arial" w:hAnsi="Arial"/>
-                <w:szCs w:val="20"/>
-              </w:rPr>
-              <w:t xml:space="preserve"> Tech EDS partnership</w:t>
+            <w:tcW w:w="3163" w:type="dxa"/>
+            <w:tcBorders>
+              <w:top w:val="single" w:sz="1" w:space="0" w:color="CCCCCC"/>
+              <w:left w:val="single" w:sz="1" w:space="0" w:color="CCCCCC"/>
+              <w:bottom w:val="single" w:sz="1" w:space="0" w:color="CCCCCC"/>
+              <w:right w:val="single" w:sz="1" w:space="0" w:color="CCCCCC"/>
+            </w:tcBorders>
+            <w:tcMar>
+              <w:top w:w="80" w:type="dxa"/>
+              <w:left w:w="120" w:type="dxa"/>
+              <w:bottom w:w="80" w:type="dxa"/>
+              <w:right w:w="120" w:type="dxa"/>
+            </w:tcMar>
+          </w:tcPr>
+          <w:p>
+            <w:r>
+              <w:rPr>
+                <w:rFonts w:ascii="Arial" w:hAnsi="Arial"/>
+                <w:szCs w:val="20"/>
+              </w:rPr>
+              <w:t>Replen Tech EDS partnership</w:t>
             </w:r>
           </w:p>
         </w:tc>
       </w:tr>
       <w:tr>
-        <w:tblPrEx>
-          <w:tblCellMar>
-            <w:top w:w="0" w:type="dxa"/>
-            <w:bottom w:w="0" w:type="dxa"/>
-          </w:tblCellMar>
-        </w:tblPrEx>
-        <w:tc>
-          <w:tcPr>
-            <w:tcW w:w="3200" w:type="dxa"/>
+        <w:trPr>
+          <w:trHeight w:val="443"/>
+        </w:trPr>
+        <w:tc>
+          <w:tcPr>
+            <w:tcW w:w="3667" w:type="dxa"/>
             <w:tcBorders>
               <w:top w:val="single" w:sz="1" w:space="0" w:color="CCCCCC"/>
               <w:left w:val="single" w:sz="1" w:space="0" w:color="CCCCCC"/>
@@ -2438,7 +2431,7 @@
         </w:tc>
         <w:tc>
           <w:tcPr>
-            <w:tcW w:w="3400" w:type="dxa"/>
+            <w:tcW w:w="3896" w:type="dxa"/>
             <w:tcBorders>
               <w:top w:val="single" w:sz="1" w:space="0" w:color="CCCCCC"/>
               <w:left w:val="single" w:sz="1" w:space="0" w:color="CCCCCC"/>
@@ -2464,7 +2457,7 @@
         </w:tc>
         <w:tc>
           <w:tcPr>
-            <w:tcW w:w="2760" w:type="dxa"/>
+            <w:tcW w:w="3163" w:type="dxa"/>
             <w:tcBorders>
               <w:top w:val="single" w:sz="1" w:space="0" w:color="CCCCCC"/>
               <w:left w:val="single" w:sz="1" w:space="0" w:color="CCCCCC"/>
@@ -2490,29 +2483,28 @@
         </w:tc>
       </w:tr>
       <w:tr>
-        <w:tblPrEx>
-          <w:tblCellMar>
-            <w:top w:w="0" w:type="dxa"/>
-            <w:bottom w:w="0" w:type="dxa"/>
-          </w:tblCellMar>
-        </w:tblPrEx>
-        <w:tc>
-          <w:tcPr>
-            <w:tcW w:w="3200" w:type="dxa"/>
-            <w:tcBorders>
-              <w:top w:val="single" w:sz="1" w:space="0" w:color="CCCCCC"/>
-              <w:left w:val="single" w:sz="1" w:space="0" w:color="CCCCCC"/>
-              <w:bottom w:val="single" w:sz="1" w:space="0" w:color="CCCCCC"/>
-              <w:right w:val="single" w:sz="1" w:space="0" w:color="CCCCCC"/>
-            </w:tcBorders>
-            <w:tcMar>
-              <w:top w:w="80" w:type="dxa"/>
-              <w:left w:w="120" w:type="dxa"/>
-              <w:bottom w:w="80" w:type="dxa"/>
-              <w:right w:w="120" w:type="dxa"/>
-            </w:tcMar>
-          </w:tcPr>
-          <w:p>
+        <w:trPr>
+          <w:trHeight w:val="687"/>
+        </w:trPr>
+        <w:tc>
+          <w:tcPr>
+            <w:tcW w:w="3667" w:type="dxa"/>
+            <w:tcBorders>
+              <w:top w:val="single" w:sz="1" w:space="0" w:color="CCCCCC"/>
+              <w:left w:val="single" w:sz="1" w:space="0" w:color="CCCCCC"/>
+              <w:bottom w:val="single" w:sz="1" w:space="0" w:color="CCCCCC"/>
+              <w:right w:val="single" w:sz="1" w:space="0" w:color="CCCCCC"/>
+            </w:tcBorders>
+            <w:tcMar>
+              <w:top w:w="80" w:type="dxa"/>
+              <w:left w:w="120" w:type="dxa"/>
+              <w:bottom w:w="80" w:type="dxa"/>
+              <w:right w:w="120" w:type="dxa"/>
+            </w:tcMar>
+          </w:tcPr>
+          <w:p>
+            <w:commentRangeStart w:id="10"/>
+            <w:commentRangeStart w:id="11"/>
             <w:r>
               <w:rPr>
                 <w:rFonts w:ascii="Arial" w:hAnsi="Arial"/>
@@ -2526,7 +2518,7 @@
         </w:tc>
         <w:tc>
           <w:tcPr>
-            <w:tcW w:w="3400" w:type="dxa"/>
+            <w:tcW w:w="3896" w:type="dxa"/>
             <w:tcBorders>
               <w:top w:val="single" w:sz="1" w:space="0" w:color="CCCCCC"/>
               <w:left w:val="single" w:sz="1" w:space="0" w:color="CCCCCC"/>
@@ -2552,37 +2544,46 @@
         </w:tc>
         <w:tc>
           <w:tcPr>
-            <w:tcW w:w="2760" w:type="dxa"/>
-            <w:tcBorders>
-              <w:top w:val="single" w:sz="1" w:space="0" w:color="CCCCCC"/>
-              <w:left w:val="single" w:sz="1" w:space="0" w:color="CCCCCC"/>
-              <w:bottom w:val="single" w:sz="1" w:space="0" w:color="CCCCCC"/>
-              <w:right w:val="single" w:sz="1" w:space="0" w:color="CCCCCC"/>
-            </w:tcBorders>
-            <w:tcMar>
-              <w:top w:w="80" w:type="dxa"/>
-              <w:left w:w="120" w:type="dxa"/>
-              <w:bottom w:w="80" w:type="dxa"/>
-              <w:right w:w="120" w:type="dxa"/>
-            </w:tcMar>
-          </w:tcPr>
-          <w:p>
-            <w:r>
-              <w:rPr>
-                <w:rFonts w:ascii="Arial" w:hAnsi="Arial"/>
-                <w:szCs w:val="20"/>
-              </w:rPr>
-              <w:t xml:space="preserve">Nathan Miles + </w:t>
-            </w:r>
-            <w:proofErr w:type="spellStart"/>
-            <w:r>
-              <w:rPr>
-                <w:rFonts w:ascii="Arial" w:hAnsi="Arial"/>
-                <w:szCs w:val="20"/>
-              </w:rPr>
-              <w:t>Phanindher</w:t>
-            </w:r>
-            <w:proofErr w:type="spellEnd"/>
+            <w:tcW w:w="3163" w:type="dxa"/>
+            <w:tcBorders>
+              <w:top w:val="single" w:sz="1" w:space="0" w:color="CCCCCC"/>
+              <w:left w:val="single" w:sz="1" w:space="0" w:color="CCCCCC"/>
+              <w:bottom w:val="single" w:sz="1" w:space="0" w:color="CCCCCC"/>
+              <w:right w:val="single" w:sz="1" w:space="0" w:color="CCCCCC"/>
+            </w:tcBorders>
+            <w:tcMar>
+              <w:top w:w="80" w:type="dxa"/>
+              <w:left w:w="120" w:type="dxa"/>
+              <w:bottom w:w="80" w:type="dxa"/>
+              <w:right w:w="120" w:type="dxa"/>
+            </w:tcMar>
+          </w:tcPr>
+          <w:p>
+            <w:r>
+              <w:rPr>
+                <w:rFonts w:ascii="Arial" w:hAnsi="Arial"/>
+                <w:szCs w:val="20"/>
+              </w:rPr>
+              <w:t>Nathan Miles + Phanindher</w:t>
+            </w:r>
+            <w:commentRangeEnd w:id="10"/>
+            <w:r>
+              <w:rPr>
+                <w:rStyle w:val="CommentReference"/>
+                <w:sz w:val="20"/>
+                <w:szCs w:val="22"/>
+              </w:rPr>
+              <w:commentReference w:id="10"/>
+            </w:r>
+            <w:commentRangeEnd w:id="11"/>
+            <w:r>
+              <w:rPr>
+                <w:rStyle w:val="CommentReference"/>
+                <w:sz w:val="20"/>
+                <w:szCs w:val="22"/>
+              </w:rPr>
+              <w:commentReference w:id="11"/>
+            </w:r>
           </w:p>
         </w:tc>
       </w:tr>
@@ -2631,23 +2632,32 @@
           <w:rFonts w:ascii="Arial" w:hAnsi="Arial"/>
           <w:sz w:val="22"/>
         </w:rPr>
-        <w:t xml:space="preserve">CPH engineering capacity. If VC Phase 1 (Chargebacks) remains stalled and CPH capacity is not otherwise committed, the argument for directing that capacity to CPFR scoping and early build strengthens significantly. If VC </w:t>
-      </w:r>
-      <w:proofErr w:type="spellStart"/>
-      <w:r>
-        <w:rPr>
-          <w:rFonts w:ascii="Arial" w:hAnsi="Arial"/>
-          <w:sz w:val="22"/>
-        </w:rPr>
-        <w:t>unstalls</w:t>
-      </w:r>
-      <w:proofErr w:type="spellEnd"/>
-      <w:r>
-        <w:rPr>
-          <w:rFonts w:ascii="Arial" w:hAnsi="Arial"/>
-          <w:sz w:val="22"/>
-        </w:rPr>
-        <w:t xml:space="preserve"> and consumes CPH capacity, Phase 1 timelines extend proportionally. This is the sequencing decision that leadership must resolve (see Section 4).</w:t>
+        <w:t>CPH engineering capacity. If VC Phase 1 (Chargebacks) remains stalled and CPH capacity is not otherwise committed, the argument for directing that capacity to CPFR scoping and early build strengthens significantly. If VC un</w:t>
+      </w:r>
+      <w:r>
+        <w:rPr>
+          <w:rFonts w:ascii="Arial" w:hAnsi="Arial"/>
+          <w:sz w:val="22"/>
+        </w:rPr>
+        <w:t>-</w:t>
+      </w:r>
+      <w:r>
+        <w:rPr>
+          <w:rFonts w:ascii="Arial" w:hAnsi="Arial"/>
+          <w:sz w:val="22"/>
+        </w:rPr>
+        <w:t>stalls and consumes CPH capacity, Phase 1 timelines extend proportionally. This is the sequencing decision that leadership must resolve (see Section 4).</w:t>
+      </w:r>
+      <w:r>
+        <w:br w:type="page"/>
+      </w:r>
+    </w:p>
+    <w:p>
+      <w:pPr>
+        <w:pStyle w:val="Heading2"/>
+      </w:pPr>
+      <w:r>
+        <w:t>Phase 2: General Availability &amp; Scale (September 2026–January 2027)</w:t>
       </w:r>
     </w:p>
     <w:p>
@@ -2661,28 +2671,14 @@
           <w:bCs/>
           <w:sz w:val="22"/>
         </w:rPr>
-        <w:t xml:space="preserve">Persona note: </w:t>
-      </w:r>
-      <w:r>
-        <w:rPr>
-          <w:rFonts w:ascii="Arial" w:hAnsi="Arial"/>
-          <w:sz w:val="22"/>
-        </w:rPr>
-        <w:t>This phase is where the Realist Gatekeeper’s test is met or failed. Tom Burritt needs to see concrete deliverables by the OP1 cycle—a working beta, even limited, transforms the OP1 submission from aspirational to demonstrable. The Allied Commander (Nathan Nelson) should be co-presenting VC progress alongside CPFR progress to maintain the unified front.</w:t>
-      </w:r>
-    </w:p>
-    <w:p>
-      <w:r>
-        <w:br w:type="page"/>
-      </w:r>
-    </w:p>
-    <w:p>
-      <w:pPr>
-        <w:pStyle w:val="Heading2"/>
-      </w:pPr>
-      <w:r>
-        <w:lastRenderedPageBreak/>
-        <w:t>Phase 2: General Availability &amp; Scale (September 2026–January 2027)</w:t>
+        <w:t xml:space="preserve">Funding model: </w:t>
+      </w:r>
+      <w:r>
+        <w:rPr>
+          <w:rFonts w:ascii="Arial" w:hAnsi="Arial"/>
+          <w:sz w:val="22"/>
+        </w:rPr>
+        <w:t>OP1 2027 funded (target). Fallback: continued allocation with extended timeline.</w:t>
       </w:r>
     </w:p>
     <w:p>
@@ -2696,27 +2692,6 @@
           <w:bCs/>
           <w:sz w:val="22"/>
         </w:rPr>
-        <w:t xml:space="preserve">Funding model: </w:t>
-      </w:r>
-      <w:r>
-        <w:rPr>
-          <w:rFonts w:ascii="Arial" w:hAnsi="Arial"/>
-          <w:sz w:val="22"/>
-        </w:rPr>
-        <w:t>OP1 2027 funded (target). Fallback: continued allocation with extended timeline.</w:t>
-      </w:r>
-    </w:p>
-    <w:p>
-      <w:pPr>
-        <w:spacing w:after="160"/>
-      </w:pPr>
-      <w:r>
-        <w:rPr>
-          <w:rFonts w:ascii="Arial" w:hAnsi="Arial"/>
-          <w:b/>
-          <w:bCs/>
-          <w:sz w:val="22"/>
-        </w:rPr>
         <w:t xml:space="preserve">Objective: </w:t>
       </w:r>
       <w:r>
@@ -2734,7 +2709,7 @@
     </w:p>
     <w:tbl>
       <w:tblPr>
-        <w:tblW w:w="9360" w:type="dxa"/>
+        <w:tblW w:w="10826" w:type="dxa"/>
         <w:tblBorders>
           <w:top w:val="single" w:sz="4" w:space="0" w:color="auto"/>
           <w:left w:val="single" w:sz="4" w:space="0" w:color="auto"/>
@@ -2750,20 +2725,17 @@
         <w:tblLook w:val="0000" w:firstRow="0" w:lastRow="0" w:firstColumn="0" w:lastColumn="0" w:noHBand="0" w:noVBand="0"/>
       </w:tblPr>
       <w:tblGrid>
-        <w:gridCol w:w="3200"/>
-        <w:gridCol w:w="3400"/>
-        <w:gridCol w:w="2760"/>
+        <w:gridCol w:w="3701"/>
+        <w:gridCol w:w="3933"/>
+        <w:gridCol w:w="3192"/>
       </w:tblGrid>
       <w:tr>
-        <w:tblPrEx>
-          <w:tblCellMar>
-            <w:top w:w="0" w:type="dxa"/>
-            <w:bottom w:w="0" w:type="dxa"/>
-          </w:tblCellMar>
-        </w:tblPrEx>
-        <w:tc>
-          <w:tcPr>
-            <w:tcW w:w="3200" w:type="dxa"/>
+        <w:trPr>
+          <w:trHeight w:val="213"/>
+        </w:trPr>
+        <w:tc>
+          <w:tcPr>
+            <w:tcW w:w="3701" w:type="dxa"/>
             <w:tcBorders>
               <w:top w:val="single" w:sz="1" w:space="0" w:color="CCCCCC"/>
               <w:left w:val="single" w:sz="1" w:space="0" w:color="CCCCCC"/>
@@ -2793,7 +2765,7 @@
         </w:tc>
         <w:tc>
           <w:tcPr>
-            <w:tcW w:w="3400" w:type="dxa"/>
+            <w:tcW w:w="3933" w:type="dxa"/>
             <w:tcBorders>
               <w:top w:val="single" w:sz="1" w:space="0" w:color="CCCCCC"/>
               <w:left w:val="single" w:sz="1" w:space="0" w:color="CCCCCC"/>
@@ -2823,7 +2795,7 @@
         </w:tc>
         <w:tc>
           <w:tcPr>
-            <w:tcW w:w="2760" w:type="dxa"/>
+            <w:tcW w:w="3192" w:type="dxa"/>
             <w:tcBorders>
               <w:top w:val="single" w:sz="1" w:space="0" w:color="CCCCCC"/>
               <w:left w:val="single" w:sz="1" w:space="0" w:color="CCCCCC"/>
@@ -2853,15 +2825,12 @@
         </w:tc>
       </w:tr>
       <w:tr>
-        <w:tblPrEx>
-          <w:tblCellMar>
-            <w:top w:w="0" w:type="dxa"/>
-            <w:bottom w:w="0" w:type="dxa"/>
-          </w:tblCellMar>
-        </w:tblPrEx>
-        <w:tc>
-          <w:tcPr>
-            <w:tcW w:w="3200" w:type="dxa"/>
+        <w:trPr>
+          <w:trHeight w:val="454"/>
+        </w:trPr>
+        <w:tc>
+          <w:tcPr>
+            <w:tcW w:w="3701" w:type="dxa"/>
             <w:tcBorders>
               <w:top w:val="single" w:sz="1" w:space="0" w:color="CCCCCC"/>
               <w:left w:val="single" w:sz="1" w:space="0" w:color="CCCCCC"/>
@@ -2887,7 +2856,7 @@
         </w:tc>
         <w:tc>
           <w:tcPr>
-            <w:tcW w:w="3400" w:type="dxa"/>
+            <w:tcW w:w="3933" w:type="dxa"/>
             <w:tcBorders>
               <w:top w:val="single" w:sz="1" w:space="0" w:color="CCCCCC"/>
               <w:left w:val="single" w:sz="1" w:space="0" w:color="CCCCCC"/>
@@ -2913,7 +2882,7 @@
         </w:tc>
         <w:tc>
           <w:tcPr>
-            <w:tcW w:w="2760" w:type="dxa"/>
+            <w:tcW w:w="3192" w:type="dxa"/>
             <w:tcBorders>
               <w:top w:val="single" w:sz="1" w:space="0" w:color="CCCCCC"/>
               <w:left w:val="single" w:sz="1" w:space="0" w:color="CCCCCC"/>
@@ -2939,15 +2908,12 @@
         </w:tc>
       </w:tr>
       <w:tr>
-        <w:tblPrEx>
-          <w:tblCellMar>
-            <w:top w:w="0" w:type="dxa"/>
-            <w:bottom w:w="0" w:type="dxa"/>
-          </w:tblCellMar>
-        </w:tblPrEx>
-        <w:tc>
-          <w:tcPr>
-            <w:tcW w:w="3200" w:type="dxa"/>
+        <w:trPr>
+          <w:trHeight w:val="681"/>
+        </w:trPr>
+        <w:tc>
+          <w:tcPr>
+            <w:tcW w:w="3701" w:type="dxa"/>
             <w:tcBorders>
               <w:top w:val="single" w:sz="1" w:space="0" w:color="CCCCCC"/>
               <w:left w:val="single" w:sz="1" w:space="0" w:color="CCCCCC"/>
@@ -2973,7 +2939,7 @@
         </w:tc>
         <w:tc>
           <w:tcPr>
-            <w:tcW w:w="3400" w:type="dxa"/>
+            <w:tcW w:w="3933" w:type="dxa"/>
             <w:tcBorders>
               <w:top w:val="single" w:sz="1" w:space="0" w:color="CCCCCC"/>
               <w:left w:val="single" w:sz="1" w:space="0" w:color="CCCCCC"/>
@@ -2999,7 +2965,7 @@
         </w:tc>
         <w:tc>
           <w:tcPr>
-            <w:tcW w:w="2760" w:type="dxa"/>
+            <w:tcW w:w="3192" w:type="dxa"/>
             <w:tcBorders>
               <w:top w:val="single" w:sz="1" w:space="0" w:color="CCCCCC"/>
               <w:left w:val="single" w:sz="1" w:space="0" w:color="CCCCCC"/>
@@ -3025,15 +2991,12 @@
         </w:tc>
       </w:tr>
       <w:tr>
-        <w:tblPrEx>
-          <w:tblCellMar>
-            <w:top w:w="0" w:type="dxa"/>
-            <w:bottom w:w="0" w:type="dxa"/>
-          </w:tblCellMar>
-        </w:tblPrEx>
-        <w:tc>
-          <w:tcPr>
-            <w:tcW w:w="3200" w:type="dxa"/>
+        <w:trPr>
+          <w:trHeight w:val="440"/>
+        </w:trPr>
+        <w:tc>
+          <w:tcPr>
+            <w:tcW w:w="3701" w:type="dxa"/>
             <w:tcBorders>
               <w:top w:val="single" w:sz="1" w:space="0" w:color="CCCCCC"/>
               <w:left w:val="single" w:sz="1" w:space="0" w:color="CCCCCC"/>
@@ -3059,7 +3022,7 @@
         </w:tc>
         <w:tc>
           <w:tcPr>
-            <w:tcW w:w="3400" w:type="dxa"/>
+            <w:tcW w:w="3933" w:type="dxa"/>
             <w:tcBorders>
               <w:top w:val="single" w:sz="1" w:space="0" w:color="CCCCCC"/>
               <w:left w:val="single" w:sz="1" w:space="0" w:color="CCCCCC"/>
@@ -3085,7 +3048,7 @@
         </w:tc>
         <w:tc>
           <w:tcPr>
-            <w:tcW w:w="2760" w:type="dxa"/>
+            <w:tcW w:w="3192" w:type="dxa"/>
             <w:tcBorders>
               <w:top w:val="single" w:sz="1" w:space="0" w:color="CCCCCC"/>
               <w:left w:val="single" w:sz="1" w:space="0" w:color="CCCCCC"/>
@@ -3111,15 +3074,12 @@
         </w:tc>
       </w:tr>
       <w:tr>
-        <w:tblPrEx>
-          <w:tblCellMar>
-            <w:top w:w="0" w:type="dxa"/>
-            <w:bottom w:w="0" w:type="dxa"/>
-          </w:tblCellMar>
-        </w:tblPrEx>
-        <w:tc>
-          <w:tcPr>
-            <w:tcW w:w="3200" w:type="dxa"/>
+        <w:trPr>
+          <w:trHeight w:val="681"/>
+        </w:trPr>
+        <w:tc>
+          <w:tcPr>
+            <w:tcW w:w="3701" w:type="dxa"/>
             <w:tcBorders>
               <w:top w:val="single" w:sz="1" w:space="0" w:color="CCCCCC"/>
               <w:left w:val="single" w:sz="1" w:space="0" w:color="CCCCCC"/>
@@ -3145,7 +3105,7 @@
         </w:tc>
         <w:tc>
           <w:tcPr>
-            <w:tcW w:w="3400" w:type="dxa"/>
+            <w:tcW w:w="3933" w:type="dxa"/>
             <w:tcBorders>
               <w:top w:val="single" w:sz="1" w:space="0" w:color="CCCCCC"/>
               <w:left w:val="single" w:sz="1" w:space="0" w:color="CCCCCC"/>
@@ -3171,7 +3131,7 @@
         </w:tc>
         <w:tc>
           <w:tcPr>
-            <w:tcW w:w="2760" w:type="dxa"/>
+            <w:tcW w:w="3192" w:type="dxa"/>
             <w:tcBorders>
               <w:top w:val="single" w:sz="1" w:space="0" w:color="CCCCCC"/>
               <w:left w:val="single" w:sz="1" w:space="0" w:color="CCCCCC"/>
@@ -3197,15 +3157,12 @@
         </w:tc>
       </w:tr>
       <w:tr>
-        <w:tblPrEx>
-          <w:tblCellMar>
-            <w:top w:w="0" w:type="dxa"/>
-            <w:bottom w:w="0" w:type="dxa"/>
-          </w:tblCellMar>
-        </w:tblPrEx>
-        <w:tc>
-          <w:tcPr>
-            <w:tcW w:w="3200" w:type="dxa"/>
+        <w:trPr>
+          <w:trHeight w:val="454"/>
+        </w:trPr>
+        <w:tc>
+          <w:tcPr>
+            <w:tcW w:w="3701" w:type="dxa"/>
             <w:tcBorders>
               <w:top w:val="single" w:sz="1" w:space="0" w:color="CCCCCC"/>
               <w:left w:val="single" w:sz="1" w:space="0" w:color="CCCCCC"/>
@@ -3231,7 +3188,7 @@
         </w:tc>
         <w:tc>
           <w:tcPr>
-            <w:tcW w:w="3400" w:type="dxa"/>
+            <w:tcW w:w="3933" w:type="dxa"/>
             <w:tcBorders>
               <w:top w:val="single" w:sz="1" w:space="0" w:color="CCCCCC"/>
               <w:left w:val="single" w:sz="1" w:space="0" w:color="CCCCCC"/>
@@ -3257,7 +3214,7 @@
         </w:tc>
         <w:tc>
           <w:tcPr>
-            <w:tcW w:w="2760" w:type="dxa"/>
+            <w:tcW w:w="3192" w:type="dxa"/>
             <w:tcBorders>
               <w:top w:val="single" w:sz="1" w:space="0" w:color="CCCCCC"/>
               <w:left w:val="single" w:sz="1" w:space="0" w:color="CCCCCC"/>
@@ -3283,15 +3240,12 @@
         </w:tc>
       </w:tr>
       <w:tr>
-        <w:tblPrEx>
-          <w:tblCellMar>
-            <w:top w:w="0" w:type="dxa"/>
-            <w:bottom w:w="0" w:type="dxa"/>
-          </w:tblCellMar>
-        </w:tblPrEx>
-        <w:tc>
-          <w:tcPr>
-            <w:tcW w:w="3200" w:type="dxa"/>
+        <w:trPr>
+          <w:trHeight w:val="454"/>
+        </w:trPr>
+        <w:tc>
+          <w:tcPr>
+            <w:tcW w:w="3701" w:type="dxa"/>
             <w:tcBorders>
               <w:top w:val="single" w:sz="1" w:space="0" w:color="CCCCCC"/>
               <w:left w:val="single" w:sz="1" w:space="0" w:color="CCCCCC"/>
@@ -3317,7 +3271,7 @@
         </w:tc>
         <w:tc>
           <w:tcPr>
-            <w:tcW w:w="3400" w:type="dxa"/>
+            <w:tcW w:w="3933" w:type="dxa"/>
             <w:tcBorders>
               <w:top w:val="single" w:sz="1" w:space="0" w:color="CCCCCC"/>
               <w:left w:val="single" w:sz="1" w:space="0" w:color="CCCCCC"/>
@@ -3343,7 +3297,7 @@
         </w:tc>
         <w:tc>
           <w:tcPr>
-            <w:tcW w:w="2760" w:type="dxa"/>
+            <w:tcW w:w="3192" w:type="dxa"/>
             <w:tcBorders>
               <w:top w:val="single" w:sz="1" w:space="0" w:color="CCCCCC"/>
               <w:left w:val="single" w:sz="1" w:space="0" w:color="CCCCCC"/>
@@ -3415,7 +3369,6 @@
         <w:pStyle w:val="Heading2"/>
       </w:pPr>
       <w:r>
-        <w:lastRenderedPageBreak/>
         <w:t>Phase 3: Tier 1 Enablement &amp; Platform Maturation (Q1–Q2 2027)</w:t>
       </w:r>
     </w:p>
@@ -3468,7 +3421,7 @@
     </w:p>
     <w:tbl>
       <w:tblPr>
-        <w:tblW w:w="9360" w:type="dxa"/>
+        <w:tblW w:w="10826" w:type="dxa"/>
         <w:tblBorders>
           <w:top w:val="single" w:sz="4" w:space="0" w:color="auto"/>
           <w:left w:val="single" w:sz="4" w:space="0" w:color="auto"/>
@@ -3484,20 +3437,17 @@
         <w:tblLook w:val="0000" w:firstRow="0" w:lastRow="0" w:firstColumn="0" w:lastColumn="0" w:noHBand="0" w:noVBand="0"/>
       </w:tblPr>
       <w:tblGrid>
-        <w:gridCol w:w="3200"/>
-        <w:gridCol w:w="3400"/>
-        <w:gridCol w:w="2760"/>
+        <w:gridCol w:w="3701"/>
+        <w:gridCol w:w="3933"/>
+        <w:gridCol w:w="3192"/>
       </w:tblGrid>
       <w:tr>
-        <w:tblPrEx>
-          <w:tblCellMar>
-            <w:top w:w="0" w:type="dxa"/>
-            <w:bottom w:w="0" w:type="dxa"/>
-          </w:tblCellMar>
-        </w:tblPrEx>
-        <w:tc>
-          <w:tcPr>
-            <w:tcW w:w="3200" w:type="dxa"/>
+        <w:trPr>
+          <w:trHeight w:val="213"/>
+        </w:trPr>
+        <w:tc>
+          <w:tcPr>
+            <w:tcW w:w="3701" w:type="dxa"/>
             <w:tcBorders>
               <w:top w:val="single" w:sz="1" w:space="0" w:color="CCCCCC"/>
               <w:left w:val="single" w:sz="1" w:space="0" w:color="CCCCCC"/>
@@ -3527,7 +3477,7 @@
         </w:tc>
         <w:tc>
           <w:tcPr>
-            <w:tcW w:w="3400" w:type="dxa"/>
+            <w:tcW w:w="3933" w:type="dxa"/>
             <w:tcBorders>
               <w:top w:val="single" w:sz="1" w:space="0" w:color="CCCCCC"/>
               <w:left w:val="single" w:sz="1" w:space="0" w:color="CCCCCC"/>
@@ -3557,7 +3507,7 @@
         </w:tc>
         <w:tc>
           <w:tcPr>
-            <w:tcW w:w="2760" w:type="dxa"/>
+            <w:tcW w:w="3192" w:type="dxa"/>
             <w:tcBorders>
               <w:top w:val="single" w:sz="1" w:space="0" w:color="CCCCCC"/>
               <w:left w:val="single" w:sz="1" w:space="0" w:color="CCCCCC"/>
@@ -3587,15 +3537,12 @@
         </w:tc>
       </w:tr>
       <w:tr>
-        <w:tblPrEx>
-          <w:tblCellMar>
-            <w:top w:w="0" w:type="dxa"/>
-            <w:bottom w:w="0" w:type="dxa"/>
-          </w:tblCellMar>
-        </w:tblPrEx>
-        <w:tc>
-          <w:tcPr>
-            <w:tcW w:w="3200" w:type="dxa"/>
+        <w:trPr>
+          <w:trHeight w:val="453"/>
+        </w:trPr>
+        <w:tc>
+          <w:tcPr>
+            <w:tcW w:w="3701" w:type="dxa"/>
             <w:tcBorders>
               <w:top w:val="single" w:sz="1" w:space="0" w:color="CCCCCC"/>
               <w:left w:val="single" w:sz="1" w:space="0" w:color="CCCCCC"/>
@@ -3621,7 +3568,7 @@
         </w:tc>
         <w:tc>
           <w:tcPr>
-            <w:tcW w:w="3400" w:type="dxa"/>
+            <w:tcW w:w="3933" w:type="dxa"/>
             <w:tcBorders>
               <w:top w:val="single" w:sz="1" w:space="0" w:color="CCCCCC"/>
               <w:left w:val="single" w:sz="1" w:space="0" w:color="CCCCCC"/>
@@ -3647,7 +3594,7 @@
         </w:tc>
         <w:tc>
           <w:tcPr>
-            <w:tcW w:w="2760" w:type="dxa"/>
+            <w:tcW w:w="3192" w:type="dxa"/>
             <w:tcBorders>
               <w:top w:val="single" w:sz="1" w:space="0" w:color="CCCCCC"/>
               <w:left w:val="single" w:sz="1" w:space="0" w:color="CCCCCC"/>
@@ -3673,15 +3620,12 @@
         </w:tc>
       </w:tr>
       <w:tr>
-        <w:tblPrEx>
-          <w:tblCellMar>
-            <w:top w:w="0" w:type="dxa"/>
-            <w:bottom w:w="0" w:type="dxa"/>
-          </w:tblCellMar>
-        </w:tblPrEx>
-        <w:tc>
-          <w:tcPr>
-            <w:tcW w:w="3200" w:type="dxa"/>
+        <w:trPr>
+          <w:trHeight w:val="680"/>
+        </w:trPr>
+        <w:tc>
+          <w:tcPr>
+            <w:tcW w:w="3701" w:type="dxa"/>
             <w:tcBorders>
               <w:top w:val="single" w:sz="1" w:space="0" w:color="CCCCCC"/>
               <w:left w:val="single" w:sz="1" w:space="0" w:color="CCCCCC"/>
@@ -3707,7 +3651,7 @@
         </w:tc>
         <w:tc>
           <w:tcPr>
-            <w:tcW w:w="3400" w:type="dxa"/>
+            <w:tcW w:w="3933" w:type="dxa"/>
             <w:tcBorders>
               <w:top w:val="single" w:sz="1" w:space="0" w:color="CCCCCC"/>
               <w:left w:val="single" w:sz="1" w:space="0" w:color="CCCCCC"/>
@@ -3733,7 +3677,7 @@
         </w:tc>
         <w:tc>
           <w:tcPr>
-            <w:tcW w:w="2760" w:type="dxa"/>
+            <w:tcW w:w="3192" w:type="dxa"/>
             <w:tcBorders>
               <w:top w:val="single" w:sz="1" w:space="0" w:color="CCCCCC"/>
               <w:left w:val="single" w:sz="1" w:space="0" w:color="CCCCCC"/>
@@ -3759,15 +3703,12 @@
         </w:tc>
       </w:tr>
       <w:tr>
-        <w:tblPrEx>
-          <w:tblCellMar>
-            <w:top w:w="0" w:type="dxa"/>
-            <w:bottom w:w="0" w:type="dxa"/>
-          </w:tblCellMar>
-        </w:tblPrEx>
-        <w:tc>
-          <w:tcPr>
-            <w:tcW w:w="3200" w:type="dxa"/>
+        <w:trPr>
+          <w:trHeight w:val="440"/>
+        </w:trPr>
+        <w:tc>
+          <w:tcPr>
+            <w:tcW w:w="3701" w:type="dxa"/>
             <w:tcBorders>
               <w:top w:val="single" w:sz="1" w:space="0" w:color="CCCCCC"/>
               <w:left w:val="single" w:sz="1" w:space="0" w:color="CCCCCC"/>
@@ -3793,7 +3734,7 @@
         </w:tc>
         <w:tc>
           <w:tcPr>
-            <w:tcW w:w="3400" w:type="dxa"/>
+            <w:tcW w:w="3933" w:type="dxa"/>
             <w:tcBorders>
               <w:top w:val="single" w:sz="1" w:space="0" w:color="CCCCCC"/>
               <w:left w:val="single" w:sz="1" w:space="0" w:color="CCCCCC"/>
@@ -3819,7 +3760,7 @@
         </w:tc>
         <w:tc>
           <w:tcPr>
-            <w:tcW w:w="2760" w:type="dxa"/>
+            <w:tcW w:w="3192" w:type="dxa"/>
             <w:tcBorders>
               <w:top w:val="single" w:sz="1" w:space="0" w:color="CCCCCC"/>
               <w:left w:val="single" w:sz="1" w:space="0" w:color="CCCCCC"/>
@@ -3845,15 +3786,12 @@
         </w:tc>
       </w:tr>
       <w:tr>
-        <w:tblPrEx>
-          <w:tblCellMar>
-            <w:top w:w="0" w:type="dxa"/>
-            <w:bottom w:w="0" w:type="dxa"/>
-          </w:tblCellMar>
-        </w:tblPrEx>
-        <w:tc>
-          <w:tcPr>
-            <w:tcW w:w="3200" w:type="dxa"/>
+        <w:trPr>
+          <w:trHeight w:val="680"/>
+        </w:trPr>
+        <w:tc>
+          <w:tcPr>
+            <w:tcW w:w="3701" w:type="dxa"/>
             <w:tcBorders>
               <w:top w:val="single" w:sz="1" w:space="0" w:color="CCCCCC"/>
               <w:left w:val="single" w:sz="1" w:space="0" w:color="CCCCCC"/>
@@ -3879,7 +3817,7 @@
         </w:tc>
         <w:tc>
           <w:tcPr>
-            <w:tcW w:w="3400" w:type="dxa"/>
+            <w:tcW w:w="3933" w:type="dxa"/>
             <w:tcBorders>
               <w:top w:val="single" w:sz="1" w:space="0" w:color="CCCCCC"/>
               <w:left w:val="single" w:sz="1" w:space="0" w:color="CCCCCC"/>
@@ -3905,7 +3843,7 @@
         </w:tc>
         <w:tc>
           <w:tcPr>
-            <w:tcW w:w="2760" w:type="dxa"/>
+            <w:tcW w:w="3192" w:type="dxa"/>
             <w:tcBorders>
               <w:top w:val="single" w:sz="1" w:space="0" w:color="CCCCCC"/>
               <w:left w:val="single" w:sz="1" w:space="0" w:color="CCCCCC"/>
@@ -3984,7 +3922,7 @@
     </w:p>
     <w:tbl>
       <w:tblPr>
-        <w:tblW w:w="9360" w:type="dxa"/>
+        <w:tblW w:w="10839" w:type="dxa"/>
         <w:tblBorders>
           <w:top w:val="single" w:sz="4" w:space="0" w:color="auto"/>
           <w:left w:val="single" w:sz="4" w:space="0" w:color="auto"/>
@@ -4000,21 +3938,18 @@
         <w:tblLook w:val="0000" w:firstRow="0" w:lastRow="0" w:firstColumn="0" w:lastColumn="0" w:noHBand="0" w:noVBand="0"/>
       </w:tblPr>
       <w:tblGrid>
-        <w:gridCol w:w="800"/>
-        <w:gridCol w:w="2400"/>
-        <w:gridCol w:w="3160"/>
-        <w:gridCol w:w="3000"/>
+        <w:gridCol w:w="926"/>
+        <w:gridCol w:w="2779"/>
+        <w:gridCol w:w="3660"/>
+        <w:gridCol w:w="3474"/>
       </w:tblGrid>
       <w:tr>
-        <w:tblPrEx>
-          <w:tblCellMar>
-            <w:top w:w="0" w:type="dxa"/>
-            <w:bottom w:w="0" w:type="dxa"/>
-          </w:tblCellMar>
-        </w:tblPrEx>
-        <w:tc>
-          <w:tcPr>
-            <w:tcW w:w="800" w:type="dxa"/>
+        <w:trPr>
+          <w:trHeight w:val="215"/>
+        </w:trPr>
+        <w:tc>
+          <w:tcPr>
+            <w:tcW w:w="926" w:type="dxa"/>
             <w:tcBorders>
               <w:top w:val="single" w:sz="1" w:space="0" w:color="CCCCCC"/>
               <w:left w:val="single" w:sz="1" w:space="0" w:color="CCCCCC"/>
@@ -4044,7 +3979,7 @@
         </w:tc>
         <w:tc>
           <w:tcPr>
-            <w:tcW w:w="2400" w:type="dxa"/>
+            <w:tcW w:w="2779" w:type="dxa"/>
             <w:tcBorders>
               <w:top w:val="single" w:sz="1" w:space="0" w:color="CCCCCC"/>
               <w:left w:val="single" w:sz="1" w:space="0" w:color="CCCCCC"/>
@@ -4074,7 +4009,7 @@
         </w:tc>
         <w:tc>
           <w:tcPr>
-            <w:tcW w:w="3160" w:type="dxa"/>
+            <w:tcW w:w="3660" w:type="dxa"/>
             <w:tcBorders>
               <w:top w:val="single" w:sz="1" w:space="0" w:color="CCCCCC"/>
               <w:left w:val="single" w:sz="1" w:space="0" w:color="CCCCCC"/>
@@ -4104,7 +4039,7 @@
         </w:tc>
         <w:tc>
           <w:tcPr>
-            <w:tcW w:w="3000" w:type="dxa"/>
+            <w:tcW w:w="3474" w:type="dxa"/>
             <w:tcBorders>
               <w:top w:val="single" w:sz="1" w:space="0" w:color="CCCCCC"/>
               <w:left w:val="single" w:sz="1" w:space="0" w:color="CCCCCC"/>
@@ -4134,15 +4069,12 @@
         </w:tc>
       </w:tr>
       <w:tr>
-        <w:tblPrEx>
-          <w:tblCellMar>
-            <w:top w:w="0" w:type="dxa"/>
-            <w:bottom w:w="0" w:type="dxa"/>
-          </w:tblCellMar>
-        </w:tblPrEx>
-        <w:tc>
-          <w:tcPr>
-            <w:tcW w:w="800" w:type="dxa"/>
+        <w:trPr>
+          <w:trHeight w:val="917"/>
+        </w:trPr>
+        <w:tc>
+          <w:tcPr>
+            <w:tcW w:w="926" w:type="dxa"/>
             <w:tcBorders>
               <w:top w:val="single" w:sz="1" w:space="0" w:color="CCCCCC"/>
               <w:left w:val="single" w:sz="1" w:space="0" w:color="CCCCCC"/>
@@ -4171,7 +4103,7 @@
         </w:tc>
         <w:tc>
           <w:tcPr>
-            <w:tcW w:w="2400" w:type="dxa"/>
+            <w:tcW w:w="2779" w:type="dxa"/>
             <w:tcBorders>
               <w:top w:val="single" w:sz="1" w:space="0" w:color="CCCCCC"/>
               <w:left w:val="single" w:sz="1" w:space="0" w:color="CCCCCC"/>
@@ -4199,7 +4131,7 @@
         </w:tc>
         <w:tc>
           <w:tcPr>
-            <w:tcW w:w="3160" w:type="dxa"/>
+            <w:tcW w:w="3660" w:type="dxa"/>
             <w:tcBorders>
               <w:top w:val="single" w:sz="1" w:space="0" w:color="CCCCCC"/>
               <w:left w:val="single" w:sz="1" w:space="0" w:color="CCCCCC"/>
@@ -4225,7 +4157,7 @@
         </w:tc>
         <w:tc>
           <w:tcPr>
-            <w:tcW w:w="3000" w:type="dxa"/>
+            <w:tcW w:w="3474" w:type="dxa"/>
             <w:tcBorders>
               <w:top w:val="single" w:sz="1" w:space="0" w:color="CCCCCC"/>
               <w:left w:val="single" w:sz="1" w:space="0" w:color="CCCCCC"/>
@@ -4251,15 +4183,12 @@
         </w:tc>
       </w:tr>
       <w:tr>
-        <w:tblPrEx>
-          <w:tblCellMar>
-            <w:top w:w="0" w:type="dxa"/>
-            <w:bottom w:w="0" w:type="dxa"/>
-          </w:tblCellMar>
-        </w:tblPrEx>
-        <w:tc>
-          <w:tcPr>
-            <w:tcW w:w="800" w:type="dxa"/>
+        <w:trPr>
+          <w:trHeight w:val="1391"/>
+        </w:trPr>
+        <w:tc>
+          <w:tcPr>
+            <w:tcW w:w="926" w:type="dxa"/>
             <w:tcBorders>
               <w:top w:val="single" w:sz="1" w:space="0" w:color="CCCCCC"/>
               <w:left w:val="single" w:sz="1" w:space="0" w:color="CCCCCC"/>
@@ -4288,7 +4217,7 @@
         </w:tc>
         <w:tc>
           <w:tcPr>
-            <w:tcW w:w="2400" w:type="dxa"/>
+            <w:tcW w:w="2779" w:type="dxa"/>
             <w:tcBorders>
               <w:top w:val="single" w:sz="1" w:space="0" w:color="CCCCCC"/>
               <w:left w:val="single" w:sz="1" w:space="0" w:color="CCCCCC"/>
@@ -4316,7 +4245,7 @@
         </w:tc>
         <w:tc>
           <w:tcPr>
-            <w:tcW w:w="3160" w:type="dxa"/>
+            <w:tcW w:w="3660" w:type="dxa"/>
             <w:tcBorders>
               <w:top w:val="single" w:sz="1" w:space="0" w:color="CCCCCC"/>
               <w:left w:val="single" w:sz="1" w:space="0" w:color="CCCCCC"/>
@@ -4342,7 +4271,7 @@
         </w:tc>
         <w:tc>
           <w:tcPr>
-            <w:tcW w:w="3000" w:type="dxa"/>
+            <w:tcW w:w="3474" w:type="dxa"/>
             <w:tcBorders>
               <w:top w:val="single" w:sz="1" w:space="0" w:color="CCCCCC"/>
               <w:left w:val="single" w:sz="1" w:space="0" w:color="CCCCCC"/>
@@ -4368,15 +4297,12 @@
         </w:tc>
       </w:tr>
       <w:tr>
-        <w:tblPrEx>
-          <w:tblCellMar>
-            <w:top w:w="0" w:type="dxa"/>
-            <w:bottom w:w="0" w:type="dxa"/>
-          </w:tblCellMar>
-        </w:tblPrEx>
-        <w:tc>
-          <w:tcPr>
-            <w:tcW w:w="800" w:type="dxa"/>
+        <w:trPr>
+          <w:trHeight w:val="1377"/>
+        </w:trPr>
+        <w:tc>
+          <w:tcPr>
+            <w:tcW w:w="926" w:type="dxa"/>
             <w:tcBorders>
               <w:top w:val="single" w:sz="1" w:space="0" w:color="CCCCCC"/>
               <w:left w:val="single" w:sz="1" w:space="0" w:color="CCCCCC"/>
@@ -4405,7 +4331,7 @@
         </w:tc>
         <w:tc>
           <w:tcPr>
-            <w:tcW w:w="2400" w:type="dxa"/>
+            <w:tcW w:w="2779" w:type="dxa"/>
             <w:tcBorders>
               <w:top w:val="single" w:sz="1" w:space="0" w:color="CCCCCC"/>
               <w:left w:val="single" w:sz="1" w:space="0" w:color="CCCCCC"/>
@@ -4433,7 +4359,7 @@
         </w:tc>
         <w:tc>
           <w:tcPr>
-            <w:tcW w:w="3160" w:type="dxa"/>
+            <w:tcW w:w="3660" w:type="dxa"/>
             <w:tcBorders>
               <w:top w:val="single" w:sz="1" w:space="0" w:color="CCCCCC"/>
               <w:left w:val="single" w:sz="1" w:space="0" w:color="CCCCCC"/>
@@ -4459,7 +4385,7 @@
         </w:tc>
         <w:tc>
           <w:tcPr>
-            <w:tcW w:w="3000" w:type="dxa"/>
+            <w:tcW w:w="3474" w:type="dxa"/>
             <w:tcBorders>
               <w:top w:val="single" w:sz="1" w:space="0" w:color="CCCCCC"/>
               <w:left w:val="single" w:sz="1" w:space="0" w:color="CCCCCC"/>
@@ -4510,7 +4436,6 @@
         <w:pStyle w:val="Heading2"/>
       </w:pPr>
       <w:r>
-        <w:lastRenderedPageBreak/>
         <w:t>3.1 Dependency Map</w:t>
       </w:r>
     </w:p>
@@ -4702,23 +4627,21 @@
           <w:rFonts w:ascii="Arial" w:hAnsi="Arial"/>
           <w:sz w:val="22"/>
         </w:rPr>
-        <w:t xml:space="preserve">If VC </w:t>
-      </w:r>
-      <w:proofErr w:type="spellStart"/>
-      <w:r>
-        <w:rPr>
-          <w:rFonts w:ascii="Arial" w:hAnsi="Arial"/>
-          <w:sz w:val="22"/>
-        </w:rPr>
-        <w:t>unstalls</w:t>
-      </w:r>
-      <w:proofErr w:type="spellEnd"/>
-      <w:r>
-        <w:rPr>
-          <w:rFonts w:ascii="Arial" w:hAnsi="Arial"/>
-          <w:sz w:val="22"/>
-        </w:rPr>
-        <w:t>, it legitimately consumes CPH capacity first, potentially pushing CPFR module work further out despite the platform being ready. However, CPH developers have not yet built muscle memory on the portal architecture through VC work, which was the original benefit of the sequencing.</w:t>
+        <w:t>If VC un</w:t>
+      </w:r>
+      <w:r>
+        <w:rPr>
+          <w:rFonts w:ascii="Arial" w:hAnsi="Arial"/>
+          <w:sz w:val="22"/>
+        </w:rPr>
+        <w:t>-</w:t>
+      </w:r>
+      <w:r>
+        <w:rPr>
+          <w:rFonts w:ascii="Arial" w:hAnsi="Arial"/>
+          <w:sz w:val="22"/>
+        </w:rPr>
+        <w:t>stalls, it legitimately consumes CPH capacity first, potentially pushing CPFR module work further out despite the platform being ready. However, CPH developers have not yet built muscle memory on the portal architecture through VC work, which was the original benefit of the sequencing.</w:t>
       </w:r>
     </w:p>
     <w:p>
@@ -4789,23 +4712,7 @@
           <w:rFonts w:ascii="Arial" w:hAnsi="Arial"/>
           <w:sz w:val="22"/>
         </w:rPr>
-        <w:t xml:space="preserve">If VC </w:t>
-      </w:r>
-      <w:proofErr w:type="spellStart"/>
-      <w:r>
-        <w:rPr>
-          <w:rFonts w:ascii="Arial" w:hAnsi="Arial"/>
-          <w:sz w:val="22"/>
-        </w:rPr>
-        <w:t>unstalls</w:t>
-      </w:r>
-      <w:proofErr w:type="spellEnd"/>
-      <w:r>
-        <w:rPr>
-          <w:rFonts w:ascii="Arial" w:hAnsi="Arial"/>
-          <w:sz w:val="22"/>
-        </w:rPr>
-        <w:t xml:space="preserve"> and consumes all CPH capacity through Q3, the CPFR Module MVP build slides to Q4 but the scoping work done in parallel means the build window compresses rather than extending.</w:t>
+        <w:t>If VC unstalls and consumes all CPH capacity through Q3, the CPFR Module MVP build slides to Q4 but the scoping work done in parallel means the build window compresses rather than extending.</w:t>
       </w:r>
     </w:p>
     <w:p>
@@ -4849,7 +4756,6 @@
         <w:pStyle w:val="Heading1"/>
       </w:pPr>
       <w:r>
-        <w:lastRenderedPageBreak/>
         <w:t>5. Resource Requirements</w:t>
       </w:r>
     </w:p>
@@ -4872,7 +4778,7 @@
     </w:p>
     <w:tbl>
       <w:tblPr>
-        <w:tblW w:w="9360" w:type="dxa"/>
+        <w:tblW w:w="10840" w:type="dxa"/>
         <w:tblBorders>
           <w:top w:val="single" w:sz="4" w:space="0" w:color="auto"/>
           <w:left w:val="single" w:sz="4" w:space="0" w:color="auto"/>
@@ -4888,22 +4794,19 @@
         <w:tblLook w:val="0000" w:firstRow="0" w:lastRow="0" w:firstColumn="0" w:lastColumn="0" w:noHBand="0" w:noVBand="0"/>
       </w:tblPr>
       <w:tblGrid>
-        <w:gridCol w:w="2200"/>
-        <w:gridCol w:w="1600"/>
-        <w:gridCol w:w="1600"/>
-        <w:gridCol w:w="1600"/>
-        <w:gridCol w:w="2360"/>
+        <w:gridCol w:w="2548"/>
+        <w:gridCol w:w="1853"/>
+        <w:gridCol w:w="1853"/>
+        <w:gridCol w:w="1853"/>
+        <w:gridCol w:w="2733"/>
       </w:tblGrid>
       <w:tr>
-        <w:tblPrEx>
-          <w:tblCellMar>
-            <w:top w:w="0" w:type="dxa"/>
-            <w:bottom w:w="0" w:type="dxa"/>
-          </w:tblCellMar>
-        </w:tblPrEx>
-        <w:tc>
-          <w:tcPr>
-            <w:tcW w:w="2200" w:type="dxa"/>
+        <w:trPr>
+          <w:trHeight w:val="214"/>
+        </w:trPr>
+        <w:tc>
+          <w:tcPr>
+            <w:tcW w:w="2548" w:type="dxa"/>
             <w:tcBorders>
               <w:top w:val="single" w:sz="1" w:space="0" w:color="CCCCCC"/>
               <w:left w:val="single" w:sz="1" w:space="0" w:color="CCCCCC"/>
@@ -4933,7 +4836,7 @@
         </w:tc>
         <w:tc>
           <w:tcPr>
-            <w:tcW w:w="1600" w:type="dxa"/>
+            <w:tcW w:w="1853" w:type="dxa"/>
             <w:tcBorders>
               <w:top w:val="single" w:sz="1" w:space="0" w:color="CCCCCC"/>
               <w:left w:val="single" w:sz="1" w:space="0" w:color="CCCCCC"/>
@@ -4963,7 +4866,7 @@
         </w:tc>
         <w:tc>
           <w:tcPr>
-            <w:tcW w:w="1600" w:type="dxa"/>
+            <w:tcW w:w="1853" w:type="dxa"/>
             <w:tcBorders>
               <w:top w:val="single" w:sz="1" w:space="0" w:color="CCCCCC"/>
               <w:left w:val="single" w:sz="1" w:space="0" w:color="CCCCCC"/>
@@ -4993,7 +4896,7 @@
         </w:tc>
         <w:tc>
           <w:tcPr>
-            <w:tcW w:w="1600" w:type="dxa"/>
+            <w:tcW w:w="1853" w:type="dxa"/>
             <w:tcBorders>
               <w:top w:val="single" w:sz="1" w:space="0" w:color="CCCCCC"/>
               <w:left w:val="single" w:sz="1" w:space="0" w:color="CCCCCC"/>
@@ -5023,7 +4926,7 @@
         </w:tc>
         <w:tc>
           <w:tcPr>
-            <w:tcW w:w="2360" w:type="dxa"/>
+            <w:tcW w:w="2733" w:type="dxa"/>
             <w:tcBorders>
               <w:top w:val="single" w:sz="1" w:space="0" w:color="CCCCCC"/>
               <w:left w:val="single" w:sz="1" w:space="0" w:color="CCCCCC"/>
@@ -5053,15 +4956,12 @@
         </w:tc>
       </w:tr>
       <w:tr>
-        <w:tblPrEx>
-          <w:tblCellMar>
-            <w:top w:w="0" w:type="dxa"/>
-            <w:bottom w:w="0" w:type="dxa"/>
-          </w:tblCellMar>
-        </w:tblPrEx>
-        <w:tc>
-          <w:tcPr>
-            <w:tcW w:w="2200" w:type="dxa"/>
+        <w:trPr>
+          <w:trHeight w:val="457"/>
+        </w:trPr>
+        <w:tc>
+          <w:tcPr>
+            <w:tcW w:w="2548" w:type="dxa"/>
             <w:tcBorders>
               <w:top w:val="single" w:sz="1" w:space="0" w:color="CCCCCC"/>
               <w:left w:val="single" w:sz="1" w:space="0" w:color="CCCCCC"/>
@@ -5087,7 +4987,7 @@
         </w:tc>
         <w:tc>
           <w:tcPr>
-            <w:tcW w:w="1600" w:type="dxa"/>
+            <w:tcW w:w="1853" w:type="dxa"/>
             <w:tcBorders>
               <w:top w:val="single" w:sz="1" w:space="0" w:color="CCCCCC"/>
               <w:left w:val="single" w:sz="1" w:space="0" w:color="CCCCCC"/>
@@ -5114,7 +5014,7 @@
         </w:tc>
         <w:tc>
           <w:tcPr>
-            <w:tcW w:w="1600" w:type="dxa"/>
+            <w:tcW w:w="1853" w:type="dxa"/>
             <w:tcBorders>
               <w:top w:val="single" w:sz="1" w:space="0" w:color="CCCCCC"/>
               <w:left w:val="single" w:sz="1" w:space="0" w:color="CCCCCC"/>
@@ -5141,7 +5041,7 @@
         </w:tc>
         <w:tc>
           <w:tcPr>
-            <w:tcW w:w="1600" w:type="dxa"/>
+            <w:tcW w:w="1853" w:type="dxa"/>
             <w:tcBorders>
               <w:top w:val="single" w:sz="1" w:space="0" w:color="CCCCCC"/>
               <w:left w:val="single" w:sz="1" w:space="0" w:color="CCCCCC"/>
@@ -5168,7 +5068,7 @@
         </w:tc>
         <w:tc>
           <w:tcPr>
-            <w:tcW w:w="2360" w:type="dxa"/>
+            <w:tcW w:w="2733" w:type="dxa"/>
             <w:tcBorders>
               <w:top w:val="single" w:sz="1" w:space="0" w:color="CCCCCC"/>
               <w:left w:val="single" w:sz="1" w:space="0" w:color="CCCCCC"/>
@@ -5194,15 +5094,12 @@
         </w:tc>
       </w:tr>
       <w:tr>
-        <w:tblPrEx>
-          <w:tblCellMar>
-            <w:top w:w="0" w:type="dxa"/>
-            <w:bottom w:w="0" w:type="dxa"/>
-          </w:tblCellMar>
-        </w:tblPrEx>
-        <w:tc>
-          <w:tcPr>
-            <w:tcW w:w="2200" w:type="dxa"/>
+        <w:trPr>
+          <w:trHeight w:val="457"/>
+        </w:trPr>
+        <w:tc>
+          <w:tcPr>
+            <w:tcW w:w="2548" w:type="dxa"/>
             <w:tcBorders>
               <w:top w:val="single" w:sz="1" w:space="0" w:color="CCCCCC"/>
               <w:left w:val="single" w:sz="1" w:space="0" w:color="CCCCCC"/>
@@ -5228,7 +5125,7 @@
         </w:tc>
         <w:tc>
           <w:tcPr>
-            <w:tcW w:w="1600" w:type="dxa"/>
+            <w:tcW w:w="1853" w:type="dxa"/>
             <w:tcBorders>
               <w:top w:val="single" w:sz="1" w:space="0" w:color="CCCCCC"/>
               <w:left w:val="single" w:sz="1" w:space="0" w:color="CCCCCC"/>
@@ -5255,7 +5152,7 @@
         </w:tc>
         <w:tc>
           <w:tcPr>
-            <w:tcW w:w="1600" w:type="dxa"/>
+            <w:tcW w:w="1853" w:type="dxa"/>
             <w:tcBorders>
               <w:top w:val="single" w:sz="1" w:space="0" w:color="CCCCCC"/>
               <w:left w:val="single" w:sz="1" w:space="0" w:color="CCCCCC"/>
@@ -5282,7 +5179,7 @@
         </w:tc>
         <w:tc>
           <w:tcPr>
-            <w:tcW w:w="1600" w:type="dxa"/>
+            <w:tcW w:w="1853" w:type="dxa"/>
             <w:tcBorders>
               <w:top w:val="single" w:sz="1" w:space="0" w:color="CCCCCC"/>
               <w:left w:val="single" w:sz="1" w:space="0" w:color="CCCCCC"/>
@@ -5309,7 +5206,7 @@
         </w:tc>
         <w:tc>
           <w:tcPr>
-            <w:tcW w:w="2360" w:type="dxa"/>
+            <w:tcW w:w="2733" w:type="dxa"/>
             <w:tcBorders>
               <w:top w:val="single" w:sz="1" w:space="0" w:color="CCCCCC"/>
               <w:left w:val="single" w:sz="1" w:space="0" w:color="CCCCCC"/>
@@ -5335,15 +5232,12 @@
         </w:tc>
       </w:tr>
       <w:tr>
-        <w:tblPrEx>
-          <w:tblCellMar>
-            <w:top w:w="0" w:type="dxa"/>
-            <w:bottom w:w="0" w:type="dxa"/>
-          </w:tblCellMar>
-        </w:tblPrEx>
-        <w:tc>
-          <w:tcPr>
-            <w:tcW w:w="2200" w:type="dxa"/>
+        <w:trPr>
+          <w:trHeight w:val="671"/>
+        </w:trPr>
+        <w:tc>
+          <w:tcPr>
+            <w:tcW w:w="2548" w:type="dxa"/>
             <w:tcBorders>
               <w:top w:val="single" w:sz="1" w:space="0" w:color="CCCCCC"/>
               <w:left w:val="single" w:sz="1" w:space="0" w:color="CCCCCC"/>
@@ -5369,7 +5263,7 @@
         </w:tc>
         <w:tc>
           <w:tcPr>
-            <w:tcW w:w="1600" w:type="dxa"/>
+            <w:tcW w:w="1853" w:type="dxa"/>
             <w:tcBorders>
               <w:top w:val="single" w:sz="1" w:space="0" w:color="CCCCCC"/>
               <w:left w:val="single" w:sz="1" w:space="0" w:color="CCCCCC"/>
@@ -5395,7 +5289,7 @@
         </w:tc>
         <w:tc>
           <w:tcPr>
-            <w:tcW w:w="1600" w:type="dxa"/>
+            <w:tcW w:w="1853" w:type="dxa"/>
             <w:tcBorders>
               <w:top w:val="single" w:sz="1" w:space="0" w:color="CCCCCC"/>
               <w:left w:val="single" w:sz="1" w:space="0" w:color="CCCCCC"/>
@@ -5422,7 +5316,7 @@
         </w:tc>
         <w:tc>
           <w:tcPr>
-            <w:tcW w:w="1600" w:type="dxa"/>
+            <w:tcW w:w="1853" w:type="dxa"/>
             <w:tcBorders>
               <w:top w:val="single" w:sz="1" w:space="0" w:color="CCCCCC"/>
               <w:left w:val="single" w:sz="1" w:space="0" w:color="CCCCCC"/>
@@ -5449,7 +5343,7 @@
         </w:tc>
         <w:tc>
           <w:tcPr>
-            <w:tcW w:w="2360" w:type="dxa"/>
+            <w:tcW w:w="2733" w:type="dxa"/>
             <w:tcBorders>
               <w:top w:val="single" w:sz="1" w:space="0" w:color="CCCCCC"/>
               <w:left w:val="single" w:sz="1" w:space="0" w:color="CCCCCC"/>
@@ -5475,15 +5369,12 @@
         </w:tc>
       </w:tr>
       <w:tr>
-        <w:tblPrEx>
-          <w:tblCellMar>
-            <w:top w:w="0" w:type="dxa"/>
-            <w:bottom w:w="0" w:type="dxa"/>
-          </w:tblCellMar>
-        </w:tblPrEx>
-        <w:tc>
-          <w:tcPr>
-            <w:tcW w:w="2200" w:type="dxa"/>
+        <w:trPr>
+          <w:trHeight w:val="457"/>
+        </w:trPr>
+        <w:tc>
+          <w:tcPr>
+            <w:tcW w:w="2548" w:type="dxa"/>
             <w:tcBorders>
               <w:top w:val="single" w:sz="1" w:space="0" w:color="CCCCCC"/>
               <w:left w:val="single" w:sz="1" w:space="0" w:color="CCCCCC"/>
@@ -5509,7 +5400,7 @@
         </w:tc>
         <w:tc>
           <w:tcPr>
-            <w:tcW w:w="1600" w:type="dxa"/>
+            <w:tcW w:w="1853" w:type="dxa"/>
             <w:tcBorders>
               <w:top w:val="single" w:sz="1" w:space="0" w:color="CCCCCC"/>
               <w:left w:val="single" w:sz="1" w:space="0" w:color="CCCCCC"/>
@@ -5536,7 +5427,7 @@
         </w:tc>
         <w:tc>
           <w:tcPr>
-            <w:tcW w:w="1600" w:type="dxa"/>
+            <w:tcW w:w="1853" w:type="dxa"/>
             <w:tcBorders>
               <w:top w:val="single" w:sz="1" w:space="0" w:color="CCCCCC"/>
               <w:left w:val="single" w:sz="1" w:space="0" w:color="CCCCCC"/>
@@ -5563,7 +5454,7 @@
         </w:tc>
         <w:tc>
           <w:tcPr>
-            <w:tcW w:w="1600" w:type="dxa"/>
+            <w:tcW w:w="1853" w:type="dxa"/>
             <w:tcBorders>
               <w:top w:val="single" w:sz="1" w:space="0" w:color="CCCCCC"/>
               <w:left w:val="single" w:sz="1" w:space="0" w:color="CCCCCC"/>
@@ -5590,7 +5481,7 @@
         </w:tc>
         <w:tc>
           <w:tcPr>
-            <w:tcW w:w="2360" w:type="dxa"/>
+            <w:tcW w:w="2733" w:type="dxa"/>
             <w:tcBorders>
               <w:top w:val="single" w:sz="1" w:space="0" w:color="CCCCCC"/>
               <w:left w:val="single" w:sz="1" w:space="0" w:color="CCCCCC"/>
@@ -5616,15 +5507,12 @@
         </w:tc>
       </w:tr>
       <w:tr>
-        <w:tblPrEx>
-          <w:tblCellMar>
-            <w:top w:w="0" w:type="dxa"/>
-            <w:bottom w:w="0" w:type="dxa"/>
-          </w:tblCellMar>
-        </w:tblPrEx>
-        <w:tc>
-          <w:tcPr>
-            <w:tcW w:w="2200" w:type="dxa"/>
+        <w:trPr>
+          <w:trHeight w:val="914"/>
+        </w:trPr>
+        <w:tc>
+          <w:tcPr>
+            <w:tcW w:w="2548" w:type="dxa"/>
             <w:tcBorders>
               <w:top w:val="single" w:sz="1" w:space="0" w:color="CCCCCC"/>
               <w:left w:val="single" w:sz="1" w:space="0" w:color="CCCCCC"/>
@@ -5650,7 +5538,7 @@
         </w:tc>
         <w:tc>
           <w:tcPr>
-            <w:tcW w:w="1600" w:type="dxa"/>
+            <w:tcW w:w="1853" w:type="dxa"/>
             <w:tcBorders>
               <w:top w:val="single" w:sz="1" w:space="0" w:color="CCCCCC"/>
               <w:left w:val="single" w:sz="1" w:space="0" w:color="CCCCCC"/>
@@ -5677,7 +5565,7 @@
         </w:tc>
         <w:tc>
           <w:tcPr>
-            <w:tcW w:w="1600" w:type="dxa"/>
+            <w:tcW w:w="1853" w:type="dxa"/>
             <w:tcBorders>
               <w:top w:val="single" w:sz="1" w:space="0" w:color="CCCCCC"/>
               <w:left w:val="single" w:sz="1" w:space="0" w:color="CCCCCC"/>
@@ -5704,7 +5592,7 @@
         </w:tc>
         <w:tc>
           <w:tcPr>
-            <w:tcW w:w="1600" w:type="dxa"/>
+            <w:tcW w:w="1853" w:type="dxa"/>
             <w:tcBorders>
               <w:top w:val="single" w:sz="1" w:space="0" w:color="CCCCCC"/>
               <w:left w:val="single" w:sz="1" w:space="0" w:color="CCCCCC"/>
@@ -5727,11 +5615,18 @@
               </w:rPr>
               <w:t>Vendor onboarding</w:t>
             </w:r>
-          </w:p>
-        </w:tc>
-        <w:tc>
-          <w:tcPr>
-            <w:tcW w:w="2360" w:type="dxa"/>
+            <w:r>
+              <w:rPr>
+                <w:rFonts w:ascii="Arial" w:hAnsi="Arial"/>
+                <w:szCs w:val="20"/>
+              </w:rPr>
+              <w:t xml:space="preserve"> enhancements</w:t>
+            </w:r>
+          </w:p>
+        </w:tc>
+        <w:tc>
+          <w:tcPr>
+            <w:tcW w:w="2733" w:type="dxa"/>
             <w:tcBorders>
               <w:top w:val="single" w:sz="1" w:space="0" w:color="CCCCCC"/>
               <w:left w:val="single" w:sz="1" w:space="0" w:color="CCCCCC"/>
@@ -5757,15 +5652,12 @@
         </w:tc>
       </w:tr>
       <w:tr>
-        <w:tblPrEx>
-          <w:tblCellMar>
-            <w:top w:w="0" w:type="dxa"/>
-            <w:bottom w:w="0" w:type="dxa"/>
-          </w:tblCellMar>
-        </w:tblPrEx>
-        <w:tc>
-          <w:tcPr>
-            <w:tcW w:w="2200" w:type="dxa"/>
+        <w:trPr>
+          <w:trHeight w:val="457"/>
+        </w:trPr>
+        <w:tc>
+          <w:tcPr>
+            <w:tcW w:w="2548" w:type="dxa"/>
             <w:tcBorders>
               <w:top w:val="single" w:sz="1" w:space="0" w:color="CCCCCC"/>
               <w:left w:val="single" w:sz="1" w:space="0" w:color="CCCCCC"/>
@@ -5791,7 +5683,7 @@
         </w:tc>
         <w:tc>
           <w:tcPr>
-            <w:tcW w:w="1600" w:type="dxa"/>
+            <w:tcW w:w="1853" w:type="dxa"/>
             <w:tcBorders>
               <w:top w:val="single" w:sz="1" w:space="0" w:color="CCCCCC"/>
               <w:left w:val="single" w:sz="1" w:space="0" w:color="CCCCCC"/>
@@ -5818,7 +5710,7 @@
         </w:tc>
         <w:tc>
           <w:tcPr>
-            <w:tcW w:w="1600" w:type="dxa"/>
+            <w:tcW w:w="1853" w:type="dxa"/>
             <w:tcBorders>
               <w:top w:val="single" w:sz="1" w:space="0" w:color="CCCCCC"/>
               <w:left w:val="single" w:sz="1" w:space="0" w:color="CCCCCC"/>
@@ -5845,7 +5737,7 @@
         </w:tc>
         <w:tc>
           <w:tcPr>
-            <w:tcW w:w="1600" w:type="dxa"/>
+            <w:tcW w:w="1853" w:type="dxa"/>
             <w:tcBorders>
               <w:top w:val="single" w:sz="1" w:space="0" w:color="CCCCCC"/>
               <w:left w:val="single" w:sz="1" w:space="0" w:color="CCCCCC"/>
@@ -5872,7 +5764,7 @@
         </w:tc>
         <w:tc>
           <w:tcPr>
-            <w:tcW w:w="2360" w:type="dxa"/>
+            <w:tcW w:w="2733" w:type="dxa"/>
             <w:tcBorders>
               <w:top w:val="single" w:sz="1" w:space="0" w:color="CCCCCC"/>
               <w:left w:val="single" w:sz="1" w:space="0" w:color="CCCCCC"/>
@@ -5951,7 +5843,6 @@
         <w:pStyle w:val="Heading1"/>
       </w:pPr>
       <w:r>
-        <w:lastRenderedPageBreak/>
         <w:t>6. Active Risk Register</w:t>
       </w:r>
     </w:p>
@@ -5974,7 +5865,7 @@
     </w:p>
     <w:tbl>
       <w:tblPr>
-        <w:tblW w:w="9360" w:type="dxa"/>
+        <w:tblW w:w="10740" w:type="dxa"/>
         <w:tblBorders>
           <w:top w:val="single" w:sz="4" w:space="0" w:color="auto"/>
           <w:left w:val="single" w:sz="4" w:space="0" w:color="auto"/>
@@ -5990,23 +5881,20 @@
         <w:tblLook w:val="0000" w:firstRow="0" w:lastRow="0" w:firstColumn="0" w:lastColumn="0" w:noHBand="0" w:noVBand="0"/>
       </w:tblPr>
       <w:tblGrid>
-        <w:gridCol w:w="600"/>
-        <w:gridCol w:w="2100"/>
-        <w:gridCol w:w="1200"/>
-        <w:gridCol w:w="1200"/>
-        <w:gridCol w:w="2400"/>
-        <w:gridCol w:w="1860"/>
+        <w:gridCol w:w="688"/>
+        <w:gridCol w:w="2410"/>
+        <w:gridCol w:w="1377"/>
+        <w:gridCol w:w="1377"/>
+        <w:gridCol w:w="2754"/>
+        <w:gridCol w:w="2134"/>
       </w:tblGrid>
       <w:tr>
-        <w:tblPrEx>
-          <w:tblCellMar>
-            <w:top w:w="0" w:type="dxa"/>
-            <w:bottom w:w="0" w:type="dxa"/>
-          </w:tblCellMar>
-        </w:tblPrEx>
-        <w:tc>
-          <w:tcPr>
-            <w:tcW w:w="600" w:type="dxa"/>
+        <w:trPr>
+          <w:trHeight w:val="214"/>
+        </w:trPr>
+        <w:tc>
+          <w:tcPr>
+            <w:tcW w:w="688" w:type="dxa"/>
             <w:tcBorders>
               <w:top w:val="single" w:sz="1" w:space="0" w:color="CCCCCC"/>
               <w:left w:val="single" w:sz="1" w:space="0" w:color="CCCCCC"/>
@@ -6036,7 +5924,7 @@
         </w:tc>
         <w:tc>
           <w:tcPr>
-            <w:tcW w:w="2100" w:type="dxa"/>
+            <w:tcW w:w="2410" w:type="dxa"/>
             <w:tcBorders>
               <w:top w:val="single" w:sz="1" w:space="0" w:color="CCCCCC"/>
               <w:left w:val="single" w:sz="1" w:space="0" w:color="CCCCCC"/>
@@ -6066,7 +5954,7 @@
         </w:tc>
         <w:tc>
           <w:tcPr>
-            <w:tcW w:w="1200" w:type="dxa"/>
+            <w:tcW w:w="1377" w:type="dxa"/>
             <w:tcBorders>
               <w:top w:val="single" w:sz="1" w:space="0" w:color="CCCCCC"/>
               <w:left w:val="single" w:sz="1" w:space="0" w:color="CCCCCC"/>
@@ -6096,7 +5984,7 @@
         </w:tc>
         <w:tc>
           <w:tcPr>
-            <w:tcW w:w="1200" w:type="dxa"/>
+            <w:tcW w:w="1377" w:type="dxa"/>
             <w:tcBorders>
               <w:top w:val="single" w:sz="1" w:space="0" w:color="CCCCCC"/>
               <w:left w:val="single" w:sz="1" w:space="0" w:color="CCCCCC"/>
@@ -6126,7 +6014,7 @@
         </w:tc>
         <w:tc>
           <w:tcPr>
-            <w:tcW w:w="2400" w:type="dxa"/>
+            <w:tcW w:w="2754" w:type="dxa"/>
             <w:tcBorders>
               <w:top w:val="single" w:sz="1" w:space="0" w:color="CCCCCC"/>
               <w:left w:val="single" w:sz="1" w:space="0" w:color="CCCCCC"/>
@@ -6156,7 +6044,7 @@
         </w:tc>
         <w:tc>
           <w:tcPr>
-            <w:tcW w:w="1860" w:type="dxa"/>
+            <w:tcW w:w="2134" w:type="dxa"/>
             <w:tcBorders>
               <w:top w:val="single" w:sz="1" w:space="0" w:color="CCCCCC"/>
               <w:left w:val="single" w:sz="1" w:space="0" w:color="CCCCCC"/>
@@ -6186,15 +6074,12 @@
         </w:tc>
       </w:tr>
       <w:tr>
-        <w:tblPrEx>
-          <w:tblCellMar>
-            <w:top w:w="0" w:type="dxa"/>
-            <w:bottom w:w="0" w:type="dxa"/>
-          </w:tblCellMar>
-        </w:tblPrEx>
-        <w:tc>
-          <w:tcPr>
-            <w:tcW w:w="600" w:type="dxa"/>
+        <w:trPr>
+          <w:trHeight w:val="913"/>
+        </w:trPr>
+        <w:tc>
+          <w:tcPr>
+            <w:tcW w:w="688" w:type="dxa"/>
             <w:tcBorders>
               <w:top w:val="single" w:sz="1" w:space="0" w:color="CCCCCC"/>
               <w:left w:val="single" w:sz="1" w:space="0" w:color="CCCCCC"/>
@@ -6222,7 +6107,7 @@
         </w:tc>
         <w:tc>
           <w:tcPr>
-            <w:tcW w:w="2100" w:type="dxa"/>
+            <w:tcW w:w="2410" w:type="dxa"/>
             <w:tcBorders>
               <w:top w:val="single" w:sz="1" w:space="0" w:color="CCCCCC"/>
               <w:left w:val="single" w:sz="1" w:space="0" w:color="CCCCCC"/>
@@ -6248,7 +6133,7 @@
         </w:tc>
         <w:tc>
           <w:tcPr>
-            <w:tcW w:w="1200" w:type="dxa"/>
+            <w:tcW w:w="1377" w:type="dxa"/>
             <w:tcBorders>
               <w:top w:val="single" w:sz="1" w:space="0" w:color="CCCCCC"/>
               <w:left w:val="single" w:sz="1" w:space="0" w:color="CCCCCC"/>
@@ -6275,7 +6160,7 @@
         </w:tc>
         <w:tc>
           <w:tcPr>
-            <w:tcW w:w="1200" w:type="dxa"/>
+            <w:tcW w:w="1377" w:type="dxa"/>
             <w:tcBorders>
               <w:top w:val="single" w:sz="1" w:space="0" w:color="CCCCCC"/>
               <w:left w:val="single" w:sz="1" w:space="0" w:color="CCCCCC"/>
@@ -6302,7 +6187,7 @@
         </w:tc>
         <w:tc>
           <w:tcPr>
-            <w:tcW w:w="2400" w:type="dxa"/>
+            <w:tcW w:w="2754" w:type="dxa"/>
             <w:tcBorders>
               <w:top w:val="single" w:sz="1" w:space="0" w:color="CCCCCC"/>
               <w:left w:val="single" w:sz="1" w:space="0" w:color="CCCCCC"/>
@@ -6328,7 +6213,7 @@
         </w:tc>
         <w:tc>
           <w:tcPr>
-            <w:tcW w:w="1860" w:type="dxa"/>
+            <w:tcW w:w="2134" w:type="dxa"/>
             <w:tcBorders>
               <w:top w:val="single" w:sz="1" w:space="0" w:color="CCCCCC"/>
               <w:left w:val="single" w:sz="1" w:space="0" w:color="CCCCCC"/>
@@ -6354,15 +6239,12 @@
         </w:tc>
       </w:tr>
       <w:tr>
-        <w:tblPrEx>
-          <w:tblCellMar>
-            <w:top w:w="0" w:type="dxa"/>
-            <w:bottom w:w="0" w:type="dxa"/>
-          </w:tblCellMar>
-        </w:tblPrEx>
-        <w:tc>
-          <w:tcPr>
-            <w:tcW w:w="600" w:type="dxa"/>
+        <w:trPr>
+          <w:trHeight w:val="913"/>
+        </w:trPr>
+        <w:tc>
+          <w:tcPr>
+            <w:tcW w:w="688" w:type="dxa"/>
             <w:tcBorders>
               <w:top w:val="single" w:sz="1" w:space="0" w:color="CCCCCC"/>
               <w:left w:val="single" w:sz="1" w:space="0" w:color="CCCCCC"/>
@@ -6390,7 +6272,7 @@
         </w:tc>
         <w:tc>
           <w:tcPr>
-            <w:tcW w:w="2100" w:type="dxa"/>
+            <w:tcW w:w="2410" w:type="dxa"/>
             <w:tcBorders>
               <w:top w:val="single" w:sz="1" w:space="0" w:color="CCCCCC"/>
               <w:left w:val="single" w:sz="1" w:space="0" w:color="CCCCCC"/>
@@ -6416,7 +6298,7 @@
         </w:tc>
         <w:tc>
           <w:tcPr>
-            <w:tcW w:w="1200" w:type="dxa"/>
+            <w:tcW w:w="1377" w:type="dxa"/>
             <w:tcBorders>
               <w:top w:val="single" w:sz="1" w:space="0" w:color="CCCCCC"/>
               <w:left w:val="single" w:sz="1" w:space="0" w:color="CCCCCC"/>
@@ -6443,7 +6325,7 @@
         </w:tc>
         <w:tc>
           <w:tcPr>
-            <w:tcW w:w="1200" w:type="dxa"/>
+            <w:tcW w:w="1377" w:type="dxa"/>
             <w:tcBorders>
               <w:top w:val="single" w:sz="1" w:space="0" w:color="CCCCCC"/>
               <w:left w:val="single" w:sz="1" w:space="0" w:color="CCCCCC"/>
@@ -6470,7 +6352,7 @@
         </w:tc>
         <w:tc>
           <w:tcPr>
-            <w:tcW w:w="2400" w:type="dxa"/>
+            <w:tcW w:w="2754" w:type="dxa"/>
             <w:tcBorders>
               <w:top w:val="single" w:sz="1" w:space="0" w:color="CCCCCC"/>
               <w:left w:val="single" w:sz="1" w:space="0" w:color="CCCCCC"/>
@@ -6496,7 +6378,7 @@
         </w:tc>
         <w:tc>
           <w:tcPr>
-            <w:tcW w:w="1860" w:type="dxa"/>
+            <w:tcW w:w="2134" w:type="dxa"/>
             <w:tcBorders>
               <w:top w:val="single" w:sz="1" w:space="0" w:color="CCCCCC"/>
               <w:left w:val="single" w:sz="1" w:space="0" w:color="CCCCCC"/>
@@ -6522,15 +6404,12 @@
         </w:tc>
       </w:tr>
       <w:tr>
-        <w:tblPrEx>
-          <w:tblCellMar>
-            <w:top w:w="0" w:type="dxa"/>
-            <w:bottom w:w="0" w:type="dxa"/>
-          </w:tblCellMar>
-        </w:tblPrEx>
-        <w:tc>
-          <w:tcPr>
-            <w:tcW w:w="600" w:type="dxa"/>
+        <w:trPr>
+          <w:trHeight w:val="685"/>
+        </w:trPr>
+        <w:tc>
+          <w:tcPr>
+            <w:tcW w:w="688" w:type="dxa"/>
             <w:tcBorders>
               <w:top w:val="single" w:sz="1" w:space="0" w:color="CCCCCC"/>
               <w:left w:val="single" w:sz="1" w:space="0" w:color="CCCCCC"/>
@@ -6558,7 +6437,7 @@
         </w:tc>
         <w:tc>
           <w:tcPr>
-            <w:tcW w:w="2100" w:type="dxa"/>
+            <w:tcW w:w="2410" w:type="dxa"/>
             <w:tcBorders>
               <w:top w:val="single" w:sz="1" w:space="0" w:color="CCCCCC"/>
               <w:left w:val="single" w:sz="1" w:space="0" w:color="CCCCCC"/>
@@ -6584,7 +6463,7 @@
         </w:tc>
         <w:tc>
           <w:tcPr>
-            <w:tcW w:w="1200" w:type="dxa"/>
+            <w:tcW w:w="1377" w:type="dxa"/>
             <w:tcBorders>
               <w:top w:val="single" w:sz="1" w:space="0" w:color="CCCCCC"/>
               <w:left w:val="single" w:sz="1" w:space="0" w:color="CCCCCC"/>
@@ -6611,7 +6490,7 @@
         </w:tc>
         <w:tc>
           <w:tcPr>
-            <w:tcW w:w="1200" w:type="dxa"/>
+            <w:tcW w:w="1377" w:type="dxa"/>
             <w:tcBorders>
               <w:top w:val="single" w:sz="1" w:space="0" w:color="CCCCCC"/>
               <w:left w:val="single" w:sz="1" w:space="0" w:color="CCCCCC"/>
@@ -6638,7 +6517,7 @@
         </w:tc>
         <w:tc>
           <w:tcPr>
-            <w:tcW w:w="2400" w:type="dxa"/>
+            <w:tcW w:w="2754" w:type="dxa"/>
             <w:tcBorders>
               <w:top w:val="single" w:sz="1" w:space="0" w:color="CCCCCC"/>
               <w:left w:val="single" w:sz="1" w:space="0" w:color="CCCCCC"/>
@@ -6664,50 +6543,38 @@
         </w:tc>
         <w:tc>
           <w:tcPr>
-            <w:tcW w:w="1860" w:type="dxa"/>
-            <w:tcBorders>
-              <w:top w:val="single" w:sz="1" w:space="0" w:color="CCCCCC"/>
-              <w:left w:val="single" w:sz="1" w:space="0" w:color="CCCCCC"/>
-              <w:bottom w:val="single" w:sz="1" w:space="0" w:color="CCCCCC"/>
-              <w:right w:val="single" w:sz="1" w:space="0" w:color="CCCCCC"/>
-            </w:tcBorders>
-            <w:tcMar>
-              <w:top w:w="80" w:type="dxa"/>
-              <w:left w:w="120" w:type="dxa"/>
-              <w:bottom w:w="80" w:type="dxa"/>
-              <w:right w:w="120" w:type="dxa"/>
-            </w:tcMar>
-          </w:tcPr>
-          <w:p>
-            <w:r>
-              <w:rPr>
-                <w:rFonts w:ascii="Arial" w:hAnsi="Arial"/>
-                <w:szCs w:val="20"/>
-              </w:rPr>
-              <w:t xml:space="preserve">Nathan Miles / </w:t>
-            </w:r>
-            <w:proofErr w:type="spellStart"/>
-            <w:r>
-              <w:rPr>
-                <w:rFonts w:ascii="Arial" w:hAnsi="Arial"/>
-                <w:szCs w:val="20"/>
-              </w:rPr>
-              <w:t>Phanindher</w:t>
-            </w:r>
-            <w:proofErr w:type="spellEnd"/>
+            <w:tcW w:w="2134" w:type="dxa"/>
+            <w:tcBorders>
+              <w:top w:val="single" w:sz="1" w:space="0" w:color="CCCCCC"/>
+              <w:left w:val="single" w:sz="1" w:space="0" w:color="CCCCCC"/>
+              <w:bottom w:val="single" w:sz="1" w:space="0" w:color="CCCCCC"/>
+              <w:right w:val="single" w:sz="1" w:space="0" w:color="CCCCCC"/>
+            </w:tcBorders>
+            <w:tcMar>
+              <w:top w:w="80" w:type="dxa"/>
+              <w:left w:w="120" w:type="dxa"/>
+              <w:bottom w:w="80" w:type="dxa"/>
+              <w:right w:w="120" w:type="dxa"/>
+            </w:tcMar>
+          </w:tcPr>
+          <w:p>
+            <w:r>
+              <w:rPr>
+                <w:rFonts w:ascii="Arial" w:hAnsi="Arial"/>
+                <w:szCs w:val="20"/>
+              </w:rPr>
+              <w:t>Nathan Miles / Phanindher</w:t>
+            </w:r>
           </w:p>
         </w:tc>
       </w:tr>
       <w:tr>
-        <w:tblPrEx>
-          <w:tblCellMar>
-            <w:top w:w="0" w:type="dxa"/>
-            <w:bottom w:w="0" w:type="dxa"/>
-          </w:tblCellMar>
-        </w:tblPrEx>
-        <w:tc>
-          <w:tcPr>
-            <w:tcW w:w="600" w:type="dxa"/>
+        <w:trPr>
+          <w:trHeight w:val="1143"/>
+        </w:trPr>
+        <w:tc>
+          <w:tcPr>
+            <w:tcW w:w="688" w:type="dxa"/>
             <w:tcBorders>
               <w:top w:val="single" w:sz="1" w:space="0" w:color="CCCCCC"/>
               <w:left w:val="single" w:sz="1" w:space="0" w:color="CCCCCC"/>
@@ -6735,7 +6602,7 @@
         </w:tc>
         <w:tc>
           <w:tcPr>
-            <w:tcW w:w="2100" w:type="dxa"/>
+            <w:tcW w:w="2410" w:type="dxa"/>
             <w:tcBorders>
               <w:top w:val="single" w:sz="1" w:space="0" w:color="CCCCCC"/>
               <w:left w:val="single" w:sz="1" w:space="0" w:color="CCCCCC"/>
@@ -6761,7 +6628,7 @@
         </w:tc>
         <w:tc>
           <w:tcPr>
-            <w:tcW w:w="1200" w:type="dxa"/>
+            <w:tcW w:w="1377" w:type="dxa"/>
             <w:tcBorders>
               <w:top w:val="single" w:sz="1" w:space="0" w:color="CCCCCC"/>
               <w:left w:val="single" w:sz="1" w:space="0" w:color="CCCCCC"/>
@@ -6788,7 +6655,7 @@
         </w:tc>
         <w:tc>
           <w:tcPr>
-            <w:tcW w:w="1200" w:type="dxa"/>
+            <w:tcW w:w="1377" w:type="dxa"/>
             <w:tcBorders>
               <w:top w:val="single" w:sz="1" w:space="0" w:color="CCCCCC"/>
               <w:left w:val="single" w:sz="1" w:space="0" w:color="CCCCCC"/>
@@ -6815,7 +6682,7 @@
         </w:tc>
         <w:tc>
           <w:tcPr>
-            <w:tcW w:w="2400" w:type="dxa"/>
+            <w:tcW w:w="2754" w:type="dxa"/>
             <w:tcBorders>
               <w:top w:val="single" w:sz="1" w:space="0" w:color="CCCCCC"/>
               <w:left w:val="single" w:sz="1" w:space="0" w:color="CCCCCC"/>
@@ -6841,7 +6708,7 @@
         </w:tc>
         <w:tc>
           <w:tcPr>
-            <w:tcW w:w="1860" w:type="dxa"/>
+            <w:tcW w:w="2134" w:type="dxa"/>
             <w:tcBorders>
               <w:top w:val="single" w:sz="1" w:space="0" w:color="CCCCCC"/>
               <w:left w:val="single" w:sz="1" w:space="0" w:color="CCCCCC"/>
@@ -6867,15 +6734,12 @@
         </w:tc>
       </w:tr>
       <w:tr>
-        <w:tblPrEx>
-          <w:tblCellMar>
-            <w:top w:w="0" w:type="dxa"/>
-            <w:bottom w:w="0" w:type="dxa"/>
-          </w:tblCellMar>
-        </w:tblPrEx>
-        <w:tc>
-          <w:tcPr>
-            <w:tcW w:w="600" w:type="dxa"/>
+        <w:trPr>
+          <w:trHeight w:val="913"/>
+        </w:trPr>
+        <w:tc>
+          <w:tcPr>
+            <w:tcW w:w="688" w:type="dxa"/>
             <w:tcBorders>
               <w:top w:val="single" w:sz="1" w:space="0" w:color="CCCCCC"/>
               <w:left w:val="single" w:sz="1" w:space="0" w:color="CCCCCC"/>
@@ -6903,7 +6767,7 @@
         </w:tc>
         <w:tc>
           <w:tcPr>
-            <w:tcW w:w="2100" w:type="dxa"/>
+            <w:tcW w:w="2410" w:type="dxa"/>
             <w:tcBorders>
               <w:top w:val="single" w:sz="1" w:space="0" w:color="CCCCCC"/>
               <w:left w:val="single" w:sz="1" w:space="0" w:color="CCCCCC"/>
@@ -6929,7 +6793,7 @@
         </w:tc>
         <w:tc>
           <w:tcPr>
-            <w:tcW w:w="1200" w:type="dxa"/>
+            <w:tcW w:w="1377" w:type="dxa"/>
             <w:tcBorders>
               <w:top w:val="single" w:sz="1" w:space="0" w:color="CCCCCC"/>
               <w:left w:val="single" w:sz="1" w:space="0" w:color="CCCCCC"/>
@@ -6956,7 +6820,7 @@
         </w:tc>
         <w:tc>
           <w:tcPr>
-            <w:tcW w:w="1200" w:type="dxa"/>
+            <w:tcW w:w="1377" w:type="dxa"/>
             <w:tcBorders>
               <w:top w:val="single" w:sz="1" w:space="0" w:color="CCCCCC"/>
               <w:left w:val="single" w:sz="1" w:space="0" w:color="CCCCCC"/>
@@ -6983,7 +6847,7 @@
         </w:tc>
         <w:tc>
           <w:tcPr>
-            <w:tcW w:w="2400" w:type="dxa"/>
+            <w:tcW w:w="2754" w:type="dxa"/>
             <w:tcBorders>
               <w:top w:val="single" w:sz="1" w:space="0" w:color="CCCCCC"/>
               <w:left w:val="single" w:sz="1" w:space="0" w:color="CCCCCC"/>
@@ -7009,7 +6873,7 @@
         </w:tc>
         <w:tc>
           <w:tcPr>
-            <w:tcW w:w="1860" w:type="dxa"/>
+            <w:tcW w:w="2134" w:type="dxa"/>
             <w:tcBorders>
               <w:top w:val="single" w:sz="1" w:space="0" w:color="CCCCCC"/>
               <w:left w:val="single" w:sz="1" w:space="0" w:color="CCCCCC"/>
@@ -7035,15 +6899,12 @@
         </w:tc>
       </w:tr>
       <w:tr>
-        <w:tblPrEx>
-          <w:tblCellMar>
-            <w:top w:w="0" w:type="dxa"/>
-            <w:bottom w:w="0" w:type="dxa"/>
-          </w:tblCellMar>
-        </w:tblPrEx>
-        <w:tc>
-          <w:tcPr>
-            <w:tcW w:w="600" w:type="dxa"/>
+        <w:trPr>
+          <w:trHeight w:val="913"/>
+        </w:trPr>
+        <w:tc>
+          <w:tcPr>
+            <w:tcW w:w="688" w:type="dxa"/>
             <w:tcBorders>
               <w:top w:val="single" w:sz="1" w:space="0" w:color="CCCCCC"/>
               <w:left w:val="single" w:sz="1" w:space="0" w:color="CCCCCC"/>
@@ -7071,7 +6932,7 @@
         </w:tc>
         <w:tc>
           <w:tcPr>
-            <w:tcW w:w="2100" w:type="dxa"/>
+            <w:tcW w:w="2410" w:type="dxa"/>
             <w:tcBorders>
               <w:top w:val="single" w:sz="1" w:space="0" w:color="CCCCCC"/>
               <w:left w:val="single" w:sz="1" w:space="0" w:color="CCCCCC"/>
@@ -7097,7 +6958,7 @@
         </w:tc>
         <w:tc>
           <w:tcPr>
-            <w:tcW w:w="1200" w:type="dxa"/>
+            <w:tcW w:w="1377" w:type="dxa"/>
             <w:tcBorders>
               <w:top w:val="single" w:sz="1" w:space="0" w:color="CCCCCC"/>
               <w:left w:val="single" w:sz="1" w:space="0" w:color="CCCCCC"/>
@@ -7124,7 +6985,7 @@
         </w:tc>
         <w:tc>
           <w:tcPr>
-            <w:tcW w:w="1200" w:type="dxa"/>
+            <w:tcW w:w="1377" w:type="dxa"/>
             <w:tcBorders>
               <w:top w:val="single" w:sz="1" w:space="0" w:color="CCCCCC"/>
               <w:left w:val="single" w:sz="1" w:space="0" w:color="CCCCCC"/>
@@ -7151,7 +7012,7 @@
         </w:tc>
         <w:tc>
           <w:tcPr>
-            <w:tcW w:w="2400" w:type="dxa"/>
+            <w:tcW w:w="2754" w:type="dxa"/>
             <w:tcBorders>
               <w:top w:val="single" w:sz="1" w:space="0" w:color="CCCCCC"/>
               <w:left w:val="single" w:sz="1" w:space="0" w:color="CCCCCC"/>
@@ -7177,50 +7038,38 @@
         </w:tc>
         <w:tc>
           <w:tcPr>
-            <w:tcW w:w="1860" w:type="dxa"/>
-            <w:tcBorders>
-              <w:top w:val="single" w:sz="1" w:space="0" w:color="CCCCCC"/>
-              <w:left w:val="single" w:sz="1" w:space="0" w:color="CCCCCC"/>
-              <w:bottom w:val="single" w:sz="1" w:space="0" w:color="CCCCCC"/>
-              <w:right w:val="single" w:sz="1" w:space="0" w:color="CCCCCC"/>
-            </w:tcBorders>
-            <w:tcMar>
-              <w:top w:w="80" w:type="dxa"/>
-              <w:left w:w="120" w:type="dxa"/>
-              <w:bottom w:w="80" w:type="dxa"/>
-              <w:right w:w="120" w:type="dxa"/>
-            </w:tcMar>
-          </w:tcPr>
-          <w:p>
-            <w:r>
-              <w:rPr>
-                <w:rFonts w:ascii="Arial" w:hAnsi="Arial"/>
-                <w:szCs w:val="20"/>
-              </w:rPr>
-              <w:t xml:space="preserve">Nathan Miles / </w:t>
-            </w:r>
-            <w:proofErr w:type="spellStart"/>
-            <w:r>
-              <w:rPr>
-                <w:rFonts w:ascii="Arial" w:hAnsi="Arial"/>
-                <w:szCs w:val="20"/>
-              </w:rPr>
-              <w:t>Phanindher</w:t>
-            </w:r>
-            <w:proofErr w:type="spellEnd"/>
+            <w:tcW w:w="2134" w:type="dxa"/>
+            <w:tcBorders>
+              <w:top w:val="single" w:sz="1" w:space="0" w:color="CCCCCC"/>
+              <w:left w:val="single" w:sz="1" w:space="0" w:color="CCCCCC"/>
+              <w:bottom w:val="single" w:sz="1" w:space="0" w:color="CCCCCC"/>
+              <w:right w:val="single" w:sz="1" w:space="0" w:color="CCCCCC"/>
+            </w:tcBorders>
+            <w:tcMar>
+              <w:top w:w="80" w:type="dxa"/>
+              <w:left w:w="120" w:type="dxa"/>
+              <w:bottom w:w="80" w:type="dxa"/>
+              <w:right w:w="120" w:type="dxa"/>
+            </w:tcMar>
+          </w:tcPr>
+          <w:p>
+            <w:r>
+              <w:rPr>
+                <w:rFonts w:ascii="Arial" w:hAnsi="Arial"/>
+                <w:szCs w:val="20"/>
+              </w:rPr>
+              <w:t>Nathan Miles / Phanindher</w:t>
+            </w:r>
           </w:p>
         </w:tc>
       </w:tr>
       <w:tr>
-        <w:tblPrEx>
-          <w:tblCellMar>
-            <w:top w:w="0" w:type="dxa"/>
-            <w:bottom w:w="0" w:type="dxa"/>
-          </w:tblCellMar>
-        </w:tblPrEx>
-        <w:tc>
-          <w:tcPr>
-            <w:tcW w:w="600" w:type="dxa"/>
+        <w:trPr>
+          <w:trHeight w:val="1143"/>
+        </w:trPr>
+        <w:tc>
+          <w:tcPr>
+            <w:tcW w:w="688" w:type="dxa"/>
             <w:tcBorders>
               <w:top w:val="single" w:sz="1" w:space="0" w:color="CCCCCC"/>
               <w:left w:val="single" w:sz="1" w:space="0" w:color="CCCCCC"/>
@@ -7248,7 +7097,7 @@
         </w:tc>
         <w:tc>
           <w:tcPr>
-            <w:tcW w:w="2100" w:type="dxa"/>
+            <w:tcW w:w="2410" w:type="dxa"/>
             <w:tcBorders>
               <w:top w:val="single" w:sz="1" w:space="0" w:color="CCCCCC"/>
               <w:left w:val="single" w:sz="1" w:space="0" w:color="CCCCCC"/>
@@ -7274,7 +7123,7 @@
         </w:tc>
         <w:tc>
           <w:tcPr>
-            <w:tcW w:w="1200" w:type="dxa"/>
+            <w:tcW w:w="1377" w:type="dxa"/>
             <w:tcBorders>
               <w:top w:val="single" w:sz="1" w:space="0" w:color="CCCCCC"/>
               <w:left w:val="single" w:sz="1" w:space="0" w:color="CCCCCC"/>
@@ -7301,7 +7150,7 @@
         </w:tc>
         <w:tc>
           <w:tcPr>
-            <w:tcW w:w="1200" w:type="dxa"/>
+            <w:tcW w:w="1377" w:type="dxa"/>
             <w:tcBorders>
               <w:top w:val="single" w:sz="1" w:space="0" w:color="CCCCCC"/>
               <w:left w:val="single" w:sz="1" w:space="0" w:color="CCCCCC"/>
@@ -7328,7 +7177,7 @@
         </w:tc>
         <w:tc>
           <w:tcPr>
-            <w:tcW w:w="2400" w:type="dxa"/>
+            <w:tcW w:w="2754" w:type="dxa"/>
             <w:tcBorders>
               <w:top w:val="single" w:sz="1" w:space="0" w:color="CCCCCC"/>
               <w:left w:val="single" w:sz="1" w:space="0" w:color="CCCCCC"/>
@@ -7354,7 +7203,7 @@
         </w:tc>
         <w:tc>
           <w:tcPr>
-            <w:tcW w:w="1860" w:type="dxa"/>
+            <w:tcW w:w="2134" w:type="dxa"/>
             <w:tcBorders>
               <w:top w:val="single" w:sz="1" w:space="0" w:color="CCCCCC"/>
               <w:left w:val="single" w:sz="1" w:space="0" w:color="CCCCCC"/>
@@ -7390,7 +7239,6 @@
         <w:pStyle w:val="Heading1"/>
       </w:pPr>
       <w:r>
-        <w:lastRenderedPageBreak/>
         <w:t>7. OP1 2027 Positioning Strategy</w:t>
       </w:r>
     </w:p>
@@ -7666,39 +7514,7 @@
           <w:rFonts w:ascii="Arial" w:hAnsi="Arial"/>
           <w:sz w:val="22"/>
         </w:rPr>
-        <w:t xml:space="preserve">Nathan Miles → </w:t>
-      </w:r>
-      <w:proofErr w:type="spellStart"/>
-      <w:r>
-        <w:rPr>
-          <w:rFonts w:ascii="Arial" w:hAnsi="Arial"/>
-          <w:sz w:val="22"/>
-        </w:rPr>
-        <w:t>Phanindher</w:t>
-      </w:r>
-      <w:proofErr w:type="spellEnd"/>
-      <w:r>
-        <w:rPr>
-          <w:rFonts w:ascii="Arial" w:hAnsi="Arial"/>
-          <w:sz w:val="22"/>
-        </w:rPr>
-        <w:t xml:space="preserve">. One-page status, blockers, and escalation requests. Designed for </w:t>
-      </w:r>
-      <w:proofErr w:type="spellStart"/>
-      <w:r>
-        <w:rPr>
-          <w:rFonts w:ascii="Arial" w:hAnsi="Arial"/>
-          <w:sz w:val="22"/>
-        </w:rPr>
-        <w:t>Phanindher</w:t>
-      </w:r>
-      <w:proofErr w:type="spellEnd"/>
-      <w:r>
-        <w:rPr>
-          <w:rFonts w:ascii="Arial" w:hAnsi="Arial"/>
-          <w:sz w:val="22"/>
-        </w:rPr>
-        <w:t xml:space="preserve"> to relay upward with zero additional work.</w:t>
+        <w:t>Nathan Miles → Phanindher. One-page status, blockers, and escalation requests. Designed for Phanindher to relay upward with zero additional work.</w:t>
       </w:r>
     </w:p>
     <w:p>
@@ -7724,23 +7540,7 @@
           <w:rFonts w:ascii="Arial" w:hAnsi="Arial"/>
           <w:sz w:val="22"/>
         </w:rPr>
-        <w:t xml:space="preserve">Nathan Miles + </w:t>
-      </w:r>
-      <w:proofErr w:type="spellStart"/>
-      <w:r>
-        <w:rPr>
-          <w:rFonts w:ascii="Arial" w:hAnsi="Arial"/>
-          <w:sz w:val="22"/>
-        </w:rPr>
-        <w:t>Phanindher</w:t>
-      </w:r>
-      <w:proofErr w:type="spellEnd"/>
-      <w:r>
-        <w:rPr>
-          <w:rFonts w:ascii="Arial" w:hAnsi="Arial"/>
-          <w:sz w:val="22"/>
-        </w:rPr>
-        <w:t xml:space="preserve"> present to broader stakeholder group (Tom Burritt, Richard Neely as appropriate). Roadmap progress, risk register update, upcoming decision points.</w:t>
+        <w:t>Nathan Miles + Phanindher present to broader stakeholder group (Tom Burritt, Richard Neely as appropriate). Roadmap progress, risk register update, upcoming decision points.</w:t>
       </w:r>
     </w:p>
     <w:p>
@@ -7766,23 +7566,7 @@
           <w:rFonts w:ascii="Arial" w:hAnsi="Arial"/>
           <w:sz w:val="22"/>
         </w:rPr>
-        <w:t xml:space="preserve">Phase gates that are blocked for &gt;2 weeks trigger escalation through </w:t>
-      </w:r>
-      <w:proofErr w:type="spellStart"/>
-      <w:r>
-        <w:rPr>
-          <w:rFonts w:ascii="Arial" w:hAnsi="Arial"/>
-          <w:sz w:val="22"/>
-        </w:rPr>
-        <w:t>Phanindher</w:t>
-      </w:r>
-      <w:proofErr w:type="spellEnd"/>
-      <w:r>
-        <w:rPr>
-          <w:rFonts w:ascii="Arial" w:hAnsi="Arial"/>
-          <w:sz w:val="22"/>
-        </w:rPr>
-        <w:t xml:space="preserve"> to Dave. Each escalation arrives as a one-paragraph brief with a clear decision ask—not a problem statement.</w:t>
+        <w:t>Phase gates that are blocked for &gt;2 weeks trigger escalation through Phanindher to Dave. Each escalation arrives as a one-paragraph brief with a clear decision ask—not a problem statement.</w:t>
       </w:r>
     </w:p>
     <w:p>
@@ -7805,7 +7589,6 @@
         <w:pStyle w:val="Heading1"/>
       </w:pPr>
       <w:r>
-        <w:lastRenderedPageBreak/>
         <w:t>9. Assumptions &amp; Constraints</w:t>
       </w:r>
     </w:p>
@@ -7948,15 +7731,264 @@
       </w:r>
     </w:p>
     <w:sectPr>
-      <w:headerReference w:type="default" r:id="rId7"/>
-      <w:footerReference w:type="default" r:id="rId8"/>
+      <w:headerReference w:type="default" r:id="rId12"/>
+      <w:footerReference w:type="default" r:id="rId13"/>
       <w:pgSz w:w="12240" w:h="15840"/>
       <w:pgMar w:top="720" w:right="720" w:bottom="720" w:left="720" w:header="708" w:footer="708" w:gutter="0"/>
+      <w:lnNumType w:countBy="1" w:restart="continuous"/>
       <w:cols w:space="720"/>
       <w:docGrid w:linePitch="360"/>
     </w:sectPr>
   </w:body>
 </w:document>
+</file>
+
+<file path=word/comments.xml><?xml version="1.0" encoding="utf-8"?>
+<w:comments xmlns:wpc="http://schemas.microsoft.com/office/word/2010/wordprocessingCanvas" xmlns:cx="http://schemas.microsoft.com/office/drawing/2014/chartex" xmlns:cx1="http://schemas.microsoft.com/office/drawing/2015/9/8/chartex" xmlns:cx2="http://schemas.microsoft.com/office/drawing/2015/10/21/chartex" xmlns:cx3="http://schemas.microsoft.com/office/drawing/2016/5/9/chartex" xmlns:cx4="http://schemas.microsoft.com/office/drawing/2016/5/10/chartex" xmlns:cx5="http://schemas.microsoft.com/office/drawing/2016/5/11/chartex" xmlns:cx6="http://schemas.microsoft.com/office/drawing/2016/5/12/chartex" xmlns:cx7="http://schemas.microsoft.com/office/drawing/2016/5/13/chartex" xmlns:cx8="http://schemas.microsoft.com/office/drawing/2016/5/14/chartex" xmlns:mc="http://schemas.openxmlformats.org/markup-compatibility/2006" xmlns:aink="http://schemas.microsoft.com/office/drawing/2016/ink" xmlns:am3d="http://schemas.microsoft.com/office/drawing/2017/model3d" xmlns:o="urn:schemas-microsoft-com:office:office" xmlns:oel="http://schemas.microsoft.com/office/2019/extlst" xmlns:r="http://schemas.openxmlformats.org/officeDocument/2006/relationships" xmlns:m="http://schemas.openxmlformats.org/officeDocument/2006/math" xmlns:v="urn:schemas-microsoft-com:vml" xmlns:wp14="http://schemas.microsoft.com/office/word/2010/wordprocessingDrawing" xmlns:wp="http://schemas.openxmlformats.org/drawingml/2006/wordprocessingDrawing" xmlns:w10="urn:schemas-microsoft-com:office:word" xmlns:w="http://schemas.openxmlformats.org/wordprocessingml/2006/main" xmlns:w14="http://schemas.microsoft.com/office/word/2010/wordml" xmlns:w15="http://schemas.microsoft.com/office/word/2012/wordml" xmlns:w16cex="http://schemas.microsoft.com/office/word/2018/wordml/cex" xmlns:w16cid="http://schemas.microsoft.com/office/word/2016/wordml/cid" xmlns:w16="http://schemas.microsoft.com/office/word/2018/wordml" xmlns:w16du="http://schemas.microsoft.com/office/word/2023/wordml/word16du" xmlns:w16sdtdh="http://schemas.microsoft.com/office/word/2020/wordml/sdtdatahash" xmlns:w16sdtfl="http://schemas.microsoft.com/office/word/2024/wordml/sdtformatlock" xmlns:w16se="http://schemas.microsoft.com/office/word/2015/wordml/symex" xmlns:wpg="http://schemas.microsoft.com/office/word/2010/wordprocessingGroup" xmlns:wpi="http://schemas.microsoft.com/office/word/2010/wordprocessingInk" xmlns:wne="http://schemas.microsoft.com/office/word/2006/wordml" xmlns:wps="http://schemas.microsoft.com/office/word/2010/wordprocessingShape" mc:Ignorable="w14 w15 w16se w16cid w16 w16cex w16sdtdh w16sdtfl w16du wp14">
+  <w:comment w:id="0" w:author="Phanindher Patlola" w:date="2026-03-11T12:30:00Z" w:initials="PP">
+    <w:p>
+      <w:pPr>
+        <w:pStyle w:val="CommentText"/>
+      </w:pPr>
+      <w:r>
+        <w:rPr>
+          <w:rStyle w:val="CommentReference"/>
+        </w:rPr>
+        <w:annotationRef/>
+      </w:r>
+      <w:r>
+        <w:t>Need to include chargebacks here as well</w:t>
+      </w:r>
+    </w:p>
+  </w:comment>
+  <w:comment w:id="1" w:author="Phanindher Patlola" w:date="2026-03-11T12:31:00Z" w:initials="PP">
+    <w:p>
+      <w:pPr>
+        <w:pStyle w:val="CommentText"/>
+      </w:pPr>
+      <w:r>
+        <w:rPr>
+          <w:rStyle w:val="CommentReference"/>
+        </w:rPr>
+        <w:annotationRef/>
+      </w:r>
+      <w:r>
+        <w:t>Need a background and current state section</w:t>
+      </w:r>
+    </w:p>
+  </w:comment>
+  <w:comment w:id="2" w:author="Nathaniel Nelson" w:date="2026-03-11T15:33:00Z" w:initials="NN">
+    <w:p>
+      <w:pPr>
+        <w:pStyle w:val="CommentText"/>
+      </w:pPr>
+      <w:r>
+        <w:rPr>
+          <w:rStyle w:val="CommentReference"/>
+        </w:rPr>
+        <w:annotationRef/>
+      </w:r>
+      <w:r>
+        <w:t xml:space="preserve">It’s 10M in entitlement for vendor and chargeback expansion </w:t>
+      </w:r>
+    </w:p>
+  </w:comment>
+  <w:comment w:id="3" w:author="Steven Palmer" w:date="2026-03-11T12:29:00Z" w:initials="SP">
+    <w:p>
+      <w:pPr>
+        <w:pStyle w:val="CommentText"/>
+      </w:pPr>
+      <w:r>
+        <w:rPr>
+          <w:rStyle w:val="CommentReference"/>
+        </w:rPr>
+        <w:annotationRef/>
+      </w:r>
+      <w:r>
+        <w:t>is this saying we lost $5 million dollars, or paid this amount due to a single failure? How are we calculating this?</w:t>
+      </w:r>
+    </w:p>
+  </w:comment>
+  <w:comment w:id="4" w:author="Nathan Miles" w:date="2026-03-11T12:33:00Z" w:initials="NM">
+    <w:p>
+      <w:r>
+        <w:rPr>
+          <w:rStyle w:val="CommentReference"/>
+        </w:rPr>
+        <w:annotationRef/>
+      </w:r>
+      <w:r>
+        <w:rPr>
+          <w:szCs w:val="20"/>
+        </w:rPr>
+        <w:t>I'll pull through the exact incidents but this was based on exposure from real events ISMs related. Specific to SC events where we still have exposure.</w:t>
+      </w:r>
+    </w:p>
+  </w:comment>
+  <w:comment w:id="5" w:author="Phanindher Patlola" w:date="2026-03-11T12:34:00Z" w:initials="PP">
+    <w:p>
+      <w:pPr>
+        <w:pStyle w:val="CommentText"/>
+      </w:pPr>
+      <w:r>
+        <w:rPr>
+          <w:rStyle w:val="CommentReference"/>
+        </w:rPr>
+        <w:annotationRef/>
+      </w:r>
+      <w:r>
+        <w:t>This should highlight that we provided necessary details to CPH and Inv tech team (I think) to understand potential LOE for the ask.</w:t>
+      </w:r>
+    </w:p>
+  </w:comment>
+  <w:comment w:id="6" w:author="Nathaniel Nelson" w:date="2026-03-11T15:28:00Z" w:initials="NN">
+    <w:p>
+      <w:pPr>
+        <w:pStyle w:val="CommentText"/>
+      </w:pPr>
+      <w:r>
+        <w:rPr>
+          <w:rStyle w:val="CommentReference"/>
+        </w:rPr>
+        <w:annotationRef/>
+      </w:r>
+      <w:r>
+        <w:t>Guessing the OP1 is placed somewhere around here w/ Dave and Richard? What does Dave need to have this OP1 call with Richard?</w:t>
+      </w:r>
+    </w:p>
+  </w:comment>
+  <w:comment w:id="7" w:author="Nathaniel Nelson" w:date="2026-03-11T15:30:00Z" w:initials="NN">
+    <w:p>
+      <w:pPr>
+        <w:pStyle w:val="CommentText"/>
+      </w:pPr>
+      <w:r>
+        <w:rPr>
+          <w:rStyle w:val="CommentReference"/>
+        </w:rPr>
+        <w:annotationRef/>
+      </w:r>
+      <w:r>
+        <w:t xml:space="preserve">What is this for? I’d retitle this to something like Replen Eng meet with CPH Engineering on data requirement. As per the call, Replen Eng can start working on the data pipelines today but they need to have the criteria from the CPH team. </w:t>
+      </w:r>
+    </w:p>
+  </w:comment>
+  <w:comment w:id="8" w:author="Nathaniel Nelson" w:date="2026-03-11T15:31:00Z" w:initials="NN">
+    <w:p>
+      <w:pPr>
+        <w:pStyle w:val="CommentText"/>
+      </w:pPr>
+      <w:r>
+        <w:rPr>
+          <w:rStyle w:val="CommentReference"/>
+        </w:rPr>
+        <w:annotationRef/>
+      </w:r>
+      <w:r>
+        <w:t xml:space="preserve">Do we need to continue having meetings with CPH Eng until we get OP1 buy-in? </w:t>
+      </w:r>
+    </w:p>
+  </w:comment>
+  <w:comment w:id="9" w:author="Nathaniel Nelson" w:date="2026-03-11T15:39:00Z" w:initials="NN">
+    <w:p>
+      <w:pPr>
+        <w:pStyle w:val="CommentText"/>
+      </w:pPr>
+      <w:r>
+        <w:rPr>
+          <w:rStyle w:val="CommentReference"/>
+        </w:rPr>
+        <w:annotationRef/>
+      </w:r>
+      <w:r>
+        <w:t xml:space="preserve">I was under the impression anything with CPH Eng will need a dedicated engineer (aka OP1) </w:t>
+      </w:r>
+    </w:p>
+  </w:comment>
+  <w:comment w:id="10" w:author="Nathaniel Nelson" w:date="2026-03-11T15:35:00Z" w:initials="NN">
+    <w:p>
+      <w:pPr>
+        <w:pStyle w:val="CommentText"/>
+      </w:pPr>
+      <w:r>
+        <w:rPr>
+          <w:rStyle w:val="CommentReference"/>
+        </w:rPr>
+        <w:annotationRef/>
+      </w:r>
+      <w:r>
+        <w:t xml:space="preserve">Why do we need to wait until August for OP1? I was hoping we could do this in the next month. I thought leaders didn’t need granular detail and the OP1 submission was sufficient to have that discussion. </w:t>
+      </w:r>
+    </w:p>
+  </w:comment>
+  <w:comment w:id="11" w:author="Nathan Miles" w:date="2026-03-11T12:39:00Z" w:initials="NM">
+    <w:p>
+      <w:r>
+        <w:rPr>
+          <w:rStyle w:val="CommentReference"/>
+        </w:rPr>
+        <w:annotationRef/>
+      </w:r>
+      <w:r>
+        <w:rPr>
+          <w:szCs w:val="20"/>
+        </w:rPr>
+        <w:t>I merged info from both an allocation-only version of this and also an OP1-targeted version of this. I'll be the first to say it's very "rough-draft-ish" about that timing and integration. It's actually one of my questions for the group, but I didn't want to pre-bias any of the comments.</w:t>
+      </w:r>
+    </w:p>
+  </w:comment>
+</w:comments>
+</file>
+
+<file path=word/commentsExtended.xml><?xml version="1.0" encoding="utf-8"?>
+<w15:commentsEx xmlns:wpc="http://schemas.microsoft.com/office/word/2010/wordprocessingCanvas" xmlns:cx="http://schemas.microsoft.com/office/drawing/2014/chartex" xmlns:cx1="http://schemas.microsoft.com/office/drawing/2015/9/8/chartex" xmlns:cx2="http://schemas.microsoft.com/office/drawing/2015/10/21/chartex" xmlns:cx3="http://schemas.microsoft.com/office/drawing/2016/5/9/chartex" xmlns:cx4="http://schemas.microsoft.com/office/drawing/2016/5/10/chartex" xmlns:cx5="http://schemas.microsoft.com/office/drawing/2016/5/11/chartex" xmlns:cx6="http://schemas.microsoft.com/office/drawing/2016/5/12/chartex" xmlns:cx7="http://schemas.microsoft.com/office/drawing/2016/5/13/chartex" xmlns:cx8="http://schemas.microsoft.com/office/drawing/2016/5/14/chartex" xmlns:mc="http://schemas.openxmlformats.org/markup-compatibility/2006" xmlns:aink="http://schemas.microsoft.com/office/drawing/2016/ink" xmlns:am3d="http://schemas.microsoft.com/office/drawing/2017/model3d" xmlns:o="urn:schemas-microsoft-com:office:office" xmlns:oel="http://schemas.microsoft.com/office/2019/extlst" xmlns:r="http://schemas.openxmlformats.org/officeDocument/2006/relationships" xmlns:m="http://schemas.openxmlformats.org/officeDocument/2006/math" xmlns:v="urn:schemas-microsoft-com:vml" xmlns:wp14="http://schemas.microsoft.com/office/word/2010/wordprocessingDrawing" xmlns:wp="http://schemas.openxmlformats.org/drawingml/2006/wordprocessingDrawing" xmlns:w10="urn:schemas-microsoft-com:office:word" xmlns:w="http://schemas.openxmlformats.org/wordprocessingml/2006/main" xmlns:w14="http://schemas.microsoft.com/office/word/2010/wordml" xmlns:w15="http://schemas.microsoft.com/office/word/2012/wordml" xmlns:w16cex="http://schemas.microsoft.com/office/word/2018/wordml/cex" xmlns:w16cid="http://schemas.microsoft.com/office/word/2016/wordml/cid" xmlns:w16="http://schemas.microsoft.com/office/word/2018/wordml" xmlns:w16du="http://schemas.microsoft.com/office/word/2023/wordml/word16du" xmlns:w16sdtdh="http://schemas.microsoft.com/office/word/2020/wordml/sdtdatahash" xmlns:w16sdtfl="http://schemas.microsoft.com/office/word/2024/wordml/sdtformatlock" xmlns:w16se="http://schemas.microsoft.com/office/word/2015/wordml/symex" xmlns:wpg="http://schemas.microsoft.com/office/word/2010/wordprocessingGroup" xmlns:wpi="http://schemas.microsoft.com/office/word/2010/wordprocessingInk" xmlns:wne="http://schemas.microsoft.com/office/word/2006/wordml" xmlns:wps="http://schemas.microsoft.com/office/word/2010/wordprocessingShape" mc:Ignorable="w14 w15 w16se w16cid w16 w16cex w16sdtdh w16sdtfl w16du wp14">
+  <w15:commentEx w15:paraId="47E74F72" w15:done="0"/>
+  <w15:commentEx w15:paraId="08688A5E" w15:done="0"/>
+  <w15:commentEx w15:paraId="72290FF2" w15:done="0"/>
+  <w15:commentEx w15:paraId="143D6203" w15:done="0"/>
+  <w15:commentEx w15:paraId="72D064DE" w15:paraIdParent="143D6203" w15:done="0"/>
+  <w15:commentEx w15:paraId="3454B620" w15:done="0"/>
+  <w15:commentEx w15:paraId="69BBCD3C" w15:done="0"/>
+  <w15:commentEx w15:paraId="209F5F20" w15:done="0"/>
+  <w15:commentEx w15:paraId="7E8779D6" w15:done="0"/>
+  <w15:commentEx w15:paraId="2C237822" w15:done="0"/>
+  <w15:commentEx w15:paraId="6B6DD86A" w15:done="0"/>
+  <w15:commentEx w15:paraId="13BB4EE4" w15:paraIdParent="6B6DD86A" w15:done="0"/>
+</w15:commentsEx>
+</file>
+
+<file path=word/commentsExtensible.xml><?xml version="1.0" encoding="utf-8"?>
+<w16cex:commentsExtensible xmlns:wpc="http://schemas.microsoft.com/office/word/2010/wordprocessingCanvas" xmlns:cx="http://schemas.microsoft.com/office/drawing/2014/chartex" xmlns:cx1="http://schemas.microsoft.com/office/drawing/2015/9/8/chartex" xmlns:cx2="http://schemas.microsoft.com/office/drawing/2015/10/21/chartex" xmlns:cx3="http://schemas.microsoft.com/office/drawing/2016/5/9/chartex" xmlns:cx4="http://schemas.microsoft.com/office/drawing/2016/5/10/chartex" xmlns:cx5="http://schemas.microsoft.com/office/drawing/2016/5/11/chartex" xmlns:cx6="http://schemas.microsoft.com/office/drawing/2016/5/12/chartex" xmlns:cx7="http://schemas.microsoft.com/office/drawing/2016/5/13/chartex" xmlns:cx8="http://schemas.microsoft.com/office/drawing/2016/5/14/chartex" xmlns:cr="http://schemas.microsoft.com/office/comments/2020/reactions" xmlns:mc="http://schemas.openxmlformats.org/markup-compatibility/2006" xmlns:aink="http://schemas.microsoft.com/office/drawing/2016/ink" xmlns:am3d="http://schemas.microsoft.com/office/drawing/2017/model3d" xmlns:o="urn:schemas-microsoft-com:office:office" xmlns:oel="http://schemas.microsoft.com/office/2019/extlst" xmlns:r="http://schemas.openxmlformats.org/officeDocument/2006/relationships" xmlns:m="http://schemas.openxmlformats.org/officeDocument/2006/math" xmlns:v="urn:schemas-microsoft-com:vml" xmlns:wp14="http://schemas.microsoft.com/office/word/2010/wordprocessingDrawing" xmlns:wp="http://schemas.openxmlformats.org/drawingml/2006/wordprocessingDrawing" xmlns:w10="urn:schemas-microsoft-com:office:word" xmlns:w="http://schemas.openxmlformats.org/wordprocessingml/2006/main" xmlns:w14="http://schemas.microsoft.com/office/word/2010/wordml" xmlns:w15="http://schemas.microsoft.com/office/word/2012/wordml" xmlns:w16cex="http://schemas.microsoft.com/office/word/2018/wordml/cex" xmlns:w16cid="http://schemas.microsoft.com/office/word/2016/wordml/cid" xmlns:w16="http://schemas.microsoft.com/office/word/2018/wordml" xmlns:w16du="http://schemas.microsoft.com/office/word/2023/wordml/word16du" xmlns:w16sdtdh="http://schemas.microsoft.com/office/word/2020/wordml/sdtdatahash" xmlns:w16sdtfl="http://schemas.microsoft.com/office/word/2024/wordml/sdtformatlock" xmlns:w16se="http://schemas.microsoft.com/office/word/2015/wordml/symex" xmlns:wpg="http://schemas.microsoft.com/office/word/2010/wordprocessingGroup" xmlns:wpi="http://schemas.microsoft.com/office/word/2010/wordprocessingInk" xmlns:wne="http://schemas.microsoft.com/office/word/2006/wordml" xmlns:wps="http://schemas.microsoft.com/office/word/2010/wordprocessingShape" mc:Ignorable="w14 w15 w16se w16cid w16 w16cex w16sdtdh w16sdtfl cr w16du wp14">
+  <w16cex:commentExtensible w16cex:durableId="015A0A73" w16cex:dateUtc="2026-03-11T19:30:00Z"/>
+  <w16cex:commentExtensible w16cex:durableId="348228D0" w16cex:dateUtc="2026-03-11T19:31:00Z"/>
+  <w16cex:commentExtensible w16cex:durableId="6D649B1C" w16cex:dateUtc="2026-03-11T19:33:00Z"/>
+  <w16cex:commentExtensible w16cex:durableId="6E5E4529" w16cex:dateUtc="2026-03-11T19:29:00Z"/>
+  <w16cex:commentExtensible w16cex:durableId="1E35E581" w16cex:dateUtc="2026-03-11T19:33:00Z"/>
+  <w16cex:commentExtensible w16cex:durableId="2D2855A3" w16cex:dateUtc="2026-03-11T19:34:00Z"/>
+  <w16cex:commentExtensible w16cex:durableId="42FA5629" w16cex:dateUtc="2026-03-11T19:28:00Z"/>
+  <w16cex:commentExtensible w16cex:durableId="00232204" w16cex:dateUtc="2026-03-11T19:30:00Z"/>
+  <w16cex:commentExtensible w16cex:durableId="1B12DC2A" w16cex:dateUtc="2026-03-11T19:31:00Z"/>
+  <w16cex:commentExtensible w16cex:durableId="79AC2A47" w16cex:dateUtc="2026-03-11T19:39:00Z"/>
+  <w16cex:commentExtensible w16cex:durableId="1AC92714" w16cex:dateUtc="2026-03-11T19:35:00Z"/>
+  <w16cex:commentExtensible w16cex:durableId="70CC52D3" w16cex:dateUtc="2026-03-11T19:39:00Z"/>
+</w16cex:commentsExtensible>
+</file>
+
+<file path=word/commentsIds.xml><?xml version="1.0" encoding="utf-8"?>
+<w16cid:commentsIds xmlns:wpc="http://schemas.microsoft.com/office/word/2010/wordprocessingCanvas" xmlns:cx="http://schemas.microsoft.com/office/drawing/2014/chartex" xmlns:cx1="http://schemas.microsoft.com/office/drawing/2015/9/8/chartex" xmlns:cx2="http://schemas.microsoft.com/office/drawing/2015/10/21/chartex" xmlns:cx3="http://schemas.microsoft.com/office/drawing/2016/5/9/chartex" xmlns:cx4="http://schemas.microsoft.com/office/drawing/2016/5/10/chartex" xmlns:cx5="http://schemas.microsoft.com/office/drawing/2016/5/11/chartex" xmlns:cx6="http://schemas.microsoft.com/office/drawing/2016/5/12/chartex" xmlns:cx7="http://schemas.microsoft.com/office/drawing/2016/5/13/chartex" xmlns:cx8="http://schemas.microsoft.com/office/drawing/2016/5/14/chartex" xmlns:mc="http://schemas.openxmlformats.org/markup-compatibility/2006" xmlns:aink="http://schemas.microsoft.com/office/drawing/2016/ink" xmlns:am3d="http://schemas.microsoft.com/office/drawing/2017/model3d" xmlns:o="urn:schemas-microsoft-com:office:office" xmlns:oel="http://schemas.microsoft.com/office/2019/extlst" xmlns:r="http://schemas.openxmlformats.org/officeDocument/2006/relationships" xmlns:m="http://schemas.openxmlformats.org/officeDocument/2006/math" xmlns:v="urn:schemas-microsoft-com:vml" xmlns:wp14="http://schemas.microsoft.com/office/word/2010/wordprocessingDrawing" xmlns:wp="http://schemas.openxmlformats.org/drawingml/2006/wordprocessingDrawing" xmlns:w10="urn:schemas-microsoft-com:office:word" xmlns:w="http://schemas.openxmlformats.org/wordprocessingml/2006/main" xmlns:w14="http://schemas.microsoft.com/office/word/2010/wordml" xmlns:w15="http://schemas.microsoft.com/office/word/2012/wordml" xmlns:w16cex="http://schemas.microsoft.com/office/word/2018/wordml/cex" xmlns:w16cid="http://schemas.microsoft.com/office/word/2016/wordml/cid" xmlns:w16="http://schemas.microsoft.com/office/word/2018/wordml" xmlns:w16du="http://schemas.microsoft.com/office/word/2023/wordml/word16du" xmlns:w16sdtdh="http://schemas.microsoft.com/office/word/2020/wordml/sdtdatahash" xmlns:w16sdtfl="http://schemas.microsoft.com/office/word/2024/wordml/sdtformatlock" xmlns:w16se="http://schemas.microsoft.com/office/word/2015/wordml/symex" xmlns:wpg="http://schemas.microsoft.com/office/word/2010/wordprocessingGroup" xmlns:wpi="http://schemas.microsoft.com/office/word/2010/wordprocessingInk" xmlns:wne="http://schemas.microsoft.com/office/word/2006/wordml" xmlns:wps="http://schemas.microsoft.com/office/word/2010/wordprocessingShape" mc:Ignorable="w14 w15 w16se w16cid w16 w16cex w16sdtdh w16sdtfl w16du wp14">
+  <w16cid:commentId w16cid:paraId="47E74F72" w16cid:durableId="015A0A73"/>
+  <w16cid:commentId w16cid:paraId="08688A5E" w16cid:durableId="348228D0"/>
+  <w16cid:commentId w16cid:paraId="72290FF2" w16cid:durableId="6D649B1C"/>
+  <w16cid:commentId w16cid:paraId="143D6203" w16cid:durableId="6E5E4529"/>
+  <w16cid:commentId w16cid:paraId="72D064DE" w16cid:durableId="1E35E581"/>
+  <w16cid:commentId w16cid:paraId="3454B620" w16cid:durableId="2D2855A3"/>
+  <w16cid:commentId w16cid:paraId="69BBCD3C" w16cid:durableId="42FA5629"/>
+  <w16cid:commentId w16cid:paraId="209F5F20" w16cid:durableId="00232204"/>
+  <w16cid:commentId w16cid:paraId="7E8779D6" w16cid:durableId="1B12DC2A"/>
+  <w16cid:commentId w16cid:paraId="2C237822" w16cid:durableId="79AC2A47"/>
+  <w16cid:commentId w16cid:paraId="6B6DD86A" w16cid:durableId="1AC92714"/>
+  <w16cid:commentId w16cid:paraId="13BB4EE4" w16cid:durableId="70CC52D3"/>
+</w16cid:commentsIds>
 </file>
 
 <file path=word/endnotes.xml><?xml version="1.0" encoding="utf-8"?>
@@ -7986,7 +8018,7 @@
         <w:top w:val="single" w:sz="4" w:space="1" w:color="CCCCCC"/>
       </w:pBdr>
       <w:tabs>
-        <w:tab w:val="right" w:pos="9026"/>
+        <w:tab w:val="right" w:pos="10800"/>
       </w:tabs>
     </w:pPr>
     <w:r>
@@ -8039,7 +8071,7 @@
         <w:bottom w:val="single" w:sz="6" w:space="1" w:color="1A3C5E"/>
       </w:pBdr>
       <w:tabs>
-        <w:tab w:val="right" w:pos="9026"/>
+        <w:tab w:val="right" w:pos="10800"/>
       </w:tabs>
     </w:pPr>
     <w:r>
@@ -8336,6 +8368,23 @@
     </w:lvlOverride>
   </w:num>
 </w:numbering>
+</file>
+
+<file path=word/people.xml><?xml version="1.0" encoding="utf-8"?>
+<w15:people xmlns:wpc="http://schemas.microsoft.com/office/word/2010/wordprocessingCanvas" xmlns:cx="http://schemas.microsoft.com/office/drawing/2014/chartex" xmlns:cx1="http://schemas.microsoft.com/office/drawing/2015/9/8/chartex" xmlns:cx2="http://schemas.microsoft.com/office/drawing/2015/10/21/chartex" xmlns:cx3="http://schemas.microsoft.com/office/drawing/2016/5/9/chartex" xmlns:cx4="http://schemas.microsoft.com/office/drawing/2016/5/10/chartex" xmlns:cx5="http://schemas.microsoft.com/office/drawing/2016/5/11/chartex" xmlns:cx6="http://schemas.microsoft.com/office/drawing/2016/5/12/chartex" xmlns:cx7="http://schemas.microsoft.com/office/drawing/2016/5/13/chartex" xmlns:cx8="http://schemas.microsoft.com/office/drawing/2016/5/14/chartex" xmlns:mc="http://schemas.openxmlformats.org/markup-compatibility/2006" xmlns:aink="http://schemas.microsoft.com/office/drawing/2016/ink" xmlns:am3d="http://schemas.microsoft.com/office/drawing/2017/model3d" xmlns:o="urn:schemas-microsoft-com:office:office" xmlns:oel="http://schemas.microsoft.com/office/2019/extlst" xmlns:r="http://schemas.openxmlformats.org/officeDocument/2006/relationships" xmlns:m="http://schemas.openxmlformats.org/officeDocument/2006/math" xmlns:v="urn:schemas-microsoft-com:vml" xmlns:wp14="http://schemas.microsoft.com/office/word/2010/wordprocessingDrawing" xmlns:wp="http://schemas.openxmlformats.org/drawingml/2006/wordprocessingDrawing" xmlns:w10="urn:schemas-microsoft-com:office:word" xmlns:w="http://schemas.openxmlformats.org/wordprocessingml/2006/main" xmlns:w14="http://schemas.microsoft.com/office/word/2010/wordml" xmlns:w15="http://schemas.microsoft.com/office/word/2012/wordml" xmlns:w16cex="http://schemas.microsoft.com/office/word/2018/wordml/cex" xmlns:w16cid="http://schemas.microsoft.com/office/word/2016/wordml/cid" xmlns:w16="http://schemas.microsoft.com/office/word/2018/wordml" xmlns:w16du="http://schemas.microsoft.com/office/word/2023/wordml/word16du" xmlns:w16sdtdh="http://schemas.microsoft.com/office/word/2020/wordml/sdtdatahash" xmlns:w16sdtfl="http://schemas.microsoft.com/office/word/2024/wordml/sdtformatlock" xmlns:w16se="http://schemas.microsoft.com/office/word/2015/wordml/symex" xmlns:wpg="http://schemas.microsoft.com/office/word/2010/wordprocessingGroup" xmlns:wpi="http://schemas.microsoft.com/office/word/2010/wordprocessingInk" xmlns:wne="http://schemas.microsoft.com/office/word/2006/wordml" xmlns:wps="http://schemas.microsoft.com/office/word/2010/wordprocessingShape" mc:Ignorable="w14 w15 w16se w16cid w16 w16cex w16sdtdh w16sdtfl w16du wp14">
+  <w15:person w15:author="Phanindher Patlola">
+    <w15:presenceInfo w15:providerId="AD" w15:userId="S::ppatlola@chewy.com::b9a94b35-5f4c-4e79-bd01-ec8b46a972aa"/>
+  </w15:person>
+  <w15:person w15:author="Nathaniel Nelson">
+    <w15:presenceInfo w15:providerId="AD" w15:userId="S::nnelson2@chewy.com::1dac0f0a-f8ab-4332-8d50-295ba79aa9e3"/>
+  </w15:person>
+  <w15:person w15:author="Steven Palmer">
+    <w15:presenceInfo w15:providerId="AD" w15:userId="S::spalmer5@chewy.com::a6db0aa6-0219-4ca8-a21d-98cca6af58e3"/>
+  </w15:person>
+  <w15:person w15:author="Nathan Miles">
+    <w15:presenceInfo w15:providerId="AD" w15:userId="S::nmiles1@chewy.com::feb1e035-60a1-474f-bb67-372cd6733068"/>
+  </w15:person>
+</w15:people>
 </file>
 
 <file path=word/styles.xml><?xml version="1.0" encoding="utf-8"?>
@@ -8951,6 +9000,128 @@
       <w:szCs w:val="20"/>
     </w:rPr>
   </w:style>
+  <w:style w:type="paragraph" w:styleId="Header">
+    <w:name w:val="header"/>
+    <w:basedOn w:val="Normal"/>
+    <w:link w:val="HeaderChar"/>
+    <w:uiPriority w:val="99"/>
+    <w:unhideWhenUsed/>
+    <w:rsid w:val="00CE4545"/>
+    <w:pPr>
+      <w:tabs>
+        <w:tab w:val="center" w:pos="4680"/>
+        <w:tab w:val="right" w:pos="9360"/>
+      </w:tabs>
+    </w:pPr>
+  </w:style>
+  <w:style w:type="character" w:customStyle="1" w:styleId="HeaderChar">
+    <w:name w:val="Header Char"/>
+    <w:basedOn w:val="DefaultParagraphFont"/>
+    <w:link w:val="Header"/>
+    <w:uiPriority w:val="99"/>
+    <w:rsid w:val="00CE4545"/>
+    <w:rPr>
+      <w:rFonts w:asciiTheme="minorHAnsi" w:hAnsiTheme="minorHAnsi"/>
+      <w:sz w:val="20"/>
+    </w:rPr>
+  </w:style>
+  <w:style w:type="paragraph" w:styleId="Footer">
+    <w:name w:val="footer"/>
+    <w:basedOn w:val="Normal"/>
+    <w:link w:val="FooterChar"/>
+    <w:uiPriority w:val="99"/>
+    <w:unhideWhenUsed/>
+    <w:rsid w:val="00CE4545"/>
+    <w:pPr>
+      <w:tabs>
+        <w:tab w:val="center" w:pos="4680"/>
+        <w:tab w:val="right" w:pos="9360"/>
+      </w:tabs>
+    </w:pPr>
+  </w:style>
+  <w:style w:type="character" w:customStyle="1" w:styleId="FooterChar">
+    <w:name w:val="Footer Char"/>
+    <w:basedOn w:val="DefaultParagraphFont"/>
+    <w:link w:val="Footer"/>
+    <w:uiPriority w:val="99"/>
+    <w:rsid w:val="00CE4545"/>
+    <w:rPr>
+      <w:rFonts w:asciiTheme="minorHAnsi" w:hAnsiTheme="minorHAnsi"/>
+      <w:sz w:val="20"/>
+    </w:rPr>
+  </w:style>
+  <w:style w:type="character" w:styleId="CommentReference">
+    <w:name w:val="annotation reference"/>
+    <w:basedOn w:val="DefaultParagraphFont"/>
+    <w:uiPriority w:val="99"/>
+    <w:semiHidden/>
+    <w:unhideWhenUsed/>
+    <w:rsid w:val="00CD4C63"/>
+    <w:rPr>
+      <w:sz w:val="16"/>
+      <w:szCs w:val="16"/>
+    </w:rPr>
+  </w:style>
+  <w:style w:type="paragraph" w:styleId="CommentText">
+    <w:name w:val="annotation text"/>
+    <w:basedOn w:val="Normal"/>
+    <w:link w:val="CommentTextChar"/>
+    <w:uiPriority w:val="99"/>
+    <w:unhideWhenUsed/>
+    <w:rsid w:val="00CD4C63"/>
+    <w:rPr>
+      <w:szCs w:val="20"/>
+    </w:rPr>
+  </w:style>
+  <w:style w:type="character" w:customStyle="1" w:styleId="CommentTextChar">
+    <w:name w:val="Comment Text Char"/>
+    <w:basedOn w:val="DefaultParagraphFont"/>
+    <w:link w:val="CommentText"/>
+    <w:uiPriority w:val="99"/>
+    <w:rsid w:val="00CD4C63"/>
+    <w:rPr>
+      <w:rFonts w:asciiTheme="minorHAnsi" w:hAnsiTheme="minorHAnsi"/>
+      <w:sz w:val="20"/>
+      <w:szCs w:val="20"/>
+    </w:rPr>
+  </w:style>
+  <w:style w:type="paragraph" w:styleId="CommentSubject">
+    <w:name w:val="annotation subject"/>
+    <w:basedOn w:val="CommentText"/>
+    <w:next w:val="CommentText"/>
+    <w:link w:val="CommentSubjectChar"/>
+    <w:uiPriority w:val="99"/>
+    <w:semiHidden/>
+    <w:unhideWhenUsed/>
+    <w:rsid w:val="00CD4C63"/>
+    <w:rPr>
+      <w:b/>
+      <w:bCs/>
+    </w:rPr>
+  </w:style>
+  <w:style w:type="character" w:customStyle="1" w:styleId="CommentSubjectChar">
+    <w:name w:val="Comment Subject Char"/>
+    <w:basedOn w:val="CommentTextChar"/>
+    <w:link w:val="CommentSubject"/>
+    <w:uiPriority w:val="99"/>
+    <w:semiHidden/>
+    <w:rsid w:val="00CD4C63"/>
+    <w:rPr>
+      <w:rFonts w:asciiTheme="minorHAnsi" w:hAnsiTheme="minorHAnsi"/>
+      <w:b/>
+      <w:bCs/>
+      <w:sz w:val="20"/>
+      <w:szCs w:val="20"/>
+    </w:rPr>
+  </w:style>
+  <w:style w:type="character" w:styleId="LineNumber">
+    <w:name w:val="line number"/>
+    <w:basedOn w:val="DefaultParagraphFont"/>
+    <w:uiPriority w:val="99"/>
+    <w:semiHidden/>
+    <w:unhideWhenUsed/>
+    <w:rsid w:val="002D5B00"/>
+  </w:style>
 </w:styles>
 </file>
 
@@ -9267,4 +9438,16 @@
     </a:ext>
   </a:extLst>
 </a:theme>
+</file>
+
+<file path=customXml/item1.xml><?xml version="1.0" encoding="utf-8"?>
+<b:Sources xmlns:b="http://schemas.openxmlformats.org/officeDocument/2006/bibliography" xmlns="http://schemas.openxmlformats.org/officeDocument/2006/bibliography" SelectedStyle="/APASixthEditionOfficeOnline.xsl" StyleName="APA" Version="6"/>
+</file>
+
+<file path=customXml/itemProps1.xml><?xml version="1.0" encoding="utf-8"?>
+<ds:datastoreItem xmlns:ds="http://schemas.openxmlformats.org/officeDocument/2006/customXml" ds:itemID="{2F262626-D20E-C64D-8178-F228E19DE01C}">
+  <ds:schemaRefs>
+    <ds:schemaRef ds:uri="http://schemas.openxmlformats.org/officeDocument/2006/bibliography"/>
+  </ds:schemaRefs>
+</ds:datastoreItem>
 </file>
</xml_diff>